<commit_message>
Fixed some Dutch ALT values
</commit_message>
<xml_diff>
--- a/Documentation/Official Documentation/Gebruikershandleiding voor IBOS XML muzieklezer versie 4.0.0.0.docx
+++ b/Documentation/Official Documentation/Gebruikershandleiding voor IBOS XML muzieklezer versie 4.0.0.0.docx
@@ -2506,14 +2506,14 @@
         <w:tblLook w:firstRow="1" w:noVBand="1" w:lastRow="0" w:firstColumn="1" w:lastColumn="0" w:noHBand="0" w:val="04a0"/>
       </w:tblPr>
       <w:tblGrid>
-        <w:gridCol w:w="1686"/>
-        <w:gridCol w:w="7489"/>
+        <w:gridCol w:w="1685"/>
+        <w:gridCol w:w="7490"/>
       </w:tblGrid>
       <w:tr>
         <w:trPr/>
         <w:tc>
           <w:tcPr>
-            <w:tcW w:w="1686" w:type="dxa"/>
+            <w:tcW w:w="1685" w:type="dxa"/>
             <w:tcBorders>
               <w:top w:val="single" w:sz="4" w:space="0" w:color="000000"/>
               <w:left w:val="single" w:sz="4" w:space="0" w:color="000000"/>
@@ -2544,7 +2544,7 @@
         </w:tc>
         <w:tc>
           <w:tcPr>
-            <w:tcW w:w="7489" w:type="dxa"/>
+            <w:tcW w:w="7490" w:type="dxa"/>
             <w:tcBorders>
               <w:top w:val="single" w:sz="4" w:space="0" w:color="000000"/>
               <w:left w:val="single" w:sz="4" w:space="0" w:color="000000"/>
@@ -2589,7 +2589,7 @@
         <w:trPr/>
         <w:tc>
           <w:tcPr>
-            <w:tcW w:w="1686" w:type="dxa"/>
+            <w:tcW w:w="1685" w:type="dxa"/>
             <w:tcBorders>
               <w:top w:val="single" w:sz="4" w:space="0" w:color="000000"/>
               <w:left w:val="single" w:sz="4" w:space="0" w:color="000000"/>
@@ -2620,7 +2620,7 @@
         </w:tc>
         <w:tc>
           <w:tcPr>
-            <w:tcW w:w="7489" w:type="dxa"/>
+            <w:tcW w:w="7490" w:type="dxa"/>
             <w:tcBorders>
               <w:top w:val="single" w:sz="4" w:space="0" w:color="000000"/>
               <w:left w:val="single" w:sz="4" w:space="0" w:color="000000"/>
@@ -2693,7 +2693,7 @@
         <w:trPr/>
         <w:tc>
           <w:tcPr>
-            <w:tcW w:w="1686" w:type="dxa"/>
+            <w:tcW w:w="1685" w:type="dxa"/>
             <w:tcBorders>
               <w:top w:val="single" w:sz="4" w:space="0" w:color="000000"/>
               <w:left w:val="single" w:sz="4" w:space="0" w:color="000000"/>
@@ -2724,7 +2724,7 @@
         </w:tc>
         <w:tc>
           <w:tcPr>
-            <w:tcW w:w="7489" w:type="dxa"/>
+            <w:tcW w:w="7490" w:type="dxa"/>
             <w:tcBorders>
               <w:top w:val="single" w:sz="4" w:space="0" w:color="000000"/>
               <w:left w:val="single" w:sz="4" w:space="0" w:color="000000"/>
@@ -2755,7 +2755,7 @@
         <w:trPr/>
         <w:tc>
           <w:tcPr>
-            <w:tcW w:w="1686" w:type="dxa"/>
+            <w:tcW w:w="1685" w:type="dxa"/>
             <w:tcBorders>
               <w:top w:val="single" w:sz="4" w:space="0" w:color="000000"/>
               <w:left w:val="single" w:sz="4" w:space="0" w:color="000000"/>
@@ -2786,7 +2786,7 @@
         </w:tc>
         <w:tc>
           <w:tcPr>
-            <w:tcW w:w="7489" w:type="dxa"/>
+            <w:tcW w:w="7490" w:type="dxa"/>
             <w:tcBorders>
               <w:top w:val="single" w:sz="4" w:space="0" w:color="000000"/>
               <w:left w:val="single" w:sz="4" w:space="0" w:color="000000"/>
@@ -2833,7 +2833,7 @@
         <w:trPr/>
         <w:tc>
           <w:tcPr>
-            <w:tcW w:w="1686" w:type="dxa"/>
+            <w:tcW w:w="1685" w:type="dxa"/>
             <w:tcBorders>
               <w:top w:val="single" w:sz="4" w:space="0" w:color="000000"/>
               <w:left w:val="single" w:sz="4" w:space="0" w:color="000000"/>
@@ -2867,7 +2867,7 @@
         </w:tc>
         <w:tc>
           <w:tcPr>
-            <w:tcW w:w="7489" w:type="dxa"/>
+            <w:tcW w:w="7490" w:type="dxa"/>
             <w:tcBorders>
               <w:top w:val="single" w:sz="4" w:space="0" w:color="000000"/>
               <w:left w:val="single" w:sz="4" w:space="0" w:color="000000"/>
@@ -3469,9 +3469,9 @@
         <w:tblLook w:firstRow="1" w:noVBand="1" w:lastRow="0" w:firstColumn="1" w:lastColumn="0" w:noHBand="0" w:val="04a0"/>
       </w:tblPr>
       <w:tblGrid>
-        <w:gridCol w:w="1586"/>
+        <w:gridCol w:w="1585"/>
         <w:gridCol w:w="5220"/>
-        <w:gridCol w:w="2209"/>
+        <w:gridCol w:w="2210"/>
       </w:tblGrid>
       <w:tr>
         <w:trPr>
@@ -3479,7 +3479,7 @@
         </w:trPr>
         <w:tc>
           <w:tcPr>
-            <w:tcW w:w="1586" w:type="dxa"/>
+            <w:tcW w:w="1585" w:type="dxa"/>
             <w:tcBorders>
               <w:top w:val="single" w:sz="2" w:space="0" w:color="000000"/>
               <w:left w:val="single" w:sz="2" w:space="0" w:color="000000"/>
@@ -3549,7 +3549,7 @@
         </w:tc>
         <w:tc>
           <w:tcPr>
-            <w:tcW w:w="2209" w:type="dxa"/>
+            <w:tcW w:w="2210" w:type="dxa"/>
             <w:tcBorders>
               <w:top w:val="single" w:sz="2" w:space="0" w:color="000000"/>
               <w:left w:val="single" w:sz="2" w:space="0" w:color="000000"/>
@@ -3580,7 +3580,7 @@
         <w:trPr/>
         <w:tc>
           <w:tcPr>
-            <w:tcW w:w="1586" w:type="dxa"/>
+            <w:tcW w:w="1585" w:type="dxa"/>
             <w:tcBorders>
               <w:left w:val="single" w:sz="2" w:space="0" w:color="000000"/>
               <w:bottom w:val="single" w:sz="2" w:space="0" w:color="000000"/>
@@ -3629,7 +3629,7 @@
         </w:tc>
         <w:tc>
           <w:tcPr>
-            <w:tcW w:w="2209" w:type="dxa"/>
+            <w:tcW w:w="2210" w:type="dxa"/>
             <w:tcBorders>
               <w:left w:val="single" w:sz="2" w:space="0" w:color="000000"/>
               <w:bottom w:val="single" w:sz="2" w:space="0" w:color="000000"/>
@@ -3656,7 +3656,7 @@
         <w:trPr/>
         <w:tc>
           <w:tcPr>
-            <w:tcW w:w="1586" w:type="dxa"/>
+            <w:tcW w:w="1585" w:type="dxa"/>
             <w:tcBorders>
               <w:left w:val="single" w:sz="2" w:space="0" w:color="000000"/>
               <w:bottom w:val="single" w:sz="2" w:space="0" w:color="000000"/>
@@ -3702,7 +3702,7 @@
         </w:tc>
         <w:tc>
           <w:tcPr>
-            <w:tcW w:w="2209" w:type="dxa"/>
+            <w:tcW w:w="2210" w:type="dxa"/>
             <w:tcBorders>
               <w:left w:val="single" w:sz="2" w:space="0" w:color="000000"/>
               <w:bottom w:val="single" w:sz="2" w:space="0" w:color="000000"/>
@@ -3729,7 +3729,7 @@
         <w:trPr/>
         <w:tc>
           <w:tcPr>
-            <w:tcW w:w="1586" w:type="dxa"/>
+            <w:tcW w:w="1585" w:type="dxa"/>
             <w:tcBorders>
               <w:left w:val="single" w:sz="2" w:space="0" w:color="000000"/>
               <w:bottom w:val="single" w:sz="2" w:space="0" w:color="000000"/>
@@ -3776,7 +3776,7 @@
         </w:tc>
         <w:tc>
           <w:tcPr>
-            <w:tcW w:w="2209" w:type="dxa"/>
+            <w:tcW w:w="2210" w:type="dxa"/>
             <w:tcBorders>
               <w:left w:val="single" w:sz="2" w:space="0" w:color="000000"/>
               <w:bottom w:val="single" w:sz="2" w:space="0" w:color="000000"/>
@@ -3821,7 +3821,7 @@
         <w:trPr/>
         <w:tc>
           <w:tcPr>
-            <w:tcW w:w="1586" w:type="dxa"/>
+            <w:tcW w:w="1585" w:type="dxa"/>
             <w:tcBorders>
               <w:left w:val="single" w:sz="2" w:space="0" w:color="000000"/>
               <w:bottom w:val="single" w:sz="2" w:space="0" w:color="000000"/>
@@ -3870,7 +3870,7 @@
         </w:tc>
         <w:tc>
           <w:tcPr>
-            <w:tcW w:w="2209" w:type="dxa"/>
+            <w:tcW w:w="2210" w:type="dxa"/>
             <w:tcBorders>
               <w:left w:val="single" w:sz="2" w:space="0" w:color="000000"/>
               <w:bottom w:val="single" w:sz="2" w:space="0" w:color="000000"/>
@@ -3900,7 +3900,7 @@
         <w:trPr/>
         <w:tc>
           <w:tcPr>
-            <w:tcW w:w="1586" w:type="dxa"/>
+            <w:tcW w:w="1585" w:type="dxa"/>
             <w:tcBorders>
               <w:left w:val="single" w:sz="2" w:space="0" w:color="000000"/>
               <w:bottom w:val="single" w:sz="2" w:space="0" w:color="000000"/>
@@ -3949,7 +3949,7 @@
         </w:tc>
         <w:tc>
           <w:tcPr>
-            <w:tcW w:w="2209" w:type="dxa"/>
+            <w:tcW w:w="2210" w:type="dxa"/>
             <w:tcBorders>
               <w:left w:val="single" w:sz="2" w:space="0" w:color="000000"/>
               <w:bottom w:val="single" w:sz="2" w:space="0" w:color="000000"/>
@@ -3979,7 +3979,7 @@
         <w:trPr/>
         <w:tc>
           <w:tcPr>
-            <w:tcW w:w="1586" w:type="dxa"/>
+            <w:tcW w:w="1585" w:type="dxa"/>
             <w:tcBorders>
               <w:left w:val="single" w:sz="2" w:space="0" w:color="000000"/>
               <w:bottom w:val="single" w:sz="2" w:space="0" w:color="000000"/>
@@ -4028,7 +4028,7 @@
         </w:tc>
         <w:tc>
           <w:tcPr>
-            <w:tcW w:w="2209" w:type="dxa"/>
+            <w:tcW w:w="2210" w:type="dxa"/>
             <w:tcBorders>
               <w:left w:val="single" w:sz="2" w:space="0" w:color="000000"/>
               <w:bottom w:val="single" w:sz="2" w:space="0" w:color="000000"/>
@@ -4058,7 +4058,7 @@
         <w:trPr/>
         <w:tc>
           <w:tcPr>
-            <w:tcW w:w="1586" w:type="dxa"/>
+            <w:tcW w:w="1585" w:type="dxa"/>
             <w:tcBorders>
               <w:left w:val="single" w:sz="2" w:space="0" w:color="000000"/>
               <w:bottom w:val="single" w:sz="2" w:space="0" w:color="000000"/>
@@ -4104,7 +4104,7 @@
         </w:tc>
         <w:tc>
           <w:tcPr>
-            <w:tcW w:w="2209" w:type="dxa"/>
+            <w:tcW w:w="2210" w:type="dxa"/>
             <w:tcBorders>
               <w:left w:val="single" w:sz="2" w:space="0" w:color="000000"/>
               <w:bottom w:val="single" w:sz="2" w:space="0" w:color="000000"/>
@@ -4134,7 +4134,7 @@
         <w:trPr/>
         <w:tc>
           <w:tcPr>
-            <w:tcW w:w="1586" w:type="dxa"/>
+            <w:tcW w:w="1585" w:type="dxa"/>
             <w:tcBorders>
               <w:left w:val="single" w:sz="2" w:space="0" w:color="000000"/>
               <w:bottom w:val="single" w:sz="2" w:space="0" w:color="000000"/>
@@ -4194,7 +4194,7 @@
         </w:tc>
         <w:tc>
           <w:tcPr>
-            <w:tcW w:w="2209" w:type="dxa"/>
+            <w:tcW w:w="2210" w:type="dxa"/>
             <w:tcBorders>
               <w:left w:val="single" w:sz="2" w:space="0" w:color="000000"/>
               <w:bottom w:val="single" w:sz="2" w:space="0" w:color="000000"/>
@@ -4228,7 +4228,7 @@
         <w:trPr/>
         <w:tc>
           <w:tcPr>
-            <w:tcW w:w="1586" w:type="dxa"/>
+            <w:tcW w:w="1585" w:type="dxa"/>
             <w:tcBorders>
               <w:left w:val="single" w:sz="2" w:space="0" w:color="000000"/>
               <w:bottom w:val="single" w:sz="2" w:space="0" w:color="000000"/>
@@ -4288,7 +4288,7 @@
         </w:tc>
         <w:tc>
           <w:tcPr>
-            <w:tcW w:w="2209" w:type="dxa"/>
+            <w:tcW w:w="2210" w:type="dxa"/>
             <w:tcBorders>
               <w:left w:val="single" w:sz="2" w:space="0" w:color="000000"/>
               <w:bottom w:val="single" w:sz="2" w:space="0" w:color="000000"/>
@@ -4322,7 +4322,7 @@
         <w:trPr/>
         <w:tc>
           <w:tcPr>
-            <w:tcW w:w="1586" w:type="dxa"/>
+            <w:tcW w:w="1585" w:type="dxa"/>
             <w:tcBorders>
               <w:left w:val="single" w:sz="2" w:space="0" w:color="000000"/>
               <w:bottom w:val="single" w:sz="2" w:space="0" w:color="000000"/>
@@ -4382,7 +4382,7 @@
         </w:tc>
         <w:tc>
           <w:tcPr>
-            <w:tcW w:w="2209" w:type="dxa"/>
+            <w:tcW w:w="2210" w:type="dxa"/>
             <w:tcBorders>
               <w:left w:val="single" w:sz="2" w:space="0" w:color="000000"/>
               <w:bottom w:val="single" w:sz="2" w:space="0" w:color="000000"/>
@@ -4415,7 +4415,7 @@
         <w:trPr/>
         <w:tc>
           <w:tcPr>
-            <w:tcW w:w="1586" w:type="dxa"/>
+            <w:tcW w:w="1585" w:type="dxa"/>
             <w:tcBorders>
               <w:left w:val="single" w:sz="2" w:space="0" w:color="000000"/>
               <w:bottom w:val="single" w:sz="2" w:space="0" w:color="000000"/>
@@ -4464,7 +4464,7 @@
         </w:tc>
         <w:tc>
           <w:tcPr>
-            <w:tcW w:w="2209" w:type="dxa"/>
+            <w:tcW w:w="2210" w:type="dxa"/>
             <w:tcBorders>
               <w:left w:val="single" w:sz="2" w:space="0" w:color="000000"/>
               <w:bottom w:val="single" w:sz="2" w:space="0" w:color="000000"/>
@@ -4494,7 +4494,7 @@
         <w:trPr/>
         <w:tc>
           <w:tcPr>
-            <w:tcW w:w="1586" w:type="dxa"/>
+            <w:tcW w:w="1585" w:type="dxa"/>
             <w:tcBorders>
               <w:left w:val="single" w:sz="2" w:space="0" w:color="000000"/>
               <w:bottom w:val="single" w:sz="2" w:space="0" w:color="000000"/>
@@ -4548,7 +4548,7 @@
         </w:tc>
         <w:tc>
           <w:tcPr>
-            <w:tcW w:w="2209" w:type="dxa"/>
+            <w:tcW w:w="2210" w:type="dxa"/>
             <w:tcBorders>
               <w:left w:val="single" w:sz="2" w:space="0" w:color="000000"/>
               <w:bottom w:val="single" w:sz="2" w:space="0" w:color="000000"/>
@@ -4580,7 +4580,7 @@
         <w:trPr/>
         <w:tc>
           <w:tcPr>
-            <w:tcW w:w="1586" w:type="dxa"/>
+            <w:tcW w:w="1585" w:type="dxa"/>
             <w:tcBorders>
               <w:left w:val="single" w:sz="2" w:space="0" w:color="000000"/>
               <w:bottom w:val="single" w:sz="2" w:space="0" w:color="000000"/>
@@ -4632,7 +4632,7 @@
         </w:tc>
         <w:tc>
           <w:tcPr>
-            <w:tcW w:w="2209" w:type="dxa"/>
+            <w:tcW w:w="2210" w:type="dxa"/>
             <w:tcBorders>
               <w:left w:val="single" w:sz="2" w:space="0" w:color="000000"/>
               <w:bottom w:val="single" w:sz="2" w:space="0" w:color="000000"/>
@@ -4662,7 +4662,7 @@
         <w:trPr/>
         <w:tc>
           <w:tcPr>
-            <w:tcW w:w="1586" w:type="dxa"/>
+            <w:tcW w:w="1585" w:type="dxa"/>
             <w:tcBorders>
               <w:left w:val="single" w:sz="2" w:space="0" w:color="000000"/>
               <w:bottom w:val="single" w:sz="2" w:space="0" w:color="000000"/>
@@ -4716,7 +4716,7 @@
         </w:tc>
         <w:tc>
           <w:tcPr>
-            <w:tcW w:w="2209" w:type="dxa"/>
+            <w:tcW w:w="2210" w:type="dxa"/>
             <w:tcBorders>
               <w:left w:val="single" w:sz="2" w:space="0" w:color="000000"/>
               <w:bottom w:val="single" w:sz="2" w:space="0" w:color="000000"/>
@@ -4746,7 +4746,7 @@
         <w:trPr/>
         <w:tc>
           <w:tcPr>
-            <w:tcW w:w="1586" w:type="dxa"/>
+            <w:tcW w:w="1585" w:type="dxa"/>
             <w:tcBorders>
               <w:left w:val="single" w:sz="2" w:space="0" w:color="000000"/>
               <w:bottom w:val="single" w:sz="2" w:space="0" w:color="000000"/>
@@ -4800,7 +4800,7 @@
         </w:tc>
         <w:tc>
           <w:tcPr>
-            <w:tcW w:w="2209" w:type="dxa"/>
+            <w:tcW w:w="2210" w:type="dxa"/>
             <w:tcBorders>
               <w:left w:val="single" w:sz="2" w:space="0" w:color="000000"/>
               <w:bottom w:val="single" w:sz="2" w:space="0" w:color="000000"/>
@@ -4830,7 +4830,7 @@
         <w:trPr/>
         <w:tc>
           <w:tcPr>
-            <w:tcW w:w="1586" w:type="dxa"/>
+            <w:tcW w:w="1585" w:type="dxa"/>
             <w:tcBorders>
               <w:left w:val="single" w:sz="2" w:space="0" w:color="000000"/>
               <w:bottom w:val="single" w:sz="2" w:space="0" w:color="000000"/>
@@ -4884,7 +4884,7 @@
         </w:tc>
         <w:tc>
           <w:tcPr>
-            <w:tcW w:w="2209" w:type="dxa"/>
+            <w:tcW w:w="2210" w:type="dxa"/>
             <w:tcBorders>
               <w:left w:val="single" w:sz="2" w:space="0" w:color="000000"/>
               <w:bottom w:val="single" w:sz="2" w:space="0" w:color="000000"/>
@@ -4914,7 +4914,7 @@
         <w:trPr/>
         <w:tc>
           <w:tcPr>
-            <w:tcW w:w="1586" w:type="dxa"/>
+            <w:tcW w:w="1585" w:type="dxa"/>
             <w:tcBorders>
               <w:left w:val="single" w:sz="2" w:space="0" w:color="000000"/>
               <w:bottom w:val="single" w:sz="2" w:space="0" w:color="000000"/>
@@ -4966,7 +4966,7 @@
         </w:tc>
         <w:tc>
           <w:tcPr>
-            <w:tcW w:w="2209" w:type="dxa"/>
+            <w:tcW w:w="2210" w:type="dxa"/>
             <w:tcBorders>
               <w:left w:val="single" w:sz="2" w:space="0" w:color="000000"/>
               <w:bottom w:val="single" w:sz="2" w:space="0" w:color="000000"/>
@@ -4996,7 +4996,7 @@
         <w:trPr/>
         <w:tc>
           <w:tcPr>
-            <w:tcW w:w="1586" w:type="dxa"/>
+            <w:tcW w:w="1585" w:type="dxa"/>
             <w:tcBorders>
               <w:left w:val="single" w:sz="2" w:space="0" w:color="000000"/>
               <w:bottom w:val="single" w:sz="2" w:space="0" w:color="000000"/>
@@ -5048,7 +5048,7 @@
         </w:tc>
         <w:tc>
           <w:tcPr>
-            <w:tcW w:w="2209" w:type="dxa"/>
+            <w:tcW w:w="2210" w:type="dxa"/>
             <w:tcBorders>
               <w:left w:val="single" w:sz="2" w:space="0" w:color="000000"/>
               <w:bottom w:val="single" w:sz="2" w:space="0" w:color="000000"/>
@@ -5078,7 +5078,7 @@
         <w:trPr/>
         <w:tc>
           <w:tcPr>
-            <w:tcW w:w="1586" w:type="dxa"/>
+            <w:tcW w:w="1585" w:type="dxa"/>
             <w:tcBorders>
               <w:left w:val="single" w:sz="2" w:space="0" w:color="000000"/>
               <w:bottom w:val="single" w:sz="2" w:space="0" w:color="000000"/>
@@ -5131,7 +5131,7 @@
         </w:tc>
         <w:tc>
           <w:tcPr>
-            <w:tcW w:w="2209" w:type="dxa"/>
+            <w:tcW w:w="2210" w:type="dxa"/>
             <w:tcBorders>
               <w:left w:val="single" w:sz="2" w:space="0" w:color="000000"/>
               <w:bottom w:val="single" w:sz="2" w:space="0" w:color="000000"/>
@@ -5161,7 +5161,7 @@
         <w:trPr/>
         <w:tc>
           <w:tcPr>
-            <w:tcW w:w="1586" w:type="dxa"/>
+            <w:tcW w:w="1585" w:type="dxa"/>
             <w:tcBorders>
               <w:left w:val="single" w:sz="2" w:space="0" w:color="000000"/>
               <w:bottom w:val="single" w:sz="2" w:space="0" w:color="000000"/>
@@ -5214,7 +5214,7 @@
         </w:tc>
         <w:tc>
           <w:tcPr>
-            <w:tcW w:w="2209" w:type="dxa"/>
+            <w:tcW w:w="2210" w:type="dxa"/>
             <w:tcBorders>
               <w:left w:val="single" w:sz="2" w:space="0" w:color="000000"/>
               <w:bottom w:val="single" w:sz="2" w:space="0" w:color="000000"/>
@@ -5244,7 +5244,7 @@
         <w:trPr/>
         <w:tc>
           <w:tcPr>
-            <w:tcW w:w="1586" w:type="dxa"/>
+            <w:tcW w:w="1585" w:type="dxa"/>
             <w:tcBorders>
               <w:left w:val="single" w:sz="2" w:space="0" w:color="000000"/>
               <w:bottom w:val="single" w:sz="2" w:space="0" w:color="000000"/>
@@ -5297,7 +5297,7 @@
         </w:tc>
         <w:tc>
           <w:tcPr>
-            <w:tcW w:w="2209" w:type="dxa"/>
+            <w:tcW w:w="2210" w:type="dxa"/>
             <w:tcBorders>
               <w:left w:val="single" w:sz="2" w:space="0" w:color="000000"/>
               <w:bottom w:val="single" w:sz="2" w:space="0" w:color="000000"/>
@@ -5327,7 +5327,7 @@
         <w:trPr/>
         <w:tc>
           <w:tcPr>
-            <w:tcW w:w="1586" w:type="dxa"/>
+            <w:tcW w:w="1585" w:type="dxa"/>
             <w:tcBorders>
               <w:left w:val="single" w:sz="2" w:space="0" w:color="000000"/>
               <w:bottom w:val="single" w:sz="2" w:space="0" w:color="000000"/>
@@ -5379,7 +5379,7 @@
         </w:tc>
         <w:tc>
           <w:tcPr>
-            <w:tcW w:w="2209" w:type="dxa"/>
+            <w:tcW w:w="2210" w:type="dxa"/>
             <w:tcBorders>
               <w:left w:val="single" w:sz="2" w:space="0" w:color="000000"/>
               <w:bottom w:val="single" w:sz="2" w:space="0" w:color="000000"/>
@@ -5409,7 +5409,7 @@
         <w:trPr/>
         <w:tc>
           <w:tcPr>
-            <w:tcW w:w="1586" w:type="dxa"/>
+            <w:tcW w:w="1585" w:type="dxa"/>
             <w:tcBorders>
               <w:left w:val="single" w:sz="2" w:space="0" w:color="000000"/>
               <w:bottom w:val="single" w:sz="2" w:space="0" w:color="000000"/>
@@ -5464,7 +5464,7 @@
         </w:tc>
         <w:tc>
           <w:tcPr>
-            <w:tcW w:w="2209" w:type="dxa"/>
+            <w:tcW w:w="2210" w:type="dxa"/>
             <w:tcBorders>
               <w:left w:val="single" w:sz="2" w:space="0" w:color="000000"/>
               <w:bottom w:val="single" w:sz="2" w:space="0" w:color="000000"/>
@@ -5494,7 +5494,7 @@
         <w:trPr/>
         <w:tc>
           <w:tcPr>
-            <w:tcW w:w="1586" w:type="dxa"/>
+            <w:tcW w:w="1585" w:type="dxa"/>
             <w:tcBorders>
               <w:left w:val="single" w:sz="2" w:space="0" w:color="000000"/>
               <w:bottom w:val="single" w:sz="2" w:space="0" w:color="000000"/>
@@ -5550,7 +5550,7 @@
         </w:tc>
         <w:tc>
           <w:tcPr>
-            <w:tcW w:w="2209" w:type="dxa"/>
+            <w:tcW w:w="2210" w:type="dxa"/>
             <w:tcBorders>
               <w:left w:val="single" w:sz="2" w:space="0" w:color="000000"/>
               <w:bottom w:val="single" w:sz="2" w:space="0" w:color="000000"/>
@@ -5580,7 +5580,7 @@
         <w:trPr/>
         <w:tc>
           <w:tcPr>
-            <w:tcW w:w="1586" w:type="dxa"/>
+            <w:tcW w:w="1585" w:type="dxa"/>
             <w:tcBorders>
               <w:left w:val="single" w:sz="2" w:space="0" w:color="000000"/>
               <w:bottom w:val="single" w:sz="2" w:space="0" w:color="000000"/>
@@ -5636,7 +5636,7 @@
         </w:tc>
         <w:tc>
           <w:tcPr>
-            <w:tcW w:w="2209" w:type="dxa"/>
+            <w:tcW w:w="2210" w:type="dxa"/>
             <w:tcBorders>
               <w:left w:val="single" w:sz="2" w:space="0" w:color="000000"/>
               <w:bottom w:val="single" w:sz="2" w:space="0" w:color="000000"/>
@@ -5668,7 +5668,7 @@
         <w:trPr/>
         <w:tc>
           <w:tcPr>
-            <w:tcW w:w="1586" w:type="dxa"/>
+            <w:tcW w:w="1585" w:type="dxa"/>
             <w:tcBorders>
               <w:left w:val="single" w:sz="2" w:space="0" w:color="000000"/>
               <w:bottom w:val="single" w:sz="2" w:space="0" w:color="000000"/>
@@ -5721,7 +5721,7 @@
         </w:tc>
         <w:tc>
           <w:tcPr>
-            <w:tcW w:w="2209" w:type="dxa"/>
+            <w:tcW w:w="2210" w:type="dxa"/>
             <w:tcBorders>
               <w:left w:val="single" w:sz="2" w:space="0" w:color="000000"/>
               <w:bottom w:val="single" w:sz="2" w:space="0" w:color="000000"/>
@@ -5757,7 +5757,7 @@
         <w:trPr/>
         <w:tc>
           <w:tcPr>
-            <w:tcW w:w="1586" w:type="dxa"/>
+            <w:tcW w:w="1585" w:type="dxa"/>
             <w:tcBorders>
               <w:left w:val="single" w:sz="2" w:space="0" w:color="000000"/>
               <w:bottom w:val="single" w:sz="2" w:space="0" w:color="000000"/>
@@ -5811,7 +5811,7 @@
         </w:tc>
         <w:tc>
           <w:tcPr>
-            <w:tcW w:w="2209" w:type="dxa"/>
+            <w:tcW w:w="2210" w:type="dxa"/>
             <w:tcBorders>
               <w:left w:val="single" w:sz="2" w:space="0" w:color="000000"/>
               <w:bottom w:val="single" w:sz="2" w:space="0" w:color="000000"/>
@@ -5847,7 +5847,7 @@
         <w:trPr/>
         <w:tc>
           <w:tcPr>
-            <w:tcW w:w="1586" w:type="dxa"/>
+            <w:tcW w:w="1585" w:type="dxa"/>
             <w:tcBorders>
               <w:left w:val="single" w:sz="2" w:space="0" w:color="000000"/>
               <w:bottom w:val="single" w:sz="2" w:space="0" w:color="000000"/>
@@ -5905,7 +5905,7 @@
         </w:tc>
         <w:tc>
           <w:tcPr>
-            <w:tcW w:w="2209" w:type="dxa"/>
+            <w:tcW w:w="2210" w:type="dxa"/>
             <w:tcBorders>
               <w:left w:val="single" w:sz="2" w:space="0" w:color="000000"/>
               <w:bottom w:val="single" w:sz="2" w:space="0" w:color="000000"/>
@@ -5942,7 +5942,7 @@
         <w:trPr/>
         <w:tc>
           <w:tcPr>
-            <w:tcW w:w="1586" w:type="dxa"/>
+            <w:tcW w:w="1585" w:type="dxa"/>
             <w:tcBorders>
               <w:left w:val="single" w:sz="2" w:space="0" w:color="000000"/>
               <w:bottom w:val="single" w:sz="2" w:space="0" w:color="000000"/>
@@ -6000,7 +6000,7 @@
         </w:tc>
         <w:tc>
           <w:tcPr>
-            <w:tcW w:w="2209" w:type="dxa"/>
+            <w:tcW w:w="2210" w:type="dxa"/>
             <w:tcBorders>
               <w:left w:val="single" w:sz="2" w:space="0" w:color="000000"/>
               <w:bottom w:val="single" w:sz="2" w:space="0" w:color="000000"/>
@@ -6037,7 +6037,7 @@
         <w:trPr/>
         <w:tc>
           <w:tcPr>
-            <w:tcW w:w="1586" w:type="dxa"/>
+            <w:tcW w:w="1585" w:type="dxa"/>
             <w:tcBorders>
               <w:left w:val="single" w:sz="2" w:space="0" w:color="000000"/>
               <w:bottom w:val="single" w:sz="2" w:space="0" w:color="000000"/>
@@ -6095,7 +6095,7 @@
         </w:tc>
         <w:tc>
           <w:tcPr>
-            <w:tcW w:w="2209" w:type="dxa"/>
+            <w:tcW w:w="2210" w:type="dxa"/>
             <w:tcBorders>
               <w:left w:val="single" w:sz="2" w:space="0" w:color="000000"/>
               <w:bottom w:val="single" w:sz="2" w:space="0" w:color="000000"/>
@@ -6132,7 +6132,7 @@
         <w:trPr/>
         <w:tc>
           <w:tcPr>
-            <w:tcW w:w="1586" w:type="dxa"/>
+            <w:tcW w:w="1585" w:type="dxa"/>
             <w:tcBorders>
               <w:left w:val="single" w:sz="2" w:space="0" w:color="000000"/>
               <w:bottom w:val="single" w:sz="2" w:space="0" w:color="000000"/>
@@ -6186,7 +6186,7 @@
         </w:tc>
         <w:tc>
           <w:tcPr>
-            <w:tcW w:w="2209" w:type="dxa"/>
+            <w:tcW w:w="2210" w:type="dxa"/>
             <w:tcBorders>
               <w:left w:val="single" w:sz="2" w:space="0" w:color="000000"/>
               <w:bottom w:val="single" w:sz="2" w:space="0" w:color="000000"/>
@@ -6209,25 +6209,7 @@
                 <w:sz w:val="22"/>
                 <w:lang w:val="en-US"/>
               </w:rPr>
-              <w:t xml:space="preserve">ALT + </w:t>
-            </w:r>
-            <w:r>
-              <w:rPr>
-                <w:rFonts w:cs="Verdana" w:ascii="Verdana" w:hAnsi="Verdana"/>
-                <w:color w:val="000000"/>
-                <w:sz w:val="22"/>
-                <w:lang w:val="en-US"/>
-              </w:rPr>
-              <w:t>K</w:t>
-            </w:r>
-            <w:r>
-              <w:rPr>
-                <w:rFonts w:cs="Verdana" w:ascii="Verdana" w:hAnsi="Verdana"/>
-                <w:color w:val="000000"/>
-                <w:sz w:val="22"/>
-                <w:lang w:val="en-US"/>
-              </w:rPr>
-              <w:t xml:space="preserve"> + M</w:t>
+              <w:t>ALT + K + M</w:t>
             </w:r>
           </w:p>
         </w:tc>
@@ -6236,7 +6218,7 @@
         <w:trPr/>
         <w:tc>
           <w:tcPr>
-            <w:tcW w:w="1586" w:type="dxa"/>
+            <w:tcW w:w="1585" w:type="dxa"/>
             <w:tcBorders>
               <w:left w:val="single" w:sz="2" w:space="0" w:color="000000"/>
               <w:bottom w:val="single" w:sz="2" w:space="0" w:color="000000"/>
@@ -6291,7 +6273,7 @@
         </w:tc>
         <w:tc>
           <w:tcPr>
-            <w:tcW w:w="2209" w:type="dxa"/>
+            <w:tcW w:w="2210" w:type="dxa"/>
             <w:tcBorders>
               <w:left w:val="single" w:sz="2" w:space="0" w:color="000000"/>
               <w:bottom w:val="single" w:sz="2" w:space="0" w:color="000000"/>
@@ -6314,25 +6296,7 @@
                 <w:sz w:val="22"/>
                 <w:lang w:val="en-US"/>
               </w:rPr>
-              <w:t xml:space="preserve">ALT + </w:t>
-            </w:r>
-            <w:r>
-              <w:rPr>
-                <w:rFonts w:cs="Verdana" w:ascii="Verdana" w:hAnsi="Verdana"/>
-                <w:color w:val="000000"/>
-                <w:sz w:val="22"/>
-                <w:lang w:val="en-US"/>
-              </w:rPr>
-              <w:t>K</w:t>
-            </w:r>
-            <w:r>
-              <w:rPr>
-                <w:rFonts w:cs="Verdana" w:ascii="Verdana" w:hAnsi="Verdana"/>
-                <w:color w:val="000000"/>
-                <w:sz w:val="22"/>
-                <w:lang w:val="en-US"/>
-              </w:rPr>
-              <w:t xml:space="preserve"> + S</w:t>
+              <w:t>ALT + K + S</w:t>
             </w:r>
           </w:p>
         </w:tc>
@@ -6341,7 +6305,7 @@
         <w:trPr/>
         <w:tc>
           <w:tcPr>
-            <w:tcW w:w="1586" w:type="dxa"/>
+            <w:tcW w:w="1585" w:type="dxa"/>
             <w:tcBorders>
               <w:left w:val="single" w:sz="2" w:space="0" w:color="000000"/>
               <w:bottom w:val="single" w:sz="2" w:space="0" w:color="000000"/>
@@ -6385,7 +6349,7 @@
         </w:tc>
         <w:tc>
           <w:tcPr>
-            <w:tcW w:w="2209" w:type="dxa"/>
+            <w:tcW w:w="2210" w:type="dxa"/>
             <w:tcBorders>
               <w:left w:val="single" w:sz="2" w:space="0" w:color="000000"/>
               <w:bottom w:val="single" w:sz="2" w:space="0" w:color="000000"/>
@@ -6408,25 +6372,7 @@
                 <w:sz w:val="22"/>
                 <w:lang w:val="en-US"/>
               </w:rPr>
-              <w:t xml:space="preserve">ALT + </w:t>
-            </w:r>
-            <w:r>
-              <w:rPr>
-                <w:rFonts w:cs="Verdana" w:ascii="Verdana" w:hAnsi="Verdana"/>
-                <w:color w:val="000000"/>
-                <w:sz w:val="22"/>
-                <w:lang w:val="en-US"/>
-              </w:rPr>
-              <w:t>K</w:t>
-            </w:r>
-            <w:r>
-              <w:rPr>
-                <w:rFonts w:cs="Verdana" w:ascii="Verdana" w:hAnsi="Verdana"/>
-                <w:color w:val="000000"/>
-                <w:sz w:val="22"/>
-                <w:lang w:val="en-US"/>
-              </w:rPr>
-              <w:t xml:space="preserve"> + C</w:t>
+              <w:t>ALT + K + C</w:t>
             </w:r>
           </w:p>
         </w:tc>
@@ -6435,7 +6381,7 @@
         <w:trPr/>
         <w:tc>
           <w:tcPr>
-            <w:tcW w:w="1586" w:type="dxa"/>
+            <w:tcW w:w="1585" w:type="dxa"/>
             <w:tcBorders>
               <w:left w:val="single" w:sz="2" w:space="0" w:color="000000"/>
               <w:bottom w:val="single" w:sz="2" w:space="0" w:color="000000"/>
@@ -6479,7 +6425,7 @@
         </w:tc>
         <w:tc>
           <w:tcPr>
-            <w:tcW w:w="2209" w:type="dxa"/>
+            <w:tcW w:w="2210" w:type="dxa"/>
             <w:tcBorders>
               <w:left w:val="single" w:sz="2" w:space="0" w:color="000000"/>
               <w:bottom w:val="single" w:sz="2" w:space="0" w:color="000000"/>
@@ -6502,25 +6448,7 @@
                 <w:sz w:val="22"/>
                 <w:lang w:val="en-US"/>
               </w:rPr>
-              <w:t xml:space="preserve">ALT + </w:t>
-            </w:r>
-            <w:r>
-              <w:rPr>
-                <w:rFonts w:cs="Verdana" w:ascii="Verdana" w:hAnsi="Verdana"/>
-                <w:color w:val="000000"/>
-                <w:sz w:val="22"/>
-                <w:lang w:val="en-US"/>
-              </w:rPr>
-              <w:t>K</w:t>
-            </w:r>
-            <w:r>
-              <w:rPr>
-                <w:rFonts w:cs="Verdana" w:ascii="Verdana" w:hAnsi="Verdana"/>
-                <w:color w:val="000000"/>
-                <w:sz w:val="22"/>
-                <w:lang w:val="en-US"/>
-              </w:rPr>
-              <w:t xml:space="preserve"> + F</w:t>
+              <w:t>ALT + K + F</w:t>
             </w:r>
           </w:p>
         </w:tc>
@@ -6529,7 +6457,7 @@
         <w:trPr/>
         <w:tc>
           <w:tcPr>
-            <w:tcW w:w="1586" w:type="dxa"/>
+            <w:tcW w:w="1585" w:type="dxa"/>
             <w:tcBorders>
               <w:left w:val="single" w:sz="2" w:space="0" w:color="000000"/>
               <w:bottom w:val="single" w:sz="2" w:space="0" w:color="000000"/>
@@ -6578,7 +6506,7 @@
         </w:tc>
         <w:tc>
           <w:tcPr>
-            <w:tcW w:w="2209" w:type="dxa"/>
+            <w:tcW w:w="2210" w:type="dxa"/>
             <w:tcBorders>
               <w:left w:val="single" w:sz="2" w:space="0" w:color="000000"/>
               <w:bottom w:val="single" w:sz="2" w:space="0" w:color="000000"/>
@@ -6609,7 +6537,7 @@
         <w:trPr/>
         <w:tc>
           <w:tcPr>
-            <w:tcW w:w="1586" w:type="dxa"/>
+            <w:tcW w:w="1585" w:type="dxa"/>
             <w:tcBorders>
               <w:left w:val="single" w:sz="2" w:space="0" w:color="000000"/>
               <w:bottom w:val="single" w:sz="2" w:space="0" w:color="000000"/>
@@ -6659,7 +6587,7 @@
         </w:tc>
         <w:tc>
           <w:tcPr>
-            <w:tcW w:w="2209" w:type="dxa"/>
+            <w:tcW w:w="2210" w:type="dxa"/>
             <w:tcBorders>
               <w:left w:val="single" w:sz="2" w:space="0" w:color="000000"/>
               <w:bottom w:val="single" w:sz="2" w:space="0" w:color="000000"/>
@@ -6692,7 +6620,7 @@
         <w:trPr/>
         <w:tc>
           <w:tcPr>
-            <w:tcW w:w="1586" w:type="dxa"/>
+            <w:tcW w:w="1585" w:type="dxa"/>
             <w:tcBorders>
               <w:left w:val="single" w:sz="2" w:space="0" w:color="000000"/>
               <w:bottom w:val="single" w:sz="2" w:space="0" w:color="000000"/>
@@ -6748,7 +6676,7 @@
         </w:tc>
         <w:tc>
           <w:tcPr>
-            <w:tcW w:w="2209" w:type="dxa"/>
+            <w:tcW w:w="2210" w:type="dxa"/>
             <w:tcBorders>
               <w:left w:val="single" w:sz="2" w:space="0" w:color="000000"/>
               <w:bottom w:val="single" w:sz="2" w:space="0" w:color="000000"/>
@@ -6781,7 +6709,7 @@
         <w:trPr/>
         <w:tc>
           <w:tcPr>
-            <w:tcW w:w="1586" w:type="dxa"/>
+            <w:tcW w:w="1585" w:type="dxa"/>
             <w:tcBorders>
               <w:left w:val="single" w:sz="2" w:space="0" w:color="000000"/>
               <w:bottom w:val="single" w:sz="2" w:space="0" w:color="000000"/>
@@ -6831,7 +6759,7 @@
         </w:tc>
         <w:tc>
           <w:tcPr>
-            <w:tcW w:w="2209" w:type="dxa"/>
+            <w:tcW w:w="2210" w:type="dxa"/>
             <w:tcBorders>
               <w:left w:val="single" w:sz="2" w:space="0" w:color="000000"/>
               <w:bottom w:val="single" w:sz="2" w:space="0" w:color="000000"/>
@@ -6864,7 +6792,7 @@
         <w:trPr/>
         <w:tc>
           <w:tcPr>
-            <w:tcW w:w="1586" w:type="dxa"/>
+            <w:tcW w:w="1585" w:type="dxa"/>
             <w:tcBorders>
               <w:left w:val="single" w:sz="2" w:space="0" w:color="000000"/>
               <w:bottom w:val="single" w:sz="2" w:space="0" w:color="000000"/>
@@ -6914,7 +6842,7 @@
         </w:tc>
         <w:tc>
           <w:tcPr>
-            <w:tcW w:w="2209" w:type="dxa"/>
+            <w:tcW w:w="2210" w:type="dxa"/>
             <w:tcBorders>
               <w:left w:val="single" w:sz="2" w:space="0" w:color="000000"/>
               <w:bottom w:val="single" w:sz="2" w:space="0" w:color="000000"/>
@@ -6947,7 +6875,7 @@
         <w:trPr/>
         <w:tc>
           <w:tcPr>
-            <w:tcW w:w="1586" w:type="dxa"/>
+            <w:tcW w:w="1585" w:type="dxa"/>
             <w:tcBorders>
               <w:left w:val="single" w:sz="2" w:space="0" w:color="000000"/>
               <w:bottom w:val="single" w:sz="2" w:space="0" w:color="000000"/>
@@ -6997,7 +6925,7 @@
         </w:tc>
         <w:tc>
           <w:tcPr>
-            <w:tcW w:w="2209" w:type="dxa"/>
+            <w:tcW w:w="2210" w:type="dxa"/>
             <w:tcBorders>
               <w:left w:val="single" w:sz="2" w:space="0" w:color="000000"/>
               <w:bottom w:val="single" w:sz="2" w:space="0" w:color="000000"/>
@@ -7030,7 +6958,7 @@
         <w:trPr/>
         <w:tc>
           <w:tcPr>
-            <w:tcW w:w="1586" w:type="dxa"/>
+            <w:tcW w:w="1585" w:type="dxa"/>
             <w:tcBorders>
               <w:left w:val="single" w:sz="2" w:space="0" w:color="000000"/>
               <w:bottom w:val="single" w:sz="2" w:space="0" w:color="000000"/>
@@ -7084,7 +7012,7 @@
         </w:tc>
         <w:tc>
           <w:tcPr>
-            <w:tcW w:w="2209" w:type="dxa"/>
+            <w:tcW w:w="2210" w:type="dxa"/>
             <w:tcBorders>
               <w:left w:val="single" w:sz="2" w:space="0" w:color="000000"/>
               <w:bottom w:val="single" w:sz="2" w:space="0" w:color="000000"/>
@@ -7117,7 +7045,7 @@
         <w:trPr/>
         <w:tc>
           <w:tcPr>
-            <w:tcW w:w="1586" w:type="dxa"/>
+            <w:tcW w:w="1585" w:type="dxa"/>
             <w:tcBorders>
               <w:left w:val="single" w:sz="2" w:space="0" w:color="000000"/>
               <w:bottom w:val="single" w:sz="2" w:space="0" w:color="000000"/>
@@ -7264,7 +7192,7 @@
         </w:tc>
         <w:tc>
           <w:tcPr>
-            <w:tcW w:w="2209" w:type="dxa"/>
+            <w:tcW w:w="2210" w:type="dxa"/>
             <w:tcBorders>
               <w:left w:val="single" w:sz="2" w:space="0" w:color="000000"/>
               <w:bottom w:val="single" w:sz="2" w:space="0" w:color="000000"/>
@@ -7288,6 +7216,7 @@
                 <w:sz w:val="22"/>
                 <w:lang w:val="en-US"/>
               </w:rPr>
+              <w:t>ALT + X</w:t>
             </w:r>
           </w:p>
         </w:tc>
@@ -7296,7 +7225,7 @@
         <w:trPr/>
         <w:tc>
           <w:tcPr>
-            <w:tcW w:w="1586" w:type="dxa"/>
+            <w:tcW w:w="1585" w:type="dxa"/>
             <w:tcBorders>
               <w:left w:val="single" w:sz="2" w:space="0" w:color="000000"/>
               <w:bottom w:val="single" w:sz="2" w:space="0" w:color="000000"/>
@@ -7332,71 +7261,21 @@
           <w:p>
             <w:pPr>
               <w:pStyle w:val="Tabelindhold"/>
-              <w:rPr>
-                <w:rFonts w:ascii="Verdana" w:hAnsi="Verdana" w:cs="Verdana"/>
+              <w:rPr/>
+            </w:pPr>
+            <w:r>
+              <w:rPr>
+                <w:rFonts w:cs="Verdana" w:ascii="Verdana" w:hAnsi="Verdana"/>
                 <w:sz w:val="22"/>
                 <w:lang w:val="en-US"/>
               </w:rPr>
-            </w:pPr>
-            <w:r>
-              <w:rPr>
-                <w:rFonts w:cs="Verdana" w:ascii="Verdana" w:hAnsi="Verdana"/>
-                <w:sz w:val="22"/>
-                <w:lang w:val="en-US"/>
-              </w:rPr>
-              <w:t>Over IBOS XML muzieklezer</w:t>
-            </w:r>
-          </w:p>
-          <w:p>
-            <w:pPr>
-              <w:pStyle w:val="Tabelindhold"/>
-              <w:rPr/>
-            </w:pPr>
-            <w:r>
-              <w:rPr>
-                <w:rFonts w:cs="Verdana" w:ascii="Verdana" w:hAnsi="Verdana"/>
-                <w:sz w:val="22"/>
-                <w:lang w:val="en-US"/>
-              </w:rPr>
-              <w:t xml:space="preserve">Sneltoetsen </w:t>
-            </w:r>
-          </w:p>
-          <w:p>
-            <w:pPr>
-              <w:pStyle w:val="Tabelindhold"/>
-              <w:rPr/>
-            </w:pPr>
-            <w:r>
-              <w:rPr>
-                <w:rFonts w:cs="Verdana" w:ascii="Verdana" w:hAnsi="Verdana"/>
-                <w:sz w:val="22"/>
-                <w:lang w:val="en-US"/>
-              </w:rPr>
-              <w:t>Link naar de nieuwste software</w:t>
-            </w:r>
-          </w:p>
-          <w:p>
-            <w:pPr>
-              <w:pStyle w:val="Tabelindhold"/>
-              <w:rPr>
-                <w:rFonts w:ascii="Verdana" w:hAnsi="Verdana" w:cs="Verdana"/>
-                <w:sz w:val="22"/>
-                <w:lang w:val="en-US"/>
-              </w:rPr>
-            </w:pPr>
-            <w:r>
-              <w:rPr>
-                <w:rFonts w:cs="Verdana" w:ascii="Verdana" w:hAnsi="Verdana"/>
-                <w:sz w:val="22"/>
-                <w:lang w:val="en-US"/>
-              </w:rPr>
-              <w:t>Toon gebruikershandleiding</w:t>
-            </w:r>
-          </w:p>
-        </w:tc>
-        <w:tc>
-          <w:tcPr>
-            <w:tcW w:w="2209" w:type="dxa"/>
+              <w:t xml:space="preserve">Over IBOS XML muzieklezer </w:t>
+            </w:r>
+          </w:p>
+        </w:tc>
+        <w:tc>
+          <w:tcPr>
+            <w:tcW w:w="2210" w:type="dxa"/>
             <w:tcBorders>
               <w:left w:val="single" w:sz="2" w:space="0" w:color="000000"/>
               <w:bottom w:val="single" w:sz="2" w:space="0" w:color="000000"/>
@@ -7414,12 +7293,255 @@
                 <w:lang w:val="en-US"/>
               </w:rPr>
             </w:pPr>
+            <w:bookmarkStart w:id="7" w:name="__DdeLink__1702_4116423822"/>
             <w:r>
               <w:rPr>
                 <w:rFonts w:cs="Verdana" w:ascii="Verdana" w:hAnsi="Verdana"/>
                 <w:sz w:val="22"/>
                 <w:lang w:val="en-US"/>
               </w:rPr>
+              <w:t>ALT + H + O</w:t>
+            </w:r>
+            <w:bookmarkEnd w:id="7"/>
+          </w:p>
+        </w:tc>
+      </w:tr>
+      <w:tr>
+        <w:trPr/>
+        <w:tc>
+          <w:tcPr>
+            <w:tcW w:w="1585" w:type="dxa"/>
+            <w:tcBorders>
+              <w:left w:val="single" w:sz="2" w:space="0" w:color="000000"/>
+              <w:bottom w:val="single" w:sz="2" w:space="0" w:color="000000"/>
+            </w:tcBorders>
+            <w:shd w:color="auto" w:fill="auto" w:val="clear"/>
+          </w:tcPr>
+          <w:p>
+            <w:pPr>
+              <w:pStyle w:val="Tabelindhold"/>
+              <w:rPr/>
+            </w:pPr>
+            <w:r>
+              <w:rPr>
+                <w:rFonts w:cs="Verdana" w:ascii="Verdana" w:hAnsi="Verdana"/>
+                <w:sz w:val="22"/>
+              </w:rPr>
+              <w:t>Help</w:t>
+            </w:r>
+          </w:p>
+        </w:tc>
+        <w:tc>
+          <w:tcPr>
+            <w:tcW w:w="5220" w:type="dxa"/>
+            <w:tcBorders>
+              <w:left w:val="single" w:sz="2" w:space="0" w:color="000000"/>
+              <w:bottom w:val="single" w:sz="2" w:space="0" w:color="000000"/>
+            </w:tcBorders>
+            <w:shd w:color="auto" w:fill="auto" w:val="clear"/>
+          </w:tcPr>
+          <w:p>
+            <w:pPr>
+              <w:pStyle w:val="Tabelindhold"/>
+              <w:rPr/>
+            </w:pPr>
+            <w:r>
+              <w:rPr>
+                <w:rFonts w:cs="Verdana" w:ascii="Verdana" w:hAnsi="Verdana"/>
+                <w:sz w:val="22"/>
+                <w:lang w:val="en-US"/>
+              </w:rPr>
+              <w:t>Sneltoetsen</w:t>
+            </w:r>
+          </w:p>
+        </w:tc>
+        <w:tc>
+          <w:tcPr>
+            <w:tcW w:w="2210" w:type="dxa"/>
+            <w:tcBorders>
+              <w:left w:val="single" w:sz="2" w:space="0" w:color="000000"/>
+              <w:bottom w:val="single" w:sz="2" w:space="0" w:color="000000"/>
+              <w:right w:val="single" w:sz="2" w:space="0" w:color="000000"/>
+            </w:tcBorders>
+            <w:shd w:color="auto" w:fill="auto" w:val="clear"/>
+          </w:tcPr>
+          <w:p>
+            <w:pPr>
+              <w:pStyle w:val="Tabelindhold"/>
+              <w:snapToGrid w:val="false"/>
+              <w:rPr>
+                <w:rFonts w:ascii="Verdana" w:hAnsi="Verdana" w:cs="Verdana"/>
+                <w:sz w:val="22"/>
+                <w:lang w:val="en-US"/>
+              </w:rPr>
+            </w:pPr>
+            <w:r>
+              <w:rPr>
+                <w:rFonts w:cs="Verdana" w:ascii="Verdana" w:hAnsi="Verdana"/>
+                <w:sz w:val="22"/>
+                <w:lang w:val="en-US"/>
+              </w:rPr>
+              <w:t>ALT + H + S</w:t>
+            </w:r>
+          </w:p>
+        </w:tc>
+      </w:tr>
+      <w:tr>
+        <w:trPr/>
+        <w:tc>
+          <w:tcPr>
+            <w:tcW w:w="1585" w:type="dxa"/>
+            <w:tcBorders>
+              <w:left w:val="single" w:sz="2" w:space="0" w:color="000000"/>
+              <w:bottom w:val="single" w:sz="2" w:space="0" w:color="000000"/>
+            </w:tcBorders>
+            <w:shd w:color="auto" w:fill="auto" w:val="clear"/>
+          </w:tcPr>
+          <w:p>
+            <w:pPr>
+              <w:pStyle w:val="Tabelindhold"/>
+              <w:rPr/>
+            </w:pPr>
+            <w:r>
+              <w:rPr>
+                <w:rFonts w:cs="Verdana" w:ascii="Verdana" w:hAnsi="Verdana"/>
+                <w:sz w:val="22"/>
+              </w:rPr>
+              <w:t>Help</w:t>
+            </w:r>
+          </w:p>
+        </w:tc>
+        <w:tc>
+          <w:tcPr>
+            <w:tcW w:w="5220" w:type="dxa"/>
+            <w:tcBorders>
+              <w:left w:val="single" w:sz="2" w:space="0" w:color="000000"/>
+              <w:bottom w:val="single" w:sz="2" w:space="0" w:color="000000"/>
+            </w:tcBorders>
+            <w:shd w:color="auto" w:fill="auto" w:val="clear"/>
+          </w:tcPr>
+          <w:p>
+            <w:pPr>
+              <w:pStyle w:val="Tabelindhold"/>
+              <w:rPr/>
+            </w:pPr>
+            <w:r>
+              <w:rPr>
+                <w:rFonts w:cs="Verdana" w:ascii="Verdana" w:hAnsi="Verdana"/>
+                <w:sz w:val="22"/>
+                <w:lang w:val="en-US"/>
+              </w:rPr>
+              <w:t>Link naar de nieuwste software</w:t>
+            </w:r>
+          </w:p>
+        </w:tc>
+        <w:tc>
+          <w:tcPr>
+            <w:tcW w:w="2210" w:type="dxa"/>
+            <w:tcBorders>
+              <w:left w:val="single" w:sz="2" w:space="0" w:color="000000"/>
+              <w:bottom w:val="single" w:sz="2" w:space="0" w:color="000000"/>
+              <w:right w:val="single" w:sz="2" w:space="0" w:color="000000"/>
+            </w:tcBorders>
+            <w:shd w:color="auto" w:fill="auto" w:val="clear"/>
+          </w:tcPr>
+          <w:p>
+            <w:pPr>
+              <w:pStyle w:val="Tabelindhold"/>
+              <w:snapToGrid w:val="false"/>
+              <w:rPr>
+                <w:rFonts w:ascii="Verdana" w:hAnsi="Verdana" w:cs="Verdana"/>
+                <w:sz w:val="22"/>
+                <w:lang w:val="en-US"/>
+              </w:rPr>
+            </w:pPr>
+            <w:r>
+              <w:rPr>
+                <w:rFonts w:cs="Verdana" w:ascii="Verdana" w:hAnsi="Verdana"/>
+                <w:sz w:val="22"/>
+                <w:lang w:val="en-US"/>
+              </w:rPr>
+              <w:t>ALT + H + N</w:t>
+            </w:r>
+          </w:p>
+        </w:tc>
+      </w:tr>
+      <w:tr>
+        <w:trPr/>
+        <w:tc>
+          <w:tcPr>
+            <w:tcW w:w="1585" w:type="dxa"/>
+            <w:tcBorders>
+              <w:left w:val="single" w:sz="2" w:space="0" w:color="000000"/>
+              <w:bottom w:val="single" w:sz="2" w:space="0" w:color="000000"/>
+            </w:tcBorders>
+            <w:shd w:color="auto" w:fill="auto" w:val="clear"/>
+          </w:tcPr>
+          <w:p>
+            <w:pPr>
+              <w:pStyle w:val="Tabelindhold"/>
+              <w:rPr/>
+            </w:pPr>
+            <w:r>
+              <w:rPr>
+                <w:rFonts w:cs="Verdana" w:ascii="Verdana" w:hAnsi="Verdana"/>
+                <w:sz w:val="22"/>
+              </w:rPr>
+              <w:t>Help</w:t>
+            </w:r>
+          </w:p>
+        </w:tc>
+        <w:tc>
+          <w:tcPr>
+            <w:tcW w:w="5220" w:type="dxa"/>
+            <w:tcBorders>
+              <w:left w:val="single" w:sz="2" w:space="0" w:color="000000"/>
+              <w:bottom w:val="single" w:sz="2" w:space="0" w:color="000000"/>
+            </w:tcBorders>
+            <w:shd w:color="auto" w:fill="auto" w:val="clear"/>
+          </w:tcPr>
+          <w:p>
+            <w:pPr>
+              <w:pStyle w:val="Tabelindhold"/>
+              <w:rPr/>
+            </w:pPr>
+            <w:r>
+              <w:rPr>
+                <w:rFonts w:cs="Verdana" w:ascii="Verdana" w:hAnsi="Verdana"/>
+                <w:sz w:val="22"/>
+                <w:lang w:val="en-US"/>
+              </w:rPr>
+              <w:t>Toon gebruikershandleiding</w:t>
+            </w:r>
+          </w:p>
+        </w:tc>
+        <w:tc>
+          <w:tcPr>
+            <w:tcW w:w="2210" w:type="dxa"/>
+            <w:tcBorders>
+              <w:left w:val="single" w:sz="2" w:space="0" w:color="000000"/>
+              <w:bottom w:val="single" w:sz="2" w:space="0" w:color="000000"/>
+              <w:right w:val="single" w:sz="2" w:space="0" w:color="000000"/>
+            </w:tcBorders>
+            <w:shd w:color="auto" w:fill="auto" w:val="clear"/>
+          </w:tcPr>
+          <w:p>
+            <w:pPr>
+              <w:pStyle w:val="Tabelindhold"/>
+              <w:snapToGrid w:val="false"/>
+              <w:rPr>
+                <w:rFonts w:ascii="Verdana" w:hAnsi="Verdana" w:cs="Verdana"/>
+                <w:sz w:val="22"/>
+                <w:lang w:val="en-US"/>
+              </w:rPr>
+            </w:pPr>
+            <w:r>
+              <w:rPr>
+                <w:rFonts w:cs="Verdana" w:ascii="Verdana" w:hAnsi="Verdana"/>
+                <w:sz w:val="22"/>
+                <w:lang w:val="en-US"/>
+              </w:rPr>
+              <w:t>ALT + H + I</w:t>
             </w:r>
           </w:p>
         </w:tc>
@@ -7481,7 +7603,7 @@
           <w:szCs w:val="28"/>
         </w:rPr>
       </w:pPr>
-      <w:bookmarkStart w:id="7" w:name="_Toc31150859"/>
+      <w:bookmarkStart w:id="8" w:name="_Toc31150859"/>
       <w:r>
         <w:rPr>
           <w:rFonts w:ascii="Verdana" w:hAnsi="Verdana"/>
@@ -7490,7 +7612,7 @@
         </w:rPr>
         <w:t>Bestanden</w:t>
       </w:r>
-      <w:bookmarkEnd w:id="7"/>
+      <w:bookmarkEnd w:id="8"/>
     </w:p>
     <w:p>
       <w:pPr>
@@ -7563,7 +7685,7 @@
           <w:szCs w:val="28"/>
         </w:rPr>
       </w:pPr>
-      <w:bookmarkStart w:id="8" w:name="_Toc31150860"/>
+      <w:bookmarkStart w:id="9" w:name="_Toc31150860"/>
       <w:r>
         <w:rPr>
           <w:rFonts w:ascii="Verdana" w:hAnsi="Verdana"/>
@@ -7572,7 +7694,7 @@
         </w:rPr>
         <w:t>Wijzig</w:t>
       </w:r>
-      <w:bookmarkEnd w:id="8"/>
+      <w:bookmarkEnd w:id="9"/>
     </w:p>
     <w:p>
       <w:pPr>
@@ -7615,7 +7737,7 @@
           <w:szCs w:val="28"/>
         </w:rPr>
       </w:pPr>
-      <w:bookmarkStart w:id="9" w:name="_Toc31150861"/>
+      <w:bookmarkStart w:id="10" w:name="_Toc31150861"/>
       <w:r>
         <w:rPr>
           <w:rFonts w:ascii="Verdana" w:hAnsi="Verdana"/>
@@ -7624,7 +7746,7 @@
         </w:rPr>
         <w:t>Toon</w:t>
       </w:r>
-      <w:bookmarkEnd w:id="9"/>
+      <w:bookmarkEnd w:id="10"/>
     </w:p>
     <w:p>
       <w:pPr>
@@ -7692,7 +7814,7 @@
         </w:numPr>
         <w:rPr/>
       </w:pPr>
-      <w:bookmarkStart w:id="10" w:name="_Toc31150862"/>
+      <w:bookmarkStart w:id="11" w:name="_Toc31150862"/>
       <w:r>
         <w:rPr>
           <w:rFonts w:ascii="Verdana" w:hAnsi="Verdana"/>
@@ -7701,7 +7823,7 @@
         </w:rPr>
         <w:t>Instellingen</w:t>
       </w:r>
-      <w:bookmarkEnd w:id="10"/>
+      <w:bookmarkEnd w:id="11"/>
     </w:p>
     <w:p>
       <w:pPr>
@@ -7804,14 +7926,14 @@
         <w:tblLook w:firstRow="1" w:noVBand="1" w:lastRow="0" w:firstColumn="1" w:lastColumn="0" w:noHBand="0" w:val="04a0"/>
       </w:tblPr>
       <w:tblGrid>
-        <w:gridCol w:w="2262"/>
-        <w:gridCol w:w="6763"/>
+        <w:gridCol w:w="2261"/>
+        <w:gridCol w:w="6764"/>
       </w:tblGrid>
       <w:tr>
         <w:trPr/>
         <w:tc>
           <w:tcPr>
-            <w:tcW w:w="2262" w:type="dxa"/>
+            <w:tcW w:w="2261" w:type="dxa"/>
             <w:tcBorders>
               <w:top w:val="single" w:sz="4" w:space="0" w:color="000000"/>
               <w:left w:val="single" w:sz="4" w:space="0" w:color="000000"/>
@@ -7836,7 +7958,7 @@
         </w:tc>
         <w:tc>
           <w:tcPr>
-            <w:tcW w:w="6763" w:type="dxa"/>
+            <w:tcW w:w="6764" w:type="dxa"/>
             <w:tcBorders>
               <w:top w:val="single" w:sz="4" w:space="0" w:color="000000"/>
               <w:left w:val="single" w:sz="4" w:space="0" w:color="000000"/>
@@ -7865,7 +7987,7 @@
         <w:trPr/>
         <w:tc>
           <w:tcPr>
-            <w:tcW w:w="2262" w:type="dxa"/>
+            <w:tcW w:w="2261" w:type="dxa"/>
             <w:tcBorders>
               <w:left w:val="single" w:sz="4" w:space="0" w:color="000000"/>
               <w:bottom w:val="single" w:sz="4" w:space="0" w:color="000000"/>
@@ -7889,7 +8011,7 @@
         </w:tc>
         <w:tc>
           <w:tcPr>
-            <w:tcW w:w="6763" w:type="dxa"/>
+            <w:tcW w:w="6764" w:type="dxa"/>
             <w:tcBorders>
               <w:left w:val="single" w:sz="4" w:space="0" w:color="000000"/>
               <w:bottom w:val="single" w:sz="4" w:space="0" w:color="000000"/>
@@ -7917,7 +8039,7 @@
         <w:trPr/>
         <w:tc>
           <w:tcPr>
-            <w:tcW w:w="2262" w:type="dxa"/>
+            <w:tcW w:w="2261" w:type="dxa"/>
             <w:tcBorders>
               <w:left w:val="single" w:sz="4" w:space="0" w:color="000000"/>
               <w:bottom w:val="single" w:sz="4" w:space="0" w:color="000000"/>
@@ -7941,7 +8063,7 @@
         </w:tc>
         <w:tc>
           <w:tcPr>
-            <w:tcW w:w="6763" w:type="dxa"/>
+            <w:tcW w:w="6764" w:type="dxa"/>
             <w:tcBorders>
               <w:left w:val="single" w:sz="4" w:space="0" w:color="000000"/>
               <w:bottom w:val="single" w:sz="4" w:space="0" w:color="000000"/>
@@ -7969,7 +8091,7 @@
         <w:trPr/>
         <w:tc>
           <w:tcPr>
-            <w:tcW w:w="2262" w:type="dxa"/>
+            <w:tcW w:w="2261" w:type="dxa"/>
             <w:tcBorders>
               <w:left w:val="single" w:sz="4" w:space="0" w:color="000000"/>
               <w:bottom w:val="single" w:sz="4" w:space="0" w:color="000000"/>
@@ -7993,7 +8115,7 @@
         </w:tc>
         <w:tc>
           <w:tcPr>
-            <w:tcW w:w="6763" w:type="dxa"/>
+            <w:tcW w:w="6764" w:type="dxa"/>
             <w:tcBorders>
               <w:left w:val="single" w:sz="4" w:space="0" w:color="000000"/>
               <w:bottom w:val="single" w:sz="4" w:space="0" w:color="000000"/>
@@ -8021,7 +8143,7 @@
         <w:trPr/>
         <w:tc>
           <w:tcPr>
-            <w:tcW w:w="2262" w:type="dxa"/>
+            <w:tcW w:w="2261" w:type="dxa"/>
             <w:tcBorders>
               <w:left w:val="single" w:sz="4" w:space="0" w:color="000000"/>
               <w:bottom w:val="single" w:sz="4" w:space="0" w:color="000000"/>
@@ -8045,7 +8167,7 @@
         </w:tc>
         <w:tc>
           <w:tcPr>
-            <w:tcW w:w="6763" w:type="dxa"/>
+            <w:tcW w:w="6764" w:type="dxa"/>
             <w:tcBorders>
               <w:left w:val="single" w:sz="4" w:space="0" w:color="000000"/>
               <w:bottom w:val="single" w:sz="4" w:space="0" w:color="000000"/>
@@ -8073,7 +8195,7 @@
         <w:trPr/>
         <w:tc>
           <w:tcPr>
-            <w:tcW w:w="2262" w:type="dxa"/>
+            <w:tcW w:w="2261" w:type="dxa"/>
             <w:tcBorders>
               <w:left w:val="single" w:sz="4" w:space="0" w:color="000000"/>
               <w:bottom w:val="single" w:sz="4" w:space="0" w:color="000000"/>
@@ -8097,7 +8219,7 @@
         </w:tc>
         <w:tc>
           <w:tcPr>
-            <w:tcW w:w="6763" w:type="dxa"/>
+            <w:tcW w:w="6764" w:type="dxa"/>
             <w:tcBorders>
               <w:left w:val="single" w:sz="4" w:space="0" w:color="000000"/>
               <w:bottom w:val="single" w:sz="4" w:space="0" w:color="000000"/>
@@ -8125,7 +8247,7 @@
         <w:trPr/>
         <w:tc>
           <w:tcPr>
-            <w:tcW w:w="2262" w:type="dxa"/>
+            <w:tcW w:w="2261" w:type="dxa"/>
             <w:tcBorders>
               <w:left w:val="single" w:sz="4" w:space="0" w:color="000000"/>
               <w:bottom w:val="single" w:sz="4" w:space="0" w:color="000000"/>
@@ -8149,7 +8271,7 @@
         </w:tc>
         <w:tc>
           <w:tcPr>
-            <w:tcW w:w="6763" w:type="dxa"/>
+            <w:tcW w:w="6764" w:type="dxa"/>
             <w:tcBorders>
               <w:left w:val="single" w:sz="4" w:space="0" w:color="000000"/>
               <w:bottom w:val="single" w:sz="4" w:space="0" w:color="000000"/>
@@ -8177,7 +8299,7 @@
         <w:trPr/>
         <w:tc>
           <w:tcPr>
-            <w:tcW w:w="2262" w:type="dxa"/>
+            <w:tcW w:w="2261" w:type="dxa"/>
             <w:tcBorders>
               <w:left w:val="single" w:sz="4" w:space="0" w:color="000000"/>
               <w:bottom w:val="single" w:sz="4" w:space="0" w:color="000000"/>
@@ -8201,7 +8323,7 @@
         </w:tc>
         <w:tc>
           <w:tcPr>
-            <w:tcW w:w="6763" w:type="dxa"/>
+            <w:tcW w:w="6764" w:type="dxa"/>
             <w:tcBorders>
               <w:left w:val="single" w:sz="4" w:space="0" w:color="000000"/>
               <w:bottom w:val="single" w:sz="4" w:space="0" w:color="000000"/>
@@ -8281,7 +8403,7 @@
           <w:szCs w:val="28"/>
         </w:rPr>
       </w:pPr>
-      <w:bookmarkStart w:id="11" w:name="_Toc31150863"/>
+      <w:bookmarkStart w:id="12" w:name="_Toc31150863"/>
       <w:r>
         <w:rPr>
           <w:rFonts w:ascii="Verdana" w:hAnsi="Verdana"/>
@@ -8290,7 +8412,7 @@
         </w:rPr>
         <w:t>Hulpmiddelen</w:t>
       </w:r>
-      <w:bookmarkEnd w:id="11"/>
+      <w:bookmarkEnd w:id="12"/>
     </w:p>
     <w:p>
       <w:pPr>
@@ -8403,7 +8525,7 @@
           <w:szCs w:val="28"/>
         </w:rPr>
       </w:pPr>
-      <w:bookmarkStart w:id="12" w:name="_Toc31150864"/>
+      <w:bookmarkStart w:id="13" w:name="_Toc31150864"/>
       <w:r>
         <w:rPr>
           <w:rFonts w:ascii="Verdana" w:hAnsi="Verdana"/>
@@ -8412,7 +8534,7 @@
         </w:rPr>
         <w:t>Muziek bibliotheken</w:t>
       </w:r>
-      <w:bookmarkEnd w:id="12"/>
+      <w:bookmarkEnd w:id="13"/>
     </w:p>
     <w:p>
       <w:pPr>
@@ -8552,7 +8674,7 @@
           <w:szCs w:val="28"/>
         </w:rPr>
       </w:pPr>
-      <w:bookmarkStart w:id="13" w:name="_Toc31150865"/>
+      <w:bookmarkStart w:id="14" w:name="_Toc31150865"/>
       <w:r>
         <w:rPr>
           <w:rFonts w:ascii="Verdana" w:hAnsi="Verdana"/>
@@ -8561,7 +8683,7 @@
         </w:rPr>
         <w:t>Help</w:t>
       </w:r>
-      <w:bookmarkEnd w:id="13"/>
+      <w:bookmarkEnd w:id="14"/>
     </w:p>
     <w:p>
       <w:pPr>
@@ -8639,14 +8761,14 @@
           <w:rFonts w:ascii="Verdana" w:hAnsi="Verdana"/>
         </w:rPr>
       </w:pPr>
-      <w:bookmarkStart w:id="14" w:name="_Toc31150866"/>
+      <w:bookmarkStart w:id="15" w:name="_Toc31150866"/>
       <w:r>
         <w:rPr>
           <w:rFonts w:ascii="Verdana" w:hAnsi="Verdana"/>
         </w:rPr>
         <w:t>De notenlijst</w:t>
       </w:r>
-      <w:bookmarkEnd w:id="14"/>
+      <w:bookmarkEnd w:id="15"/>
     </w:p>
     <w:p>
       <w:pPr>
@@ -8771,15 +8893,15 @@
         <w:tblLook w:firstRow="1" w:noVBand="1" w:lastRow="0" w:firstColumn="1" w:lastColumn="0" w:noHBand="0" w:val="04a0"/>
       </w:tblPr>
       <w:tblGrid>
-        <w:gridCol w:w="3235"/>
+        <w:gridCol w:w="3234"/>
         <w:gridCol w:w="2309"/>
-        <w:gridCol w:w="3411"/>
+        <w:gridCol w:w="3412"/>
       </w:tblGrid>
       <w:tr>
         <w:trPr/>
         <w:tc>
           <w:tcPr>
-            <w:tcW w:w="3235" w:type="dxa"/>
+            <w:tcW w:w="3234" w:type="dxa"/>
             <w:tcBorders/>
             <w:shd w:color="auto" w:fill="auto" w:val="clear"/>
           </w:tcPr>
@@ -8821,7 +8943,7 @@
         </w:tc>
         <w:tc>
           <w:tcPr>
-            <w:tcW w:w="3411" w:type="dxa"/>
+            <w:tcW w:w="3412" w:type="dxa"/>
             <w:tcBorders/>
             <w:shd w:color="auto" w:fill="auto" w:val="clear"/>
           </w:tcPr>
@@ -8845,7 +8967,7 @@
         <w:trPr/>
         <w:tc>
           <w:tcPr>
-            <w:tcW w:w="3235" w:type="dxa"/>
+            <w:tcW w:w="3234" w:type="dxa"/>
             <w:tcBorders/>
             <w:shd w:color="auto" w:fill="auto" w:val="clear"/>
           </w:tcPr>
@@ -8888,7 +9010,7 @@
         </w:tc>
         <w:tc>
           <w:tcPr>
-            <w:tcW w:w="3411" w:type="dxa"/>
+            <w:tcW w:w="3412" w:type="dxa"/>
             <w:tcBorders/>
             <w:shd w:color="auto" w:fill="auto" w:val="clear"/>
           </w:tcPr>
@@ -8937,7 +9059,7 @@
         <w:trPr/>
         <w:tc>
           <w:tcPr>
-            <w:tcW w:w="3235" w:type="dxa"/>
+            <w:tcW w:w="3234" w:type="dxa"/>
             <w:tcBorders/>
             <w:shd w:color="auto" w:fill="auto" w:val="clear"/>
           </w:tcPr>
@@ -8996,7 +9118,7 @@
         </w:tc>
         <w:tc>
           <w:tcPr>
-            <w:tcW w:w="3411" w:type="dxa"/>
+            <w:tcW w:w="3412" w:type="dxa"/>
             <w:tcBorders/>
             <w:shd w:color="auto" w:fill="auto" w:val="clear"/>
           </w:tcPr>
@@ -9022,7 +9144,7 @@
         <w:trPr/>
         <w:tc>
           <w:tcPr>
-            <w:tcW w:w="3235" w:type="dxa"/>
+            <w:tcW w:w="3234" w:type="dxa"/>
             <w:tcBorders/>
             <w:shd w:color="auto" w:fill="auto" w:val="clear"/>
           </w:tcPr>
@@ -9065,7 +9187,7 @@
         </w:tc>
         <w:tc>
           <w:tcPr>
-            <w:tcW w:w="3411" w:type="dxa"/>
+            <w:tcW w:w="3412" w:type="dxa"/>
             <w:tcBorders/>
             <w:shd w:color="auto" w:fill="auto" w:val="clear"/>
           </w:tcPr>
@@ -9091,7 +9213,7 @@
         <w:trPr/>
         <w:tc>
           <w:tcPr>
-            <w:tcW w:w="3235" w:type="dxa"/>
+            <w:tcW w:w="3234" w:type="dxa"/>
             <w:tcBorders/>
             <w:shd w:color="auto" w:fill="auto" w:val="clear"/>
           </w:tcPr>
@@ -9134,7 +9256,7 @@
         </w:tc>
         <w:tc>
           <w:tcPr>
-            <w:tcW w:w="3411" w:type="dxa"/>
+            <w:tcW w:w="3412" w:type="dxa"/>
             <w:tcBorders/>
             <w:shd w:color="auto" w:fill="auto" w:val="clear"/>
           </w:tcPr>
@@ -9160,7 +9282,7 @@
         <w:trPr/>
         <w:tc>
           <w:tcPr>
-            <w:tcW w:w="3235" w:type="dxa"/>
+            <w:tcW w:w="3234" w:type="dxa"/>
             <w:tcBorders/>
             <w:shd w:color="auto" w:fill="auto" w:val="clear"/>
           </w:tcPr>
@@ -9206,7 +9328,7 @@
         </w:tc>
         <w:tc>
           <w:tcPr>
-            <w:tcW w:w="3411" w:type="dxa"/>
+            <w:tcW w:w="3412" w:type="dxa"/>
             <w:tcBorders/>
             <w:shd w:color="auto" w:fill="auto" w:val="clear"/>
           </w:tcPr>
@@ -9343,15 +9465,15 @@
         <w:tblLook w:firstRow="1" w:noVBand="1" w:lastRow="0" w:firstColumn="1" w:lastColumn="0" w:noHBand="0" w:val="04a0"/>
       </w:tblPr>
       <w:tblGrid>
-        <w:gridCol w:w="3235"/>
+        <w:gridCol w:w="3234"/>
         <w:gridCol w:w="2339"/>
-        <w:gridCol w:w="3441"/>
+        <w:gridCol w:w="3442"/>
       </w:tblGrid>
       <w:tr>
         <w:trPr/>
         <w:tc>
           <w:tcPr>
-            <w:tcW w:w="3235" w:type="dxa"/>
+            <w:tcW w:w="3234" w:type="dxa"/>
             <w:tcBorders/>
             <w:shd w:color="auto" w:fill="auto" w:val="clear"/>
           </w:tcPr>
@@ -9397,7 +9519,7 @@
         </w:tc>
         <w:tc>
           <w:tcPr>
-            <w:tcW w:w="3441" w:type="dxa"/>
+            <w:tcW w:w="3442" w:type="dxa"/>
             <w:tcBorders/>
             <w:shd w:color="auto" w:fill="auto" w:val="clear"/>
           </w:tcPr>
@@ -9423,7 +9545,7 @@
         <w:trPr/>
         <w:tc>
           <w:tcPr>
-            <w:tcW w:w="3235" w:type="dxa"/>
+            <w:tcW w:w="3234" w:type="dxa"/>
             <w:tcBorders/>
             <w:shd w:color="auto" w:fill="auto" w:val="clear"/>
           </w:tcPr>
@@ -9469,7 +9591,7 @@
         </w:tc>
         <w:tc>
           <w:tcPr>
-            <w:tcW w:w="3441" w:type="dxa"/>
+            <w:tcW w:w="3442" w:type="dxa"/>
             <w:tcBorders/>
             <w:shd w:color="auto" w:fill="auto" w:val="clear"/>
           </w:tcPr>
@@ -9880,7 +10002,7 @@
           <w:szCs w:val="32"/>
         </w:rPr>
       </w:pPr>
-      <w:bookmarkStart w:id="15" w:name="_Toc31150867"/>
+      <w:bookmarkStart w:id="16" w:name="_Toc31150867"/>
       <w:r>
         <w:rPr>
           <w:rFonts w:ascii="Verdana" w:hAnsi="Verdana"/>
@@ -9891,7 +10013,7 @@
         </w:rPr>
         <w:t>Het noten filter</w:t>
       </w:r>
-      <w:bookmarkEnd w:id="15"/>
+      <w:bookmarkEnd w:id="16"/>
     </w:p>
     <w:p>
       <w:pPr>
@@ -9952,14 +10074,14 @@
         <w:tblLook w:firstRow="1" w:noVBand="1" w:lastRow="0" w:firstColumn="1" w:lastColumn="0" w:noHBand="0" w:val="04a0"/>
       </w:tblPr>
       <w:tblGrid>
-        <w:gridCol w:w="1796"/>
-        <w:gridCol w:w="7158"/>
+        <w:gridCol w:w="1795"/>
+        <w:gridCol w:w="7159"/>
       </w:tblGrid>
       <w:tr>
         <w:trPr/>
         <w:tc>
           <w:tcPr>
-            <w:tcW w:w="1796" w:type="dxa"/>
+            <w:tcW w:w="1795" w:type="dxa"/>
             <w:tcBorders/>
             <w:shd w:color="auto" w:fill="auto" w:val="clear"/>
           </w:tcPr>
@@ -9982,7 +10104,7 @@
         </w:tc>
         <w:tc>
           <w:tcPr>
-            <w:tcW w:w="7158" w:type="dxa"/>
+            <w:tcW w:w="7159" w:type="dxa"/>
             <w:tcBorders/>
             <w:shd w:color="auto" w:fill="auto" w:val="clear"/>
           </w:tcPr>
@@ -10008,7 +10130,7 @@
         <w:trPr/>
         <w:tc>
           <w:tcPr>
-            <w:tcW w:w="1796" w:type="dxa"/>
+            <w:tcW w:w="1795" w:type="dxa"/>
             <w:tcBorders/>
             <w:shd w:color="auto" w:fill="auto" w:val="clear"/>
           </w:tcPr>
@@ -10029,7 +10151,7 @@
         </w:tc>
         <w:tc>
           <w:tcPr>
-            <w:tcW w:w="7158" w:type="dxa"/>
+            <w:tcW w:w="7159" w:type="dxa"/>
             <w:tcBorders/>
             <w:shd w:color="auto" w:fill="auto" w:val="clear"/>
           </w:tcPr>
@@ -10051,7 +10173,7 @@
         <w:trPr/>
         <w:tc>
           <w:tcPr>
-            <w:tcW w:w="1796" w:type="dxa"/>
+            <w:tcW w:w="1795" w:type="dxa"/>
             <w:tcBorders/>
             <w:shd w:color="auto" w:fill="auto" w:val="clear"/>
           </w:tcPr>
@@ -10072,7 +10194,7 @@
         </w:tc>
         <w:tc>
           <w:tcPr>
-            <w:tcW w:w="7158" w:type="dxa"/>
+            <w:tcW w:w="7159" w:type="dxa"/>
             <w:tcBorders/>
             <w:shd w:color="auto" w:fill="auto" w:val="clear"/>
           </w:tcPr>
@@ -10096,7 +10218,7 @@
         <w:trPr/>
         <w:tc>
           <w:tcPr>
-            <w:tcW w:w="1796" w:type="dxa"/>
+            <w:tcW w:w="1795" w:type="dxa"/>
             <w:tcBorders/>
             <w:shd w:color="auto" w:fill="auto" w:val="clear"/>
           </w:tcPr>
@@ -10117,7 +10239,7 @@
         </w:tc>
         <w:tc>
           <w:tcPr>
-            <w:tcW w:w="7158" w:type="dxa"/>
+            <w:tcW w:w="7159" w:type="dxa"/>
             <w:tcBorders/>
             <w:shd w:color="auto" w:fill="auto" w:val="clear"/>
           </w:tcPr>
@@ -10143,7 +10265,7 @@
         </w:trPr>
         <w:tc>
           <w:tcPr>
-            <w:tcW w:w="1796" w:type="dxa"/>
+            <w:tcW w:w="1795" w:type="dxa"/>
             <w:tcBorders/>
             <w:shd w:color="auto" w:fill="auto" w:val="clear"/>
           </w:tcPr>
@@ -10164,7 +10286,7 @@
         </w:tc>
         <w:tc>
           <w:tcPr>
-            <w:tcW w:w="7158" w:type="dxa"/>
+            <w:tcW w:w="7159" w:type="dxa"/>
             <w:tcBorders/>
             <w:shd w:color="auto" w:fill="auto" w:val="clear"/>
           </w:tcPr>
@@ -10188,7 +10310,7 @@
         <w:trPr/>
         <w:tc>
           <w:tcPr>
-            <w:tcW w:w="1796" w:type="dxa"/>
+            <w:tcW w:w="1795" w:type="dxa"/>
             <w:tcBorders/>
             <w:shd w:color="auto" w:fill="auto" w:val="clear"/>
           </w:tcPr>
@@ -10209,7 +10331,7 @@
         </w:tc>
         <w:tc>
           <w:tcPr>
-            <w:tcW w:w="7158" w:type="dxa"/>
+            <w:tcW w:w="7159" w:type="dxa"/>
             <w:tcBorders/>
             <w:shd w:color="auto" w:fill="auto" w:val="clear"/>
           </w:tcPr>
@@ -10231,7 +10353,7 @@
         <w:trPr/>
         <w:tc>
           <w:tcPr>
-            <w:tcW w:w="1796" w:type="dxa"/>
+            <w:tcW w:w="1795" w:type="dxa"/>
             <w:tcBorders/>
             <w:shd w:color="auto" w:fill="auto" w:val="clear"/>
           </w:tcPr>
@@ -10252,7 +10374,7 @@
         </w:tc>
         <w:tc>
           <w:tcPr>
-            <w:tcW w:w="7158" w:type="dxa"/>
+            <w:tcW w:w="7159" w:type="dxa"/>
             <w:tcBorders/>
             <w:shd w:color="auto" w:fill="auto" w:val="clear"/>
           </w:tcPr>
@@ -10290,7 +10412,7 @@
         <w:trPr/>
         <w:tc>
           <w:tcPr>
-            <w:tcW w:w="1796" w:type="dxa"/>
+            <w:tcW w:w="1795" w:type="dxa"/>
             <w:tcBorders/>
             <w:shd w:color="auto" w:fill="auto" w:val="clear"/>
           </w:tcPr>
@@ -10311,7 +10433,7 @@
         </w:tc>
         <w:tc>
           <w:tcPr>
-            <w:tcW w:w="7158" w:type="dxa"/>
+            <w:tcW w:w="7159" w:type="dxa"/>
             <w:tcBorders/>
             <w:shd w:color="auto" w:fill="auto" w:val="clear"/>
           </w:tcPr>
@@ -10411,14 +10533,14 @@
         <w:tblLook w:firstRow="1" w:noVBand="1" w:lastRow="0" w:firstColumn="1" w:lastColumn="0" w:noHBand="0" w:val="04a0"/>
       </w:tblPr>
       <w:tblGrid>
-        <w:gridCol w:w="3058"/>
-        <w:gridCol w:w="6586"/>
+        <w:gridCol w:w="3057"/>
+        <w:gridCol w:w="6587"/>
       </w:tblGrid>
       <w:tr>
         <w:trPr/>
         <w:tc>
           <w:tcPr>
-            <w:tcW w:w="3058" w:type="dxa"/>
+            <w:tcW w:w="3057" w:type="dxa"/>
             <w:tcBorders/>
             <w:shd w:color="auto" w:fill="auto" w:val="clear"/>
           </w:tcPr>
@@ -10439,7 +10561,7 @@
         </w:tc>
         <w:tc>
           <w:tcPr>
-            <w:tcW w:w="6586" w:type="dxa"/>
+            <w:tcW w:w="6587" w:type="dxa"/>
             <w:tcBorders/>
             <w:shd w:color="auto" w:fill="auto" w:val="clear"/>
           </w:tcPr>
@@ -10463,7 +10585,7 @@
         <w:trPr/>
         <w:tc>
           <w:tcPr>
-            <w:tcW w:w="3058" w:type="dxa"/>
+            <w:tcW w:w="3057" w:type="dxa"/>
             <w:tcBorders/>
             <w:shd w:color="auto" w:fill="auto" w:val="clear"/>
           </w:tcPr>
@@ -10484,7 +10606,7 @@
         </w:tc>
         <w:tc>
           <w:tcPr>
-            <w:tcW w:w="6586" w:type="dxa"/>
+            <w:tcW w:w="6587" w:type="dxa"/>
             <w:tcBorders/>
             <w:shd w:color="auto" w:fill="auto" w:val="clear"/>
           </w:tcPr>
@@ -10506,7 +10628,7 @@
         <w:trPr/>
         <w:tc>
           <w:tcPr>
-            <w:tcW w:w="3058" w:type="dxa"/>
+            <w:tcW w:w="3057" w:type="dxa"/>
             <w:tcBorders/>
             <w:shd w:color="auto" w:fill="auto" w:val="clear"/>
           </w:tcPr>
@@ -10525,7 +10647,7 @@
         </w:tc>
         <w:tc>
           <w:tcPr>
-            <w:tcW w:w="6586" w:type="dxa"/>
+            <w:tcW w:w="6587" w:type="dxa"/>
             <w:tcBorders/>
             <w:shd w:color="auto" w:fill="auto" w:val="clear"/>
           </w:tcPr>
@@ -10547,7 +10669,7 @@
         <w:trPr/>
         <w:tc>
           <w:tcPr>
-            <w:tcW w:w="3058" w:type="dxa"/>
+            <w:tcW w:w="3057" w:type="dxa"/>
             <w:tcBorders/>
             <w:shd w:color="auto" w:fill="auto" w:val="clear"/>
           </w:tcPr>
@@ -10568,7 +10690,7 @@
         </w:tc>
         <w:tc>
           <w:tcPr>
-            <w:tcW w:w="6586" w:type="dxa"/>
+            <w:tcW w:w="6587" w:type="dxa"/>
             <w:tcBorders/>
             <w:shd w:color="auto" w:fill="auto" w:val="clear"/>
           </w:tcPr>
@@ -10680,8 +10802,8 @@
         <w:tblLook w:firstRow="1" w:noVBand="1" w:lastRow="0" w:firstColumn="1" w:lastColumn="0" w:noHBand="0" w:val="04a0"/>
       </w:tblPr>
       <w:tblGrid>
-        <w:gridCol w:w="2264"/>
-        <w:gridCol w:w="6690"/>
+        <w:gridCol w:w="2263"/>
+        <w:gridCol w:w="6691"/>
       </w:tblGrid>
       <w:tr>
         <w:trPr>
@@ -10689,7 +10811,7 @@
         </w:trPr>
         <w:tc>
           <w:tcPr>
-            <w:tcW w:w="2264" w:type="dxa"/>
+            <w:tcW w:w="2263" w:type="dxa"/>
             <w:tcBorders/>
             <w:shd w:color="auto" w:fill="auto" w:val="clear"/>
           </w:tcPr>
@@ -10712,7 +10834,7 @@
         </w:tc>
         <w:tc>
           <w:tcPr>
-            <w:tcW w:w="6690" w:type="dxa"/>
+            <w:tcW w:w="6691" w:type="dxa"/>
             <w:tcBorders/>
             <w:shd w:color="auto" w:fill="auto" w:val="clear"/>
           </w:tcPr>
@@ -10737,7 +10859,7 @@
         <w:trPr/>
         <w:tc>
           <w:tcPr>
-            <w:tcW w:w="2264" w:type="dxa"/>
+            <w:tcW w:w="2263" w:type="dxa"/>
             <w:tcBorders/>
             <w:shd w:color="auto" w:fill="auto" w:val="clear"/>
           </w:tcPr>
@@ -10759,7 +10881,7 @@
         </w:tc>
         <w:tc>
           <w:tcPr>
-            <w:tcW w:w="6690" w:type="dxa"/>
+            <w:tcW w:w="6691" w:type="dxa"/>
             <w:tcBorders/>
             <w:shd w:color="auto" w:fill="auto" w:val="clear"/>
           </w:tcPr>
@@ -10783,7 +10905,7 @@
         <w:trPr/>
         <w:tc>
           <w:tcPr>
-            <w:tcW w:w="2264" w:type="dxa"/>
+            <w:tcW w:w="2263" w:type="dxa"/>
             <w:tcBorders/>
             <w:shd w:color="auto" w:fill="auto" w:val="clear"/>
           </w:tcPr>
@@ -10803,7 +10925,7 @@
         </w:tc>
         <w:tc>
           <w:tcPr>
-            <w:tcW w:w="6690" w:type="dxa"/>
+            <w:tcW w:w="6691" w:type="dxa"/>
             <w:tcBorders/>
             <w:shd w:color="auto" w:fill="auto" w:val="clear"/>
           </w:tcPr>
@@ -10833,7 +10955,7 @@
         <w:trPr/>
         <w:tc>
           <w:tcPr>
-            <w:tcW w:w="2264" w:type="dxa"/>
+            <w:tcW w:w="2263" w:type="dxa"/>
             <w:tcBorders/>
             <w:shd w:color="auto" w:fill="auto" w:val="clear"/>
           </w:tcPr>
@@ -10855,7 +10977,7 @@
         </w:tc>
         <w:tc>
           <w:tcPr>
-            <w:tcW w:w="6690" w:type="dxa"/>
+            <w:tcW w:w="6691" w:type="dxa"/>
             <w:tcBorders/>
             <w:shd w:color="auto" w:fill="auto" w:val="clear"/>
           </w:tcPr>
@@ -10877,7 +10999,7 @@
         <w:trPr/>
         <w:tc>
           <w:tcPr>
-            <w:tcW w:w="2264" w:type="dxa"/>
+            <w:tcW w:w="2263" w:type="dxa"/>
             <w:tcBorders/>
             <w:shd w:color="auto" w:fill="auto" w:val="clear"/>
           </w:tcPr>
@@ -10899,7 +11021,7 @@
         </w:tc>
         <w:tc>
           <w:tcPr>
-            <w:tcW w:w="6690" w:type="dxa"/>
+            <w:tcW w:w="6691" w:type="dxa"/>
             <w:tcBorders/>
             <w:shd w:color="auto" w:fill="auto" w:val="clear"/>
           </w:tcPr>
@@ -10923,7 +11045,7 @@
         <w:trPr/>
         <w:tc>
           <w:tcPr>
-            <w:tcW w:w="2264" w:type="dxa"/>
+            <w:tcW w:w="2263" w:type="dxa"/>
             <w:tcBorders/>
             <w:shd w:color="auto" w:fill="auto" w:val="clear"/>
           </w:tcPr>
@@ -10943,7 +11065,7 @@
         </w:tc>
         <w:tc>
           <w:tcPr>
-            <w:tcW w:w="6690" w:type="dxa"/>
+            <w:tcW w:w="6691" w:type="dxa"/>
             <w:tcBorders/>
             <w:shd w:color="auto" w:fill="auto" w:val="clear"/>
           </w:tcPr>
@@ -10969,7 +11091,7 @@
         <w:trPr/>
         <w:tc>
           <w:tcPr>
-            <w:tcW w:w="2264" w:type="dxa"/>
+            <w:tcW w:w="2263" w:type="dxa"/>
             <w:tcBorders/>
             <w:shd w:color="auto" w:fill="auto" w:val="clear"/>
           </w:tcPr>
@@ -10991,7 +11113,7 @@
         </w:tc>
         <w:tc>
           <w:tcPr>
-            <w:tcW w:w="6690" w:type="dxa"/>
+            <w:tcW w:w="6691" w:type="dxa"/>
             <w:tcBorders/>
             <w:shd w:color="auto" w:fill="auto" w:val="clear"/>
           </w:tcPr>
@@ -11015,7 +11137,7 @@
         <w:trPr/>
         <w:tc>
           <w:tcPr>
-            <w:tcW w:w="2264" w:type="dxa"/>
+            <w:tcW w:w="2263" w:type="dxa"/>
             <w:tcBorders/>
             <w:shd w:color="auto" w:fill="auto" w:val="clear"/>
           </w:tcPr>
@@ -11035,7 +11157,7 @@
         </w:tc>
         <w:tc>
           <w:tcPr>
-            <w:tcW w:w="6690" w:type="dxa"/>
+            <w:tcW w:w="6691" w:type="dxa"/>
             <w:tcBorders/>
             <w:shd w:color="auto" w:fill="auto" w:val="clear"/>
           </w:tcPr>
@@ -11059,7 +11181,7 @@
         <w:trPr/>
         <w:tc>
           <w:tcPr>
-            <w:tcW w:w="2264" w:type="dxa"/>
+            <w:tcW w:w="2263" w:type="dxa"/>
             <w:tcBorders/>
             <w:shd w:color="auto" w:fill="auto" w:val="clear"/>
           </w:tcPr>
@@ -11080,7 +11202,7 @@
         </w:tc>
         <w:tc>
           <w:tcPr>
-            <w:tcW w:w="6690" w:type="dxa"/>
+            <w:tcW w:w="6691" w:type="dxa"/>
             <w:tcBorders/>
             <w:shd w:color="auto" w:fill="auto" w:val="clear"/>
           </w:tcPr>
@@ -11195,7 +11317,7 @@
           <w:iCs w:val="false"/>
         </w:rPr>
       </w:pPr>
-      <w:bookmarkStart w:id="16" w:name="_Toc31150868"/>
+      <w:bookmarkStart w:id="17" w:name="_Toc31150868"/>
       <w:r>
         <w:rPr>
           <w:rFonts w:ascii="Verdana" w:hAnsi="Verdana"/>
@@ -11204,7 +11326,7 @@
         </w:rPr>
         <w:t>De statusbalk</w:t>
       </w:r>
-      <w:bookmarkEnd w:id="16"/>
+      <w:bookmarkEnd w:id="17"/>
     </w:p>
     <w:p>
       <w:pPr>
@@ -11255,7 +11377,7 @@
           <w:iCs w:val="false"/>
         </w:rPr>
       </w:pPr>
-      <w:bookmarkStart w:id="17" w:name="_Toc31150869"/>
+      <w:bookmarkStart w:id="18" w:name="_Toc31150869"/>
       <w:r>
         <w:rPr>
           <w:rFonts w:ascii="Verdana" w:hAnsi="Verdana"/>
@@ -11264,7 +11386,7 @@
         </w:rPr>
         <w:t>De detail lijst</w:t>
       </w:r>
-      <w:bookmarkEnd w:id="17"/>
+      <w:bookmarkEnd w:id="18"/>
     </w:p>
     <w:p>
       <w:pPr>
@@ -11483,7 +11605,7 @@
           <w:iCs w:val="false"/>
         </w:rPr>
       </w:pPr>
-      <w:bookmarkStart w:id="18" w:name="_Toc31150870"/>
+      <w:bookmarkStart w:id="19" w:name="_Toc31150870"/>
       <w:r>
         <w:rPr>
           <w:rFonts w:ascii="Verdana" w:hAnsi="Verdana"/>
@@ -11492,7 +11614,7 @@
         </w:rPr>
         <w:t>Status details</w:t>
       </w:r>
-      <w:bookmarkEnd w:id="18"/>
+      <w:bookmarkEnd w:id="19"/>
     </w:p>
     <w:p>
       <w:pPr>
@@ -11575,7 +11697,7 @@
         </w:rPr>
         <w:t>A</w:t>
       </w:r>
-      <w:bookmarkStart w:id="19" w:name="_Toc31150871"/>
+      <w:bookmarkStart w:id="20" w:name="_Toc31150871"/>
       <w:r>
         <w:rPr>
           <w:rFonts w:ascii="Verdana" w:hAnsi="Verdana"/>
@@ -11584,7 +11706,7 @@
         </w:rPr>
         <w:t>kkoord symbolen</w:t>
       </w:r>
-      <w:bookmarkEnd w:id="19"/>
+      <w:bookmarkEnd w:id="20"/>
       <w:r>
         <w:rPr>
           <w:rFonts w:ascii="Verdana" w:hAnsi="Verdana"/>
@@ -11686,7 +11808,7 @@
           <w:iCs w:val="false"/>
         </w:rPr>
       </w:pPr>
-      <w:bookmarkStart w:id="20" w:name="_Toc31150872"/>
+      <w:bookmarkStart w:id="21" w:name="_Toc31150872"/>
       <w:r>
         <w:rPr>
           <w:rFonts w:ascii="Verdana" w:hAnsi="Verdana"/>
@@ -11695,7 +11817,7 @@
         </w:rPr>
         <w:t>Losse noten voor alle partijen</w:t>
       </w:r>
-      <w:bookmarkEnd w:id="20"/>
+      <w:bookmarkEnd w:id="21"/>
     </w:p>
     <w:p>
       <w:pPr>
@@ -11837,7 +11959,7 @@
           <w:iCs w:val="false"/>
         </w:rPr>
       </w:pPr>
-      <w:bookmarkStart w:id="21" w:name="_Toc31150873"/>
+      <w:bookmarkStart w:id="22" w:name="_Toc31150873"/>
       <w:r>
         <w:rPr>
           <w:rFonts w:ascii="Verdana" w:hAnsi="Verdana"/>
@@ -11846,7 +11968,7 @@
         </w:rPr>
         <w:t>Losse partijen</w:t>
       </w:r>
-      <w:bookmarkEnd w:id="21"/>
+      <w:bookmarkEnd w:id="22"/>
     </w:p>
     <w:p>
       <w:pPr>
@@ -11937,7 +12059,7 @@
           <w:iCs w:val="false"/>
         </w:rPr>
       </w:pPr>
-      <w:bookmarkStart w:id="22" w:name="_Toc31150874"/>
+      <w:bookmarkStart w:id="23" w:name="_Toc31150874"/>
       <w:r>
         <w:rPr>
           <w:rFonts w:ascii="Verdana" w:hAnsi="Verdana"/>
@@ -11946,7 +12068,7 @@
         </w:rPr>
         <w:t>Losse noten voor een geselecteerde partij</w:t>
       </w:r>
-      <w:bookmarkEnd w:id="22"/>
+      <w:bookmarkEnd w:id="23"/>
     </w:p>
     <w:p>
       <w:pPr>
@@ -12099,14 +12221,14 @@
           <w:rFonts w:ascii="Verdana" w:hAnsi="Verdana"/>
         </w:rPr>
       </w:pPr>
-      <w:bookmarkStart w:id="23" w:name="_Toc31150875"/>
+      <w:bookmarkStart w:id="24" w:name="_Toc31150875"/>
       <w:r>
         <w:rPr>
           <w:rFonts w:ascii="Verdana" w:hAnsi="Verdana"/>
         </w:rPr>
         <w:t>Bladmuziek importeren van internet</w:t>
       </w:r>
-      <w:bookmarkEnd w:id="23"/>
+      <w:bookmarkEnd w:id="24"/>
     </w:p>
     <w:p>
       <w:pPr>
@@ -12212,7 +12334,7 @@
       <w:hyperlink r:id="rId7">
         <w:r>
           <w:rPr>
-            <w:rStyle w:val="ListLabel11"/>
+            <w:rStyle w:val="ListLabel7"/>
           </w:rPr>
           <w:t>https://musescore.com/sheetmusic</w:t>
         </w:r>
@@ -12315,14 +12437,14 @@
           <w:rFonts w:ascii="Verdana" w:hAnsi="Verdana"/>
         </w:rPr>
       </w:pPr>
-      <w:bookmarkStart w:id="24" w:name="_Toc31150876"/>
+      <w:bookmarkStart w:id="25" w:name="_Toc31150876"/>
       <w:r>
         <w:rPr>
           <w:rFonts w:ascii="Verdana" w:hAnsi="Verdana"/>
         </w:rPr>
         <w:t>Exporteren als Braillemuziek</w:t>
       </w:r>
-      <w:bookmarkEnd w:id="24"/>
+      <w:bookmarkEnd w:id="25"/>
     </w:p>
     <w:p>
       <w:pPr>
@@ -12466,7 +12588,7 @@
           <w:iCs w:val="false"/>
         </w:rPr>
       </w:pPr>
-      <w:bookmarkStart w:id="25" w:name="_Toc31150877"/>
+      <w:bookmarkStart w:id="26" w:name="_Toc31150877"/>
       <w:r>
         <w:rPr>
           <w:rFonts w:ascii="Verdana" w:hAnsi="Verdana"/>
@@ -12475,7 +12597,7 @@
         </w:rPr>
         <w:t>Braille muziek Music export concepten</w:t>
       </w:r>
-      <w:bookmarkEnd w:id="25"/>
+      <w:bookmarkEnd w:id="26"/>
     </w:p>
     <w:p>
       <w:pPr>
@@ -12503,7 +12625,7 @@
           <w:szCs w:val="28"/>
         </w:rPr>
       </w:pPr>
-      <w:bookmarkStart w:id="26" w:name="_Toc31150878"/>
+      <w:bookmarkStart w:id="27" w:name="_Toc31150878"/>
       <w:r>
         <w:rPr>
           <w:rFonts w:ascii="Verdana" w:hAnsi="Verdana"/>
@@ -12512,7 +12634,7 @@
         </w:rPr>
         <w:t>Layout</w:t>
       </w:r>
-      <w:bookmarkEnd w:id="26"/>
+      <w:bookmarkEnd w:id="27"/>
     </w:p>
     <w:p>
       <w:pPr>
@@ -12548,14 +12670,14 @@
         <w:tblLook w:firstRow="1" w:noVBand="1" w:lastRow="0" w:firstColumn="1" w:lastColumn="0" w:noHBand="0" w:val="04a0"/>
       </w:tblPr>
       <w:tblGrid>
-        <w:gridCol w:w="3463"/>
-        <w:gridCol w:w="5562"/>
+        <w:gridCol w:w="3462"/>
+        <w:gridCol w:w="5563"/>
       </w:tblGrid>
       <w:tr>
         <w:trPr/>
         <w:tc>
           <w:tcPr>
-            <w:tcW w:w="3463" w:type="dxa"/>
+            <w:tcW w:w="3462" w:type="dxa"/>
             <w:tcBorders>
               <w:top w:val="single" w:sz="4" w:space="0" w:color="000000"/>
               <w:left w:val="single" w:sz="4" w:space="0" w:color="000000"/>
@@ -12610,7 +12732,7 @@
         </w:tc>
         <w:tc>
           <w:tcPr>
-            <w:tcW w:w="5562" w:type="dxa"/>
+            <w:tcW w:w="5563" w:type="dxa"/>
             <w:tcBorders>
               <w:top w:val="single" w:sz="4" w:space="0" w:color="000000"/>
               <w:left w:val="single" w:sz="4" w:space="0" w:color="000000"/>
@@ -12641,7 +12763,7 @@
         <w:trPr/>
         <w:tc>
           <w:tcPr>
-            <w:tcW w:w="3463" w:type="dxa"/>
+            <w:tcW w:w="3462" w:type="dxa"/>
             <w:tcBorders>
               <w:left w:val="single" w:sz="4" w:space="0" w:color="000000"/>
               <w:bottom w:val="single" w:sz="4" w:space="0" w:color="000000"/>
@@ -12674,7 +12796,7 @@
         </w:tc>
         <w:tc>
           <w:tcPr>
-            <w:tcW w:w="5562" w:type="dxa"/>
+            <w:tcW w:w="5563" w:type="dxa"/>
             <w:tcBorders>
               <w:left w:val="single" w:sz="4" w:space="0" w:color="000000"/>
               <w:bottom w:val="single" w:sz="4" w:space="0" w:color="000000"/>
@@ -12741,7 +12863,7 @@
           <w:szCs w:val="28"/>
         </w:rPr>
       </w:pPr>
-      <w:bookmarkStart w:id="27" w:name="_Toc31150879"/>
+      <w:bookmarkStart w:id="28" w:name="_Toc31150879"/>
       <w:r>
         <w:rPr>
           <w:rFonts w:ascii="Verdana" w:hAnsi="Verdana"/>
@@ -12750,7 +12872,7 @@
         </w:rPr>
         <w:t>Bestandsformaat</w:t>
       </w:r>
-      <w:bookmarkEnd w:id="27"/>
+      <w:bookmarkEnd w:id="28"/>
     </w:p>
     <w:p>
       <w:pPr>
@@ -12819,7 +12941,7 @@
           <w:szCs w:val="28"/>
         </w:rPr>
       </w:pPr>
-      <w:bookmarkStart w:id="28" w:name="_Toc31150880"/>
+      <w:bookmarkStart w:id="29" w:name="_Toc31150880"/>
       <w:r>
         <w:rPr>
           <w:rFonts w:ascii="Verdana" w:hAnsi="Verdana"/>
@@ -12828,7 +12950,7 @@
         </w:rPr>
         <w:t>Braille apparaat type</w:t>
       </w:r>
-      <w:bookmarkEnd w:id="28"/>
+      <w:bookmarkEnd w:id="29"/>
     </w:p>
     <w:p>
       <w:pPr>
@@ -12855,7 +12977,7 @@
           <w:szCs w:val="28"/>
         </w:rPr>
       </w:pPr>
-      <w:bookmarkStart w:id="29" w:name="_Toc31150881"/>
+      <w:bookmarkStart w:id="30" w:name="_Toc31150881"/>
       <w:r>
         <w:rPr>
           <w:rFonts w:ascii="Verdana" w:hAnsi="Verdana"/>
@@ -12864,7 +12986,7 @@
         </w:rPr>
         <w:t>Fysieke dimensies</w:t>
       </w:r>
-      <w:bookmarkEnd w:id="29"/>
+      <w:bookmarkEnd w:id="30"/>
     </w:p>
     <w:p>
       <w:pPr>
@@ -12904,7 +13026,7 @@
           <w:szCs w:val="32"/>
         </w:rPr>
       </w:pPr>
-      <w:bookmarkStart w:id="30" w:name="_Toc31150882"/>
+      <w:bookmarkStart w:id="31" w:name="_Toc31150882"/>
       <w:r>
         <w:rPr>
           <w:rFonts w:ascii="Verdana" w:hAnsi="Verdana"/>
@@ -12913,7 +13035,7 @@
         </w:rPr>
         <w:t>Profielen</w:t>
       </w:r>
-      <w:bookmarkEnd w:id="30"/>
+      <w:bookmarkEnd w:id="31"/>
     </w:p>
     <w:p>
       <w:pPr>
@@ -12979,14 +13101,14 @@
         <w:tblLook w:firstRow="1" w:noVBand="1" w:lastRow="0" w:firstColumn="1" w:lastColumn="0" w:noHBand="0" w:val="04a0"/>
       </w:tblPr>
       <w:tblGrid>
-        <w:gridCol w:w="2607"/>
-        <w:gridCol w:w="6418"/>
+        <w:gridCol w:w="2606"/>
+        <w:gridCol w:w="6419"/>
       </w:tblGrid>
       <w:tr>
         <w:trPr/>
         <w:tc>
           <w:tcPr>
-            <w:tcW w:w="2607" w:type="dxa"/>
+            <w:tcW w:w="2606" w:type="dxa"/>
             <w:tcBorders>
               <w:top w:val="single" w:sz="4" w:space="0" w:color="000000"/>
               <w:left w:val="single" w:sz="4" w:space="0" w:color="000000"/>
@@ -13013,7 +13135,7 @@
         </w:tc>
         <w:tc>
           <w:tcPr>
-            <w:tcW w:w="6418" w:type="dxa"/>
+            <w:tcW w:w="6419" w:type="dxa"/>
             <w:tcBorders>
               <w:top w:val="single" w:sz="4" w:space="0" w:color="000000"/>
               <w:left w:val="single" w:sz="4" w:space="0" w:color="000000"/>
@@ -13044,7 +13166,7 @@
         <w:trPr/>
         <w:tc>
           <w:tcPr>
-            <w:tcW w:w="2607" w:type="dxa"/>
+            <w:tcW w:w="2606" w:type="dxa"/>
             <w:tcBorders>
               <w:left w:val="single" w:sz="4" w:space="0" w:color="000000"/>
               <w:bottom w:val="single" w:sz="4" w:space="0" w:color="000000"/>
@@ -13070,7 +13192,7 @@
         </w:tc>
         <w:tc>
           <w:tcPr>
-            <w:tcW w:w="6418" w:type="dxa"/>
+            <w:tcW w:w="6419" w:type="dxa"/>
             <w:tcBorders>
               <w:left w:val="single" w:sz="4" w:space="0" w:color="000000"/>
               <w:bottom w:val="single" w:sz="4" w:space="0" w:color="000000"/>
@@ -13100,7 +13222,7 @@
         <w:trPr/>
         <w:tc>
           <w:tcPr>
-            <w:tcW w:w="2607" w:type="dxa"/>
+            <w:tcW w:w="2606" w:type="dxa"/>
             <w:tcBorders>
               <w:left w:val="single" w:sz="4" w:space="0" w:color="000000"/>
               <w:bottom w:val="single" w:sz="4" w:space="0" w:color="000000"/>
@@ -13126,7 +13248,7 @@
         </w:tc>
         <w:tc>
           <w:tcPr>
-            <w:tcW w:w="6418" w:type="dxa"/>
+            <w:tcW w:w="6419" w:type="dxa"/>
             <w:tcBorders>
               <w:left w:val="single" w:sz="4" w:space="0" w:color="000000"/>
               <w:bottom w:val="single" w:sz="4" w:space="0" w:color="000000"/>
@@ -13240,7 +13362,7 @@
           <w:szCs w:val="32"/>
         </w:rPr>
       </w:pPr>
-      <w:bookmarkStart w:id="31" w:name="_Toc31150883"/>
+      <w:bookmarkStart w:id="32" w:name="_Toc31150883"/>
       <w:r>
         <w:rPr>
           <w:rFonts w:ascii="Verdana" w:hAnsi="Verdana"/>
@@ -13251,7 +13373,7 @@
         </w:rPr>
         <w:t>IBOS Xml Muzieklezer layout</w:t>
       </w:r>
-      <w:bookmarkEnd w:id="31"/>
+      <w:bookmarkEnd w:id="32"/>
     </w:p>
     <w:p>
       <w:pPr>
@@ -13323,7 +13445,7 @@
           <w:szCs w:val="32"/>
         </w:rPr>
       </w:pPr>
-      <w:bookmarkStart w:id="32" w:name="_Toc31150884"/>
+      <w:bookmarkStart w:id="33" w:name="_Toc31150884"/>
       <w:r>
         <w:rPr>
           <w:rFonts w:ascii="Verdana" w:hAnsi="Verdana"/>
@@ -13334,7 +13456,7 @@
         </w:rPr>
         <w:t>BANA 2015 Layout</w:t>
       </w:r>
-      <w:bookmarkEnd w:id="32"/>
+      <w:bookmarkEnd w:id="33"/>
     </w:p>
     <w:p>
       <w:pPr>
@@ -13664,7 +13786,7 @@
           <w:iCs w:val="false"/>
         </w:rPr>
       </w:pPr>
-      <w:bookmarkStart w:id="33" w:name="_Toc31150885"/>
+      <w:bookmarkStart w:id="34" w:name="_Toc31150885"/>
       <w:r>
         <w:rPr>
           <w:rFonts w:ascii="Verdana" w:hAnsi="Verdana"/>
@@ -13673,7 +13795,7 @@
         </w:rPr>
         <w:t>Afdrukken van braille muziekbestanden op een brailleprinter</w:t>
       </w:r>
-      <w:bookmarkEnd w:id="33"/>
+      <w:bookmarkEnd w:id="34"/>
     </w:p>
     <w:p>
       <w:pPr>
@@ -13722,14 +13844,14 @@
         <w:tblLook w:firstRow="1" w:noVBand="1" w:lastRow="0" w:firstColumn="1" w:lastColumn="0" w:noHBand="0" w:val="04a0"/>
       </w:tblPr>
       <w:tblGrid>
-        <w:gridCol w:w="1752"/>
-        <w:gridCol w:w="7273"/>
+        <w:gridCol w:w="1751"/>
+        <w:gridCol w:w="7274"/>
       </w:tblGrid>
       <w:tr>
         <w:trPr/>
         <w:tc>
           <w:tcPr>
-            <w:tcW w:w="1752" w:type="dxa"/>
+            <w:tcW w:w="1751" w:type="dxa"/>
             <w:tcBorders>
               <w:top w:val="single" w:sz="4" w:space="0" w:color="000000"/>
               <w:left w:val="single" w:sz="4" w:space="0" w:color="000000"/>
@@ -13756,7 +13878,7 @@
         </w:tc>
         <w:tc>
           <w:tcPr>
-            <w:tcW w:w="7273" w:type="dxa"/>
+            <w:tcW w:w="7274" w:type="dxa"/>
             <w:tcBorders>
               <w:top w:val="single" w:sz="4" w:space="0" w:color="000000"/>
               <w:left w:val="single" w:sz="4" w:space="0" w:color="000000"/>
@@ -13819,7 +13941,7 @@
         <w:trPr/>
         <w:tc>
           <w:tcPr>
-            <w:tcW w:w="1752" w:type="dxa"/>
+            <w:tcW w:w="1751" w:type="dxa"/>
             <w:tcBorders>
               <w:left w:val="single" w:sz="4" w:space="0" w:color="000000"/>
               <w:bottom w:val="single" w:sz="4" w:space="0" w:color="000000"/>
@@ -13845,7 +13967,7 @@
         </w:tc>
         <w:tc>
           <w:tcPr>
-            <w:tcW w:w="7273" w:type="dxa"/>
+            <w:tcW w:w="7274" w:type="dxa"/>
             <w:tcBorders>
               <w:left w:val="single" w:sz="4" w:space="0" w:color="000000"/>
               <w:bottom w:val="single" w:sz="4" w:space="0" w:color="000000"/>
@@ -13947,7 +14069,7 @@
           <w:iCs w:val="false"/>
         </w:rPr>
       </w:pPr>
-      <w:bookmarkStart w:id="34" w:name="_Toc31150886"/>
+      <w:bookmarkStart w:id="35" w:name="_Toc31150886"/>
       <w:r>
         <w:rPr>
           <w:rFonts w:ascii="Verdana" w:hAnsi="Verdana"/>
@@ -13956,7 +14078,7 @@
         </w:rPr>
         <w:t>Kopieren van braille muziekbestanden naar een notetaker apparaat</w:t>
       </w:r>
-      <w:bookmarkEnd w:id="34"/>
+      <w:bookmarkEnd w:id="35"/>
     </w:p>
     <w:p>
       <w:pPr>
@@ -14055,14 +14177,14 @@
           <w:rFonts w:ascii="Verdana" w:hAnsi="Verdana"/>
         </w:rPr>
       </w:pPr>
-      <w:bookmarkStart w:id="35" w:name="_Toc31150887"/>
+      <w:bookmarkStart w:id="36" w:name="_Toc31150887"/>
       <w:r>
         <w:rPr>
           <w:rFonts w:ascii="Verdana" w:hAnsi="Verdana"/>
         </w:rPr>
         <w:t>Sneltoetsen</w:t>
       </w:r>
-      <w:bookmarkEnd w:id="35"/>
+      <w:bookmarkEnd w:id="36"/>
     </w:p>
     <w:p>
       <w:pPr>
@@ -14545,8 +14667,8 @@
               </w:rPr>
               <w:t>Ga</w:t>
             </w:r>
-            <w:bookmarkStart w:id="36" w:name="_GoBack"/>
-            <w:bookmarkEnd w:id="36"/>
+            <w:bookmarkStart w:id="37" w:name="_GoBack"/>
+            <w:bookmarkEnd w:id="37"/>
             <w:r>
               <w:rPr>
                 <w:rFonts w:cs="Verdana" w:ascii="Verdana" w:hAnsi="Verdana"/>
@@ -14688,7 +14810,7 @@
       <w:tblPr>
         <w:tblW w:w="8955" w:type="dxa"/>
         <w:jc w:val="left"/>
-        <w:tblInd w:w="15" w:type="dxa"/>
+        <w:tblInd w:w="14" w:type="dxa"/>
         <w:tblCellMar>
           <w:top w:w="0" w:type="dxa"/>
           <w:left w:w="108" w:type="dxa"/>
@@ -15069,14 +15191,14 @@
         <w:tblLook w:firstRow="1" w:noVBand="1" w:lastRow="0" w:firstColumn="1" w:lastColumn="0" w:noHBand="0" w:val="04a0"/>
       </w:tblPr>
       <w:tblGrid>
-        <w:gridCol w:w="3058"/>
-        <w:gridCol w:w="6586"/>
+        <w:gridCol w:w="3057"/>
+        <w:gridCol w:w="6587"/>
       </w:tblGrid>
       <w:tr>
         <w:trPr/>
         <w:tc>
           <w:tcPr>
-            <w:tcW w:w="3058" w:type="dxa"/>
+            <w:tcW w:w="3057" w:type="dxa"/>
             <w:tcBorders/>
             <w:shd w:color="auto" w:fill="auto" w:val="clear"/>
           </w:tcPr>
@@ -15101,7 +15223,7 @@
         </w:tc>
         <w:tc>
           <w:tcPr>
-            <w:tcW w:w="6586" w:type="dxa"/>
+            <w:tcW w:w="6587" w:type="dxa"/>
             <w:tcBorders/>
             <w:shd w:color="auto" w:fill="auto" w:val="clear"/>
           </w:tcPr>
@@ -15127,7 +15249,7 @@
         <w:trPr/>
         <w:tc>
           <w:tcPr>
-            <w:tcW w:w="3058" w:type="dxa"/>
+            <w:tcW w:w="3057" w:type="dxa"/>
             <w:tcBorders/>
             <w:shd w:color="auto" w:fill="auto" w:val="clear"/>
           </w:tcPr>
@@ -15150,7 +15272,7 @@
         </w:tc>
         <w:tc>
           <w:tcPr>
-            <w:tcW w:w="6586" w:type="dxa"/>
+            <w:tcW w:w="6587" w:type="dxa"/>
             <w:tcBorders/>
             <w:shd w:color="auto" w:fill="auto" w:val="clear"/>
           </w:tcPr>
@@ -15178,7 +15300,7 @@
         <w:trPr/>
         <w:tc>
           <w:tcPr>
-            <w:tcW w:w="3058" w:type="dxa"/>
+            <w:tcW w:w="3057" w:type="dxa"/>
             <w:tcBorders/>
             <w:shd w:color="auto" w:fill="auto" w:val="clear"/>
           </w:tcPr>
@@ -15202,7 +15324,7 @@
         </w:tc>
         <w:tc>
           <w:tcPr>
-            <w:tcW w:w="6586" w:type="dxa"/>
+            <w:tcW w:w="6587" w:type="dxa"/>
             <w:tcBorders/>
             <w:shd w:color="auto" w:fill="auto" w:val="clear"/>
           </w:tcPr>
@@ -15229,7 +15351,7 @@
         <w:trPr/>
         <w:tc>
           <w:tcPr>
-            <w:tcW w:w="3058" w:type="dxa"/>
+            <w:tcW w:w="3057" w:type="dxa"/>
             <w:tcBorders/>
             <w:shd w:color="auto" w:fill="auto" w:val="clear"/>
           </w:tcPr>
@@ -15253,7 +15375,7 @@
         </w:tc>
         <w:tc>
           <w:tcPr>
-            <w:tcW w:w="6586" w:type="dxa"/>
+            <w:tcW w:w="6587" w:type="dxa"/>
             <w:tcBorders/>
             <w:shd w:color="auto" w:fill="auto" w:val="clear"/>
           </w:tcPr>
@@ -15281,7 +15403,7 @@
         <w:trPr/>
         <w:tc>
           <w:tcPr>
-            <w:tcW w:w="3058" w:type="dxa"/>
+            <w:tcW w:w="3057" w:type="dxa"/>
             <w:tcBorders/>
             <w:shd w:color="auto" w:fill="auto" w:val="clear"/>
           </w:tcPr>
@@ -15306,7 +15428,7 @@
         </w:tc>
         <w:tc>
           <w:tcPr>
-            <w:tcW w:w="6586" w:type="dxa"/>
+            <w:tcW w:w="6587" w:type="dxa"/>
             <w:tcBorders/>
             <w:shd w:color="auto" w:fill="auto" w:val="clear"/>
           </w:tcPr>
@@ -15334,7 +15456,7 @@
         <w:trPr/>
         <w:tc>
           <w:tcPr>
-            <w:tcW w:w="3058" w:type="dxa"/>
+            <w:tcW w:w="3057" w:type="dxa"/>
             <w:tcBorders/>
             <w:shd w:color="auto" w:fill="auto" w:val="clear"/>
           </w:tcPr>
@@ -15355,7 +15477,7 @@
         </w:tc>
         <w:tc>
           <w:tcPr>
-            <w:tcW w:w="6586" w:type="dxa"/>
+            <w:tcW w:w="6587" w:type="dxa"/>
             <w:tcBorders/>
             <w:shd w:color="auto" w:fill="auto" w:val="clear"/>
           </w:tcPr>
@@ -15381,7 +15503,7 @@
         <w:trPr/>
         <w:tc>
           <w:tcPr>
-            <w:tcW w:w="3058" w:type="dxa"/>
+            <w:tcW w:w="3057" w:type="dxa"/>
             <w:tcBorders/>
             <w:shd w:color="auto" w:fill="auto" w:val="clear"/>
           </w:tcPr>
@@ -15406,7 +15528,7 @@
         </w:tc>
         <w:tc>
           <w:tcPr>
-            <w:tcW w:w="6586" w:type="dxa"/>
+            <w:tcW w:w="6587" w:type="dxa"/>
             <w:tcBorders/>
             <w:shd w:color="auto" w:fill="auto" w:val="clear"/>
           </w:tcPr>
@@ -15429,7 +15551,7 @@
         <w:trPr/>
         <w:tc>
           <w:tcPr>
-            <w:tcW w:w="3058" w:type="dxa"/>
+            <w:tcW w:w="3057" w:type="dxa"/>
             <w:tcBorders/>
             <w:shd w:color="auto" w:fill="auto" w:val="clear"/>
           </w:tcPr>
@@ -15452,7 +15574,7 @@
         </w:tc>
         <w:tc>
           <w:tcPr>
-            <w:tcW w:w="6586" w:type="dxa"/>
+            <w:tcW w:w="6587" w:type="dxa"/>
             <w:tcBorders/>
             <w:shd w:color="auto" w:fill="auto" w:val="clear"/>
           </w:tcPr>
@@ -15475,7 +15597,7 @@
         <w:trPr/>
         <w:tc>
           <w:tcPr>
-            <w:tcW w:w="3058" w:type="dxa"/>
+            <w:tcW w:w="3057" w:type="dxa"/>
             <w:tcBorders/>
             <w:shd w:color="auto" w:fill="auto" w:val="clear"/>
           </w:tcPr>
@@ -15495,7 +15617,7 @@
         </w:tc>
         <w:tc>
           <w:tcPr>
-            <w:tcW w:w="6586" w:type="dxa"/>
+            <w:tcW w:w="6587" w:type="dxa"/>
             <w:tcBorders/>
             <w:shd w:color="auto" w:fill="auto" w:val="clear"/>
           </w:tcPr>
@@ -15518,7 +15640,7 @@
         <w:trPr/>
         <w:tc>
           <w:tcPr>
-            <w:tcW w:w="3058" w:type="dxa"/>
+            <w:tcW w:w="3057" w:type="dxa"/>
             <w:tcBorders/>
             <w:shd w:color="auto" w:fill="auto" w:val="clear"/>
           </w:tcPr>
@@ -15541,7 +15663,7 @@
         </w:tc>
         <w:tc>
           <w:tcPr>
-            <w:tcW w:w="6586" w:type="dxa"/>
+            <w:tcW w:w="6587" w:type="dxa"/>
             <w:tcBorders/>
             <w:shd w:color="auto" w:fill="auto" w:val="clear"/>
           </w:tcPr>
@@ -15567,7 +15689,7 @@
         <w:trPr/>
         <w:tc>
           <w:tcPr>
-            <w:tcW w:w="3058" w:type="dxa"/>
+            <w:tcW w:w="3057" w:type="dxa"/>
             <w:tcBorders/>
             <w:shd w:color="auto" w:fill="auto" w:val="clear"/>
           </w:tcPr>
@@ -15590,7 +15712,7 @@
         </w:tc>
         <w:tc>
           <w:tcPr>
-            <w:tcW w:w="6586" w:type="dxa"/>
+            <w:tcW w:w="6587" w:type="dxa"/>
             <w:tcBorders/>
             <w:shd w:color="auto" w:fill="auto" w:val="clear"/>
           </w:tcPr>
@@ -15616,7 +15738,7 @@
         <w:trPr/>
         <w:tc>
           <w:tcPr>
-            <w:tcW w:w="3058" w:type="dxa"/>
+            <w:tcW w:w="3057" w:type="dxa"/>
             <w:tcBorders/>
             <w:shd w:color="auto" w:fill="auto" w:val="clear"/>
           </w:tcPr>
@@ -15639,7 +15761,7 @@
         </w:tc>
         <w:tc>
           <w:tcPr>
-            <w:tcW w:w="6586" w:type="dxa"/>
+            <w:tcW w:w="6587" w:type="dxa"/>
             <w:tcBorders/>
             <w:shd w:color="auto" w:fill="auto" w:val="clear"/>
           </w:tcPr>
@@ -15665,7 +15787,7 @@
         <w:trPr/>
         <w:tc>
           <w:tcPr>
-            <w:tcW w:w="3058" w:type="dxa"/>
+            <w:tcW w:w="3057" w:type="dxa"/>
             <w:tcBorders/>
             <w:shd w:color="auto" w:fill="auto" w:val="clear"/>
           </w:tcPr>
@@ -15688,7 +15810,7 @@
         </w:tc>
         <w:tc>
           <w:tcPr>
-            <w:tcW w:w="6586" w:type="dxa"/>
+            <w:tcW w:w="6587" w:type="dxa"/>
             <w:tcBorders/>
             <w:shd w:color="auto" w:fill="auto" w:val="clear"/>
           </w:tcPr>
@@ -15714,7 +15836,7 @@
         <w:trPr/>
         <w:tc>
           <w:tcPr>
-            <w:tcW w:w="3058" w:type="dxa"/>
+            <w:tcW w:w="3057" w:type="dxa"/>
             <w:tcBorders/>
             <w:shd w:color="auto" w:fill="auto" w:val="clear"/>
           </w:tcPr>
@@ -15737,7 +15859,7 @@
         </w:tc>
         <w:tc>
           <w:tcPr>
-            <w:tcW w:w="6586" w:type="dxa"/>
+            <w:tcW w:w="6587" w:type="dxa"/>
             <w:tcBorders/>
             <w:shd w:color="auto" w:fill="auto" w:val="clear"/>
           </w:tcPr>
@@ -15765,7 +15887,7 @@
         <w:trPr/>
         <w:tc>
           <w:tcPr>
-            <w:tcW w:w="3058" w:type="dxa"/>
+            <w:tcW w:w="3057" w:type="dxa"/>
             <w:tcBorders/>
             <w:shd w:color="auto" w:fill="auto" w:val="clear"/>
           </w:tcPr>
@@ -15788,7 +15910,7 @@
         </w:tc>
         <w:tc>
           <w:tcPr>
-            <w:tcW w:w="6586" w:type="dxa"/>
+            <w:tcW w:w="6587" w:type="dxa"/>
             <w:tcBorders/>
             <w:shd w:color="auto" w:fill="auto" w:val="clear"/>
           </w:tcPr>
@@ -15811,7 +15933,7 @@
         <w:trPr/>
         <w:tc>
           <w:tcPr>
-            <w:tcW w:w="3058" w:type="dxa"/>
+            <w:tcW w:w="3057" w:type="dxa"/>
             <w:tcBorders/>
             <w:shd w:color="auto" w:fill="auto" w:val="clear"/>
           </w:tcPr>
@@ -15834,7 +15956,7 @@
         </w:tc>
         <w:tc>
           <w:tcPr>
-            <w:tcW w:w="6586" w:type="dxa"/>
+            <w:tcW w:w="6587" w:type="dxa"/>
             <w:tcBorders/>
             <w:shd w:color="auto" w:fill="auto" w:val="clear"/>
           </w:tcPr>
@@ -15857,7 +15979,7 @@
         <w:trPr/>
         <w:tc>
           <w:tcPr>
-            <w:tcW w:w="3058" w:type="dxa"/>
+            <w:tcW w:w="3057" w:type="dxa"/>
             <w:tcBorders/>
             <w:shd w:color="auto" w:fill="auto" w:val="clear"/>
           </w:tcPr>
@@ -15882,7 +16004,7 @@
         </w:tc>
         <w:tc>
           <w:tcPr>
-            <w:tcW w:w="6586" w:type="dxa"/>
+            <w:tcW w:w="6587" w:type="dxa"/>
             <w:tcBorders/>
             <w:shd w:color="auto" w:fill="auto" w:val="clear"/>
           </w:tcPr>
@@ -15905,7 +16027,7 @@
         <w:trPr/>
         <w:tc>
           <w:tcPr>
-            <w:tcW w:w="3058" w:type="dxa"/>
+            <w:tcW w:w="3057" w:type="dxa"/>
             <w:tcBorders/>
             <w:shd w:color="auto" w:fill="auto" w:val="clear"/>
           </w:tcPr>
@@ -15928,7 +16050,7 @@
         </w:tc>
         <w:tc>
           <w:tcPr>
-            <w:tcW w:w="6586" w:type="dxa"/>
+            <w:tcW w:w="6587" w:type="dxa"/>
             <w:tcBorders/>
             <w:shd w:color="auto" w:fill="auto" w:val="clear"/>
           </w:tcPr>
@@ -15951,7 +16073,7 @@
         <w:trPr/>
         <w:tc>
           <w:tcPr>
-            <w:tcW w:w="3058" w:type="dxa"/>
+            <w:tcW w:w="3057" w:type="dxa"/>
             <w:tcBorders/>
             <w:shd w:color="auto" w:fill="auto" w:val="clear"/>
           </w:tcPr>
@@ -15974,7 +16096,7 @@
         </w:tc>
         <w:tc>
           <w:tcPr>
-            <w:tcW w:w="6586" w:type="dxa"/>
+            <w:tcW w:w="6587" w:type="dxa"/>
             <w:tcBorders/>
             <w:shd w:color="auto" w:fill="auto" w:val="clear"/>
           </w:tcPr>
@@ -16000,7 +16122,7 @@
         <w:trPr/>
         <w:tc>
           <w:tcPr>
-            <w:tcW w:w="3058" w:type="dxa"/>
+            <w:tcW w:w="3057" w:type="dxa"/>
             <w:tcBorders/>
             <w:shd w:color="auto" w:fill="auto" w:val="clear"/>
           </w:tcPr>
@@ -16023,7 +16145,7 @@
         </w:tc>
         <w:tc>
           <w:tcPr>
-            <w:tcW w:w="6586" w:type="dxa"/>
+            <w:tcW w:w="6587" w:type="dxa"/>
             <w:tcBorders/>
             <w:shd w:color="auto" w:fill="auto" w:val="clear"/>
           </w:tcPr>
@@ -16046,7 +16168,7 @@
         <w:trPr/>
         <w:tc>
           <w:tcPr>
-            <w:tcW w:w="3058" w:type="dxa"/>
+            <w:tcW w:w="3057" w:type="dxa"/>
             <w:tcBorders/>
             <w:shd w:color="auto" w:fill="auto" w:val="clear"/>
           </w:tcPr>
@@ -16069,7 +16191,7 @@
         </w:tc>
         <w:tc>
           <w:tcPr>
-            <w:tcW w:w="6586" w:type="dxa"/>
+            <w:tcW w:w="6587" w:type="dxa"/>
             <w:tcBorders/>
             <w:shd w:color="auto" w:fill="auto" w:val="clear"/>
           </w:tcPr>
@@ -16095,7 +16217,7 @@
         <w:trPr/>
         <w:tc>
           <w:tcPr>
-            <w:tcW w:w="3058" w:type="dxa"/>
+            <w:tcW w:w="3057" w:type="dxa"/>
             <w:tcBorders/>
             <w:shd w:color="auto" w:fill="auto" w:val="clear"/>
           </w:tcPr>
@@ -16120,7 +16242,7 @@
         </w:tc>
         <w:tc>
           <w:tcPr>
-            <w:tcW w:w="6586" w:type="dxa"/>
+            <w:tcW w:w="6587" w:type="dxa"/>
             <w:tcBorders/>
             <w:shd w:color="auto" w:fill="auto" w:val="clear"/>
           </w:tcPr>
@@ -16144,7 +16266,7 @@
         <w:trPr/>
         <w:tc>
           <w:tcPr>
-            <w:tcW w:w="3058" w:type="dxa"/>
+            <w:tcW w:w="3057" w:type="dxa"/>
             <w:tcBorders/>
             <w:shd w:color="auto" w:fill="auto" w:val="clear"/>
           </w:tcPr>
@@ -16169,7 +16291,7 @@
         </w:tc>
         <w:tc>
           <w:tcPr>
-            <w:tcW w:w="6586" w:type="dxa"/>
+            <w:tcW w:w="6587" w:type="dxa"/>
             <w:tcBorders/>
             <w:shd w:color="auto" w:fill="auto" w:val="clear"/>
           </w:tcPr>
@@ -16251,14 +16373,14 @@
         <w:tblLook w:firstRow="1" w:noVBand="1" w:lastRow="0" w:firstColumn="1" w:lastColumn="0" w:noHBand="0" w:val="04a0"/>
       </w:tblPr>
       <w:tblGrid>
-        <w:gridCol w:w="2156"/>
-        <w:gridCol w:w="6798"/>
+        <w:gridCol w:w="2155"/>
+        <w:gridCol w:w="6799"/>
       </w:tblGrid>
       <w:tr>
         <w:trPr/>
         <w:tc>
           <w:tcPr>
-            <w:tcW w:w="2156" w:type="dxa"/>
+            <w:tcW w:w="2155" w:type="dxa"/>
             <w:tcBorders/>
             <w:shd w:color="auto" w:fill="auto" w:val="clear"/>
           </w:tcPr>
@@ -16283,7 +16405,7 @@
         </w:tc>
         <w:tc>
           <w:tcPr>
-            <w:tcW w:w="6798" w:type="dxa"/>
+            <w:tcW w:w="6799" w:type="dxa"/>
             <w:tcBorders/>
             <w:shd w:color="auto" w:fill="auto" w:val="clear"/>
           </w:tcPr>
@@ -16309,7 +16431,7 @@
         <w:trPr/>
         <w:tc>
           <w:tcPr>
-            <w:tcW w:w="2156" w:type="dxa"/>
+            <w:tcW w:w="2155" w:type="dxa"/>
             <w:tcBorders/>
             <w:shd w:color="auto" w:fill="auto" w:val="clear"/>
           </w:tcPr>
@@ -16330,7 +16452,7 @@
         </w:tc>
         <w:tc>
           <w:tcPr>
-            <w:tcW w:w="6798" w:type="dxa"/>
+            <w:tcW w:w="6799" w:type="dxa"/>
             <w:tcBorders/>
             <w:shd w:color="auto" w:fill="auto" w:val="clear"/>
           </w:tcPr>
@@ -16354,7 +16476,7 @@
         <w:trPr/>
         <w:tc>
           <w:tcPr>
-            <w:tcW w:w="2156" w:type="dxa"/>
+            <w:tcW w:w="2155" w:type="dxa"/>
             <w:tcBorders/>
             <w:shd w:color="auto" w:fill="auto" w:val="clear"/>
           </w:tcPr>
@@ -16377,7 +16499,7 @@
         </w:tc>
         <w:tc>
           <w:tcPr>
-            <w:tcW w:w="6798" w:type="dxa"/>
+            <w:tcW w:w="6799" w:type="dxa"/>
             <w:tcBorders/>
             <w:shd w:color="auto" w:fill="auto" w:val="clear"/>
           </w:tcPr>
@@ -16401,7 +16523,7 @@
         <w:trPr/>
         <w:tc>
           <w:tcPr>
-            <w:tcW w:w="2156" w:type="dxa"/>
+            <w:tcW w:w="2155" w:type="dxa"/>
             <w:tcBorders/>
             <w:shd w:color="auto" w:fill="auto" w:val="clear"/>
           </w:tcPr>
@@ -16424,7 +16546,7 @@
         </w:tc>
         <w:tc>
           <w:tcPr>
-            <w:tcW w:w="6798" w:type="dxa"/>
+            <w:tcW w:w="6799" w:type="dxa"/>
             <w:tcBorders/>
             <w:shd w:color="auto" w:fill="auto" w:val="clear"/>
           </w:tcPr>
@@ -16449,7 +16571,7 @@
         <w:trPr/>
         <w:tc>
           <w:tcPr>
-            <w:tcW w:w="2156" w:type="dxa"/>
+            <w:tcW w:w="2155" w:type="dxa"/>
             <w:tcBorders/>
             <w:shd w:color="auto" w:fill="auto" w:val="clear"/>
           </w:tcPr>
@@ -16472,7 +16594,7 @@
         </w:tc>
         <w:tc>
           <w:tcPr>
-            <w:tcW w:w="6798" w:type="dxa"/>
+            <w:tcW w:w="6799" w:type="dxa"/>
             <w:tcBorders/>
             <w:shd w:color="auto" w:fill="auto" w:val="clear"/>
           </w:tcPr>
@@ -16496,7 +16618,7 @@
         <w:trPr/>
         <w:tc>
           <w:tcPr>
-            <w:tcW w:w="2156" w:type="dxa"/>
+            <w:tcW w:w="2155" w:type="dxa"/>
             <w:tcBorders/>
             <w:shd w:color="auto" w:fill="auto" w:val="clear"/>
           </w:tcPr>
@@ -16519,7 +16641,7 @@
         </w:tc>
         <w:tc>
           <w:tcPr>
-            <w:tcW w:w="6798" w:type="dxa"/>
+            <w:tcW w:w="6799" w:type="dxa"/>
             <w:tcBorders/>
             <w:shd w:color="auto" w:fill="auto" w:val="clear"/>
           </w:tcPr>
@@ -16541,7 +16663,7 @@
         <w:trPr/>
         <w:tc>
           <w:tcPr>
-            <w:tcW w:w="2156" w:type="dxa"/>
+            <w:tcW w:w="2155" w:type="dxa"/>
             <w:tcBorders/>
             <w:shd w:color="auto" w:fill="auto" w:val="clear"/>
           </w:tcPr>
@@ -16562,7 +16684,7 @@
         </w:tc>
         <w:tc>
           <w:tcPr>
-            <w:tcW w:w="6798" w:type="dxa"/>
+            <w:tcW w:w="6799" w:type="dxa"/>
             <w:tcBorders/>
             <w:shd w:color="auto" w:fill="auto" w:val="clear"/>
           </w:tcPr>
@@ -16588,7 +16710,7 @@
         <w:trPr/>
         <w:tc>
           <w:tcPr>
-            <w:tcW w:w="2156" w:type="dxa"/>
+            <w:tcW w:w="2155" w:type="dxa"/>
             <w:tcBorders/>
             <w:shd w:color="auto" w:fill="auto" w:val="clear"/>
           </w:tcPr>
@@ -16609,7 +16731,7 @@
         </w:tc>
         <w:tc>
           <w:tcPr>
-            <w:tcW w:w="6798" w:type="dxa"/>
+            <w:tcW w:w="6799" w:type="dxa"/>
             <w:tcBorders/>
             <w:shd w:color="auto" w:fill="auto" w:val="clear"/>
           </w:tcPr>
@@ -16651,7 +16773,7 @@
         <w:trPr/>
         <w:tc>
           <w:tcPr>
-            <w:tcW w:w="2156" w:type="dxa"/>
+            <w:tcW w:w="2155" w:type="dxa"/>
             <w:tcBorders/>
             <w:shd w:color="auto" w:fill="auto" w:val="clear"/>
           </w:tcPr>
@@ -16674,7 +16796,7 @@
         </w:tc>
         <w:tc>
           <w:tcPr>
-            <w:tcW w:w="6798" w:type="dxa"/>
+            <w:tcW w:w="6799" w:type="dxa"/>
             <w:tcBorders/>
             <w:shd w:color="auto" w:fill="auto" w:val="clear"/>
           </w:tcPr>
@@ -16698,7 +16820,7 @@
         <w:trPr/>
         <w:tc>
           <w:tcPr>
-            <w:tcW w:w="2156" w:type="dxa"/>
+            <w:tcW w:w="2155" w:type="dxa"/>
             <w:tcBorders/>
             <w:shd w:color="auto" w:fill="auto" w:val="clear"/>
           </w:tcPr>
@@ -16721,7 +16843,7 @@
         </w:tc>
         <w:tc>
           <w:tcPr>
-            <w:tcW w:w="6798" w:type="dxa"/>
+            <w:tcW w:w="6799" w:type="dxa"/>
             <w:tcBorders/>
             <w:shd w:color="auto" w:fill="auto" w:val="clear"/>
           </w:tcPr>
@@ -16743,7 +16865,7 @@
         <w:trPr/>
         <w:tc>
           <w:tcPr>
-            <w:tcW w:w="2156" w:type="dxa"/>
+            <w:tcW w:w="2155" w:type="dxa"/>
             <w:tcBorders/>
             <w:shd w:color="auto" w:fill="auto" w:val="clear"/>
           </w:tcPr>
@@ -16766,7 +16888,7 @@
         </w:tc>
         <w:tc>
           <w:tcPr>
-            <w:tcW w:w="6798" w:type="dxa"/>
+            <w:tcW w:w="6799" w:type="dxa"/>
             <w:tcBorders/>
             <w:shd w:color="auto" w:fill="auto" w:val="clear"/>
           </w:tcPr>
@@ -16811,14 +16933,14 @@
           <w:rFonts w:ascii="Verdana" w:hAnsi="Verdana"/>
         </w:rPr>
       </w:pPr>
-      <w:bookmarkStart w:id="37" w:name="_Toc31150888"/>
+      <w:bookmarkStart w:id="38" w:name="_Toc31150888"/>
       <w:r>
         <w:rPr>
           <w:rFonts w:ascii="Verdana" w:hAnsi="Verdana"/>
         </w:rPr>
         <w:t>Aanpassen aan uw taal op de PC</w:t>
       </w:r>
-      <w:bookmarkEnd w:id="37"/>
+      <w:bookmarkEnd w:id="38"/>
     </w:p>
     <w:p>
       <w:pPr>
@@ -16954,14 +17076,14 @@
           <w:rFonts w:ascii="Verdana" w:hAnsi="Verdana"/>
         </w:rPr>
       </w:pPr>
-      <w:bookmarkStart w:id="38" w:name="_Toc31150889"/>
+      <w:bookmarkStart w:id="39" w:name="_Toc31150889"/>
       <w:r>
         <w:rPr>
           <w:rFonts w:ascii="Verdana" w:hAnsi="Verdana"/>
         </w:rPr>
         <w:t>Perkins toetsenbord</w:t>
       </w:r>
-      <w:bookmarkEnd w:id="38"/>
+      <w:bookmarkEnd w:id="39"/>
     </w:p>
     <w:p>
       <w:pPr>
@@ -17028,14 +17150,14 @@
           <w:rFonts w:ascii="Verdana" w:hAnsi="Verdana"/>
         </w:rPr>
       </w:pPr>
-      <w:bookmarkStart w:id="39" w:name="_Toc31150890"/>
+      <w:bookmarkStart w:id="40" w:name="_Toc31150890"/>
       <w:r>
         <w:rPr>
           <w:rFonts w:ascii="Verdana" w:hAnsi="Verdana"/>
         </w:rPr>
         <w:t>Het optimaliseren van de samenwerking met JAWS</w:t>
       </w:r>
-      <w:bookmarkEnd w:id="39"/>
+      <w:bookmarkEnd w:id="40"/>
     </w:p>
     <w:p>
       <w:pPr>
@@ -17195,7 +17317,7 @@
       <w:rPr>
         <w:rStyle w:val="Sidetal"/>
       </w:rPr>
-      <w:t>6</w:t>
+      <w:t>1</w:t>
     </w:r>
     <w:r>
       <w:rPr>
@@ -18285,7 +18407,7 @@
       <w:kern w:val="0"/>
       <w:sz w:val="22"/>
       <w:szCs w:val="22"/>
-      <w:lang w:val="en-GB" w:bidi="ar-SA" w:eastAsia="zh-CN"/>
+      <w:lang w:val="en-GB" w:eastAsia="zh-CN" w:bidi="ar-SA"/>
     </w:rPr>
   </w:style>
   <w:style w:type="paragraph" w:styleId="Overskrift1">

</xml_diff>

<commit_message>
New change of text
</commit_message>
<xml_diff>
--- a/Documentation/Official Documentation/Gebruikershandleiding voor IBOS XML muzieklezer versie 4.0.0.0.docx
+++ b/Documentation/Official Documentation/Gebruikershandleiding voor IBOS XML muzieklezer versie 4.0.0.0.docx
@@ -2506,14 +2506,14 @@
         <w:tblLook w:firstRow="1" w:noVBand="1" w:lastRow="0" w:firstColumn="1" w:lastColumn="0" w:noHBand="0" w:val="04a0"/>
       </w:tblPr>
       <w:tblGrid>
-        <w:gridCol w:w="1684"/>
-        <w:gridCol w:w="7491"/>
+        <w:gridCol w:w="1683"/>
+        <w:gridCol w:w="7492"/>
       </w:tblGrid>
       <w:tr>
         <w:trPr/>
         <w:tc>
           <w:tcPr>
-            <w:tcW w:w="1684" w:type="dxa"/>
+            <w:tcW w:w="1683" w:type="dxa"/>
             <w:tcBorders>
               <w:top w:val="single" w:sz="4" w:space="0" w:color="000000"/>
               <w:left w:val="single" w:sz="4" w:space="0" w:color="000000"/>
@@ -2544,7 +2544,7 @@
         </w:tc>
         <w:tc>
           <w:tcPr>
-            <w:tcW w:w="7491" w:type="dxa"/>
+            <w:tcW w:w="7492" w:type="dxa"/>
             <w:tcBorders>
               <w:top w:val="single" w:sz="4" w:space="0" w:color="000000"/>
               <w:left w:val="single" w:sz="4" w:space="0" w:color="000000"/>
@@ -2589,7 +2589,7 @@
         <w:trPr/>
         <w:tc>
           <w:tcPr>
-            <w:tcW w:w="1684" w:type="dxa"/>
+            <w:tcW w:w="1683" w:type="dxa"/>
             <w:tcBorders>
               <w:top w:val="single" w:sz="4" w:space="0" w:color="000000"/>
               <w:left w:val="single" w:sz="4" w:space="0" w:color="000000"/>
@@ -2620,7 +2620,7 @@
         </w:tc>
         <w:tc>
           <w:tcPr>
-            <w:tcW w:w="7491" w:type="dxa"/>
+            <w:tcW w:w="7492" w:type="dxa"/>
             <w:tcBorders>
               <w:top w:val="single" w:sz="4" w:space="0" w:color="000000"/>
               <w:left w:val="single" w:sz="4" w:space="0" w:color="000000"/>
@@ -2693,7 +2693,7 @@
         <w:trPr/>
         <w:tc>
           <w:tcPr>
-            <w:tcW w:w="1684" w:type="dxa"/>
+            <w:tcW w:w="1683" w:type="dxa"/>
             <w:tcBorders>
               <w:top w:val="single" w:sz="4" w:space="0" w:color="000000"/>
               <w:left w:val="single" w:sz="4" w:space="0" w:color="000000"/>
@@ -2724,7 +2724,7 @@
         </w:tc>
         <w:tc>
           <w:tcPr>
-            <w:tcW w:w="7491" w:type="dxa"/>
+            <w:tcW w:w="7492" w:type="dxa"/>
             <w:tcBorders>
               <w:top w:val="single" w:sz="4" w:space="0" w:color="000000"/>
               <w:left w:val="single" w:sz="4" w:space="0" w:color="000000"/>
@@ -2755,7 +2755,7 @@
         <w:trPr/>
         <w:tc>
           <w:tcPr>
-            <w:tcW w:w="1684" w:type="dxa"/>
+            <w:tcW w:w="1683" w:type="dxa"/>
             <w:tcBorders>
               <w:top w:val="single" w:sz="4" w:space="0" w:color="000000"/>
               <w:left w:val="single" w:sz="4" w:space="0" w:color="000000"/>
@@ -2786,7 +2786,7 @@
         </w:tc>
         <w:tc>
           <w:tcPr>
-            <w:tcW w:w="7491" w:type="dxa"/>
+            <w:tcW w:w="7492" w:type="dxa"/>
             <w:tcBorders>
               <w:top w:val="single" w:sz="4" w:space="0" w:color="000000"/>
               <w:left w:val="single" w:sz="4" w:space="0" w:color="000000"/>
@@ -2833,7 +2833,7 @@
         <w:trPr/>
         <w:tc>
           <w:tcPr>
-            <w:tcW w:w="1684" w:type="dxa"/>
+            <w:tcW w:w="1683" w:type="dxa"/>
             <w:tcBorders>
               <w:top w:val="single" w:sz="4" w:space="0" w:color="000000"/>
               <w:left w:val="single" w:sz="4" w:space="0" w:color="000000"/>
@@ -2867,7 +2867,7 @@
         </w:tc>
         <w:tc>
           <w:tcPr>
-            <w:tcW w:w="7491" w:type="dxa"/>
+            <w:tcW w:w="7492" w:type="dxa"/>
             <w:tcBorders>
               <w:top w:val="single" w:sz="4" w:space="0" w:color="000000"/>
               <w:left w:val="single" w:sz="4" w:space="0" w:color="000000"/>
@@ -3469,9 +3469,9 @@
         <w:tblLook w:firstRow="1" w:noVBand="1" w:lastRow="0" w:firstColumn="1" w:lastColumn="0" w:noHBand="0" w:val="04a0"/>
       </w:tblPr>
       <w:tblGrid>
-        <w:gridCol w:w="1584"/>
+        <w:gridCol w:w="1583"/>
         <w:gridCol w:w="5220"/>
-        <w:gridCol w:w="2211"/>
+        <w:gridCol w:w="2212"/>
       </w:tblGrid>
       <w:tr>
         <w:trPr>
@@ -3479,7 +3479,7 @@
         </w:trPr>
         <w:tc>
           <w:tcPr>
-            <w:tcW w:w="1584" w:type="dxa"/>
+            <w:tcW w:w="1583" w:type="dxa"/>
             <w:tcBorders>
               <w:top w:val="single" w:sz="2" w:space="0" w:color="000000"/>
               <w:left w:val="single" w:sz="2" w:space="0" w:color="000000"/>
@@ -3549,7 +3549,7 @@
         </w:tc>
         <w:tc>
           <w:tcPr>
-            <w:tcW w:w="2211" w:type="dxa"/>
+            <w:tcW w:w="2212" w:type="dxa"/>
             <w:tcBorders>
               <w:top w:val="single" w:sz="2" w:space="0" w:color="000000"/>
               <w:left w:val="single" w:sz="2" w:space="0" w:color="000000"/>
@@ -3580,7 +3580,7 @@
         <w:trPr/>
         <w:tc>
           <w:tcPr>
-            <w:tcW w:w="1584" w:type="dxa"/>
+            <w:tcW w:w="1583" w:type="dxa"/>
             <w:tcBorders>
               <w:left w:val="single" w:sz="2" w:space="0" w:color="000000"/>
               <w:bottom w:val="single" w:sz="2" w:space="0" w:color="000000"/>
@@ -3629,7 +3629,7 @@
         </w:tc>
         <w:tc>
           <w:tcPr>
-            <w:tcW w:w="2211" w:type="dxa"/>
+            <w:tcW w:w="2212" w:type="dxa"/>
             <w:tcBorders>
               <w:left w:val="single" w:sz="2" w:space="0" w:color="000000"/>
               <w:bottom w:val="single" w:sz="2" w:space="0" w:color="000000"/>
@@ -3656,7 +3656,7 @@
         <w:trPr/>
         <w:tc>
           <w:tcPr>
-            <w:tcW w:w="1584" w:type="dxa"/>
+            <w:tcW w:w="1583" w:type="dxa"/>
             <w:tcBorders>
               <w:left w:val="single" w:sz="2" w:space="0" w:color="000000"/>
               <w:bottom w:val="single" w:sz="2" w:space="0" w:color="000000"/>
@@ -3702,7 +3702,7 @@
         </w:tc>
         <w:tc>
           <w:tcPr>
-            <w:tcW w:w="2211" w:type="dxa"/>
+            <w:tcW w:w="2212" w:type="dxa"/>
             <w:tcBorders>
               <w:left w:val="single" w:sz="2" w:space="0" w:color="000000"/>
               <w:bottom w:val="single" w:sz="2" w:space="0" w:color="000000"/>
@@ -3729,7 +3729,7 @@
         <w:trPr/>
         <w:tc>
           <w:tcPr>
-            <w:tcW w:w="1584" w:type="dxa"/>
+            <w:tcW w:w="1583" w:type="dxa"/>
             <w:tcBorders>
               <w:left w:val="single" w:sz="2" w:space="0" w:color="000000"/>
               <w:bottom w:val="single" w:sz="2" w:space="0" w:color="000000"/>
@@ -3776,7 +3776,7 @@
         </w:tc>
         <w:tc>
           <w:tcPr>
-            <w:tcW w:w="2211" w:type="dxa"/>
+            <w:tcW w:w="2212" w:type="dxa"/>
             <w:tcBorders>
               <w:left w:val="single" w:sz="2" w:space="0" w:color="000000"/>
               <w:bottom w:val="single" w:sz="2" w:space="0" w:color="000000"/>
@@ -3821,7 +3821,7 @@
         <w:trPr/>
         <w:tc>
           <w:tcPr>
-            <w:tcW w:w="1584" w:type="dxa"/>
+            <w:tcW w:w="1583" w:type="dxa"/>
             <w:tcBorders>
               <w:left w:val="single" w:sz="2" w:space="0" w:color="000000"/>
               <w:bottom w:val="single" w:sz="2" w:space="0" w:color="000000"/>
@@ -3870,7 +3870,7 @@
         </w:tc>
         <w:tc>
           <w:tcPr>
-            <w:tcW w:w="2211" w:type="dxa"/>
+            <w:tcW w:w="2212" w:type="dxa"/>
             <w:tcBorders>
               <w:left w:val="single" w:sz="2" w:space="0" w:color="000000"/>
               <w:bottom w:val="single" w:sz="2" w:space="0" w:color="000000"/>
@@ -3900,7 +3900,7 @@
         <w:trPr/>
         <w:tc>
           <w:tcPr>
-            <w:tcW w:w="1584" w:type="dxa"/>
+            <w:tcW w:w="1583" w:type="dxa"/>
             <w:tcBorders>
               <w:left w:val="single" w:sz="2" w:space="0" w:color="000000"/>
               <w:bottom w:val="single" w:sz="2" w:space="0" w:color="000000"/>
@@ -3949,7 +3949,7 @@
         </w:tc>
         <w:tc>
           <w:tcPr>
-            <w:tcW w:w="2211" w:type="dxa"/>
+            <w:tcW w:w="2212" w:type="dxa"/>
             <w:tcBorders>
               <w:left w:val="single" w:sz="2" w:space="0" w:color="000000"/>
               <w:bottom w:val="single" w:sz="2" w:space="0" w:color="000000"/>
@@ -3979,7 +3979,7 @@
         <w:trPr/>
         <w:tc>
           <w:tcPr>
-            <w:tcW w:w="1584" w:type="dxa"/>
+            <w:tcW w:w="1583" w:type="dxa"/>
             <w:tcBorders>
               <w:left w:val="single" w:sz="2" w:space="0" w:color="000000"/>
               <w:bottom w:val="single" w:sz="2" w:space="0" w:color="000000"/>
@@ -4028,7 +4028,7 @@
         </w:tc>
         <w:tc>
           <w:tcPr>
-            <w:tcW w:w="2211" w:type="dxa"/>
+            <w:tcW w:w="2212" w:type="dxa"/>
             <w:tcBorders>
               <w:left w:val="single" w:sz="2" w:space="0" w:color="000000"/>
               <w:bottom w:val="single" w:sz="2" w:space="0" w:color="000000"/>
@@ -4058,7 +4058,7 @@
         <w:trPr/>
         <w:tc>
           <w:tcPr>
-            <w:tcW w:w="1584" w:type="dxa"/>
+            <w:tcW w:w="1583" w:type="dxa"/>
             <w:tcBorders>
               <w:left w:val="single" w:sz="2" w:space="0" w:color="000000"/>
               <w:bottom w:val="single" w:sz="2" w:space="0" w:color="000000"/>
@@ -4104,7 +4104,7 @@
         </w:tc>
         <w:tc>
           <w:tcPr>
-            <w:tcW w:w="2211" w:type="dxa"/>
+            <w:tcW w:w="2212" w:type="dxa"/>
             <w:tcBorders>
               <w:left w:val="single" w:sz="2" w:space="0" w:color="000000"/>
               <w:bottom w:val="single" w:sz="2" w:space="0" w:color="000000"/>
@@ -4134,7 +4134,7 @@
         <w:trPr/>
         <w:tc>
           <w:tcPr>
-            <w:tcW w:w="1584" w:type="dxa"/>
+            <w:tcW w:w="1583" w:type="dxa"/>
             <w:tcBorders>
               <w:left w:val="single" w:sz="2" w:space="0" w:color="000000"/>
               <w:bottom w:val="single" w:sz="2" w:space="0" w:color="000000"/>
@@ -4194,7 +4194,7 @@
         </w:tc>
         <w:tc>
           <w:tcPr>
-            <w:tcW w:w="2211" w:type="dxa"/>
+            <w:tcW w:w="2212" w:type="dxa"/>
             <w:tcBorders>
               <w:left w:val="single" w:sz="2" w:space="0" w:color="000000"/>
               <w:bottom w:val="single" w:sz="2" w:space="0" w:color="000000"/>
@@ -4228,7 +4228,7 @@
         <w:trPr/>
         <w:tc>
           <w:tcPr>
-            <w:tcW w:w="1584" w:type="dxa"/>
+            <w:tcW w:w="1583" w:type="dxa"/>
             <w:tcBorders>
               <w:left w:val="single" w:sz="2" w:space="0" w:color="000000"/>
               <w:bottom w:val="single" w:sz="2" w:space="0" w:color="000000"/>
@@ -4288,7 +4288,7 @@
         </w:tc>
         <w:tc>
           <w:tcPr>
-            <w:tcW w:w="2211" w:type="dxa"/>
+            <w:tcW w:w="2212" w:type="dxa"/>
             <w:tcBorders>
               <w:left w:val="single" w:sz="2" w:space="0" w:color="000000"/>
               <w:bottom w:val="single" w:sz="2" w:space="0" w:color="000000"/>
@@ -4322,7 +4322,7 @@
         <w:trPr/>
         <w:tc>
           <w:tcPr>
-            <w:tcW w:w="1584" w:type="dxa"/>
+            <w:tcW w:w="1583" w:type="dxa"/>
             <w:tcBorders>
               <w:left w:val="single" w:sz="2" w:space="0" w:color="000000"/>
               <w:bottom w:val="single" w:sz="2" w:space="0" w:color="000000"/>
@@ -4382,7 +4382,7 @@
         </w:tc>
         <w:tc>
           <w:tcPr>
-            <w:tcW w:w="2211" w:type="dxa"/>
+            <w:tcW w:w="2212" w:type="dxa"/>
             <w:tcBorders>
               <w:left w:val="single" w:sz="2" w:space="0" w:color="000000"/>
               <w:bottom w:val="single" w:sz="2" w:space="0" w:color="000000"/>
@@ -4415,7 +4415,7 @@
         <w:trPr/>
         <w:tc>
           <w:tcPr>
-            <w:tcW w:w="1584" w:type="dxa"/>
+            <w:tcW w:w="1583" w:type="dxa"/>
             <w:tcBorders>
               <w:left w:val="single" w:sz="2" w:space="0" w:color="000000"/>
               <w:bottom w:val="single" w:sz="2" w:space="0" w:color="000000"/>
@@ -4464,7 +4464,7 @@
         </w:tc>
         <w:tc>
           <w:tcPr>
-            <w:tcW w:w="2211" w:type="dxa"/>
+            <w:tcW w:w="2212" w:type="dxa"/>
             <w:tcBorders>
               <w:left w:val="single" w:sz="2" w:space="0" w:color="000000"/>
               <w:bottom w:val="single" w:sz="2" w:space="0" w:color="000000"/>
@@ -4494,7 +4494,7 @@
         <w:trPr/>
         <w:tc>
           <w:tcPr>
-            <w:tcW w:w="1584" w:type="dxa"/>
+            <w:tcW w:w="1583" w:type="dxa"/>
             <w:tcBorders>
               <w:left w:val="single" w:sz="2" w:space="0" w:color="000000"/>
               <w:bottom w:val="single" w:sz="2" w:space="0" w:color="000000"/>
@@ -4548,7 +4548,7 @@
         </w:tc>
         <w:tc>
           <w:tcPr>
-            <w:tcW w:w="2211" w:type="dxa"/>
+            <w:tcW w:w="2212" w:type="dxa"/>
             <w:tcBorders>
               <w:left w:val="single" w:sz="2" w:space="0" w:color="000000"/>
               <w:bottom w:val="single" w:sz="2" w:space="0" w:color="000000"/>
@@ -4580,7 +4580,7 @@
         <w:trPr/>
         <w:tc>
           <w:tcPr>
-            <w:tcW w:w="1584" w:type="dxa"/>
+            <w:tcW w:w="1583" w:type="dxa"/>
             <w:tcBorders>
               <w:left w:val="single" w:sz="2" w:space="0" w:color="000000"/>
               <w:bottom w:val="single" w:sz="2" w:space="0" w:color="000000"/>
@@ -4632,7 +4632,7 @@
         </w:tc>
         <w:tc>
           <w:tcPr>
-            <w:tcW w:w="2211" w:type="dxa"/>
+            <w:tcW w:w="2212" w:type="dxa"/>
             <w:tcBorders>
               <w:left w:val="single" w:sz="2" w:space="0" w:color="000000"/>
               <w:bottom w:val="single" w:sz="2" w:space="0" w:color="000000"/>
@@ -4662,7 +4662,7 @@
         <w:trPr/>
         <w:tc>
           <w:tcPr>
-            <w:tcW w:w="1584" w:type="dxa"/>
+            <w:tcW w:w="1583" w:type="dxa"/>
             <w:tcBorders>
               <w:left w:val="single" w:sz="2" w:space="0" w:color="000000"/>
               <w:bottom w:val="single" w:sz="2" w:space="0" w:color="000000"/>
@@ -4716,7 +4716,7 @@
         </w:tc>
         <w:tc>
           <w:tcPr>
-            <w:tcW w:w="2211" w:type="dxa"/>
+            <w:tcW w:w="2212" w:type="dxa"/>
             <w:tcBorders>
               <w:left w:val="single" w:sz="2" w:space="0" w:color="000000"/>
               <w:bottom w:val="single" w:sz="2" w:space="0" w:color="000000"/>
@@ -4746,7 +4746,7 @@
         <w:trPr/>
         <w:tc>
           <w:tcPr>
-            <w:tcW w:w="1584" w:type="dxa"/>
+            <w:tcW w:w="1583" w:type="dxa"/>
             <w:tcBorders>
               <w:left w:val="single" w:sz="2" w:space="0" w:color="000000"/>
               <w:bottom w:val="single" w:sz="2" w:space="0" w:color="000000"/>
@@ -4800,7 +4800,7 @@
         </w:tc>
         <w:tc>
           <w:tcPr>
-            <w:tcW w:w="2211" w:type="dxa"/>
+            <w:tcW w:w="2212" w:type="dxa"/>
             <w:tcBorders>
               <w:left w:val="single" w:sz="2" w:space="0" w:color="000000"/>
               <w:bottom w:val="single" w:sz="2" w:space="0" w:color="000000"/>
@@ -4830,7 +4830,7 @@
         <w:trPr/>
         <w:tc>
           <w:tcPr>
-            <w:tcW w:w="1584" w:type="dxa"/>
+            <w:tcW w:w="1583" w:type="dxa"/>
             <w:tcBorders>
               <w:left w:val="single" w:sz="2" w:space="0" w:color="000000"/>
               <w:bottom w:val="single" w:sz="2" w:space="0" w:color="000000"/>
@@ -4884,7 +4884,7 @@
         </w:tc>
         <w:tc>
           <w:tcPr>
-            <w:tcW w:w="2211" w:type="dxa"/>
+            <w:tcW w:w="2212" w:type="dxa"/>
             <w:tcBorders>
               <w:left w:val="single" w:sz="2" w:space="0" w:color="000000"/>
               <w:bottom w:val="single" w:sz="2" w:space="0" w:color="000000"/>
@@ -4914,7 +4914,7 @@
         <w:trPr/>
         <w:tc>
           <w:tcPr>
-            <w:tcW w:w="1584" w:type="dxa"/>
+            <w:tcW w:w="1583" w:type="dxa"/>
             <w:tcBorders>
               <w:left w:val="single" w:sz="2" w:space="0" w:color="000000"/>
               <w:bottom w:val="single" w:sz="2" w:space="0" w:color="000000"/>
@@ -4966,7 +4966,7 @@
         </w:tc>
         <w:tc>
           <w:tcPr>
-            <w:tcW w:w="2211" w:type="dxa"/>
+            <w:tcW w:w="2212" w:type="dxa"/>
             <w:tcBorders>
               <w:left w:val="single" w:sz="2" w:space="0" w:color="000000"/>
               <w:bottom w:val="single" w:sz="2" w:space="0" w:color="000000"/>
@@ -4996,7 +4996,7 @@
         <w:trPr/>
         <w:tc>
           <w:tcPr>
-            <w:tcW w:w="1584" w:type="dxa"/>
+            <w:tcW w:w="1583" w:type="dxa"/>
             <w:tcBorders>
               <w:left w:val="single" w:sz="2" w:space="0" w:color="000000"/>
               <w:bottom w:val="single" w:sz="2" w:space="0" w:color="000000"/>
@@ -5048,7 +5048,7 @@
         </w:tc>
         <w:tc>
           <w:tcPr>
-            <w:tcW w:w="2211" w:type="dxa"/>
+            <w:tcW w:w="2212" w:type="dxa"/>
             <w:tcBorders>
               <w:left w:val="single" w:sz="2" w:space="0" w:color="000000"/>
               <w:bottom w:val="single" w:sz="2" w:space="0" w:color="000000"/>
@@ -5078,7 +5078,7 @@
         <w:trPr/>
         <w:tc>
           <w:tcPr>
-            <w:tcW w:w="1584" w:type="dxa"/>
+            <w:tcW w:w="1583" w:type="dxa"/>
             <w:tcBorders>
               <w:left w:val="single" w:sz="2" w:space="0" w:color="000000"/>
               <w:bottom w:val="single" w:sz="2" w:space="0" w:color="000000"/>
@@ -5131,7 +5131,7 @@
         </w:tc>
         <w:tc>
           <w:tcPr>
-            <w:tcW w:w="2211" w:type="dxa"/>
+            <w:tcW w:w="2212" w:type="dxa"/>
             <w:tcBorders>
               <w:left w:val="single" w:sz="2" w:space="0" w:color="000000"/>
               <w:bottom w:val="single" w:sz="2" w:space="0" w:color="000000"/>
@@ -5161,7 +5161,7 @@
         <w:trPr/>
         <w:tc>
           <w:tcPr>
-            <w:tcW w:w="1584" w:type="dxa"/>
+            <w:tcW w:w="1583" w:type="dxa"/>
             <w:tcBorders>
               <w:left w:val="single" w:sz="2" w:space="0" w:color="000000"/>
               <w:bottom w:val="single" w:sz="2" w:space="0" w:color="000000"/>
@@ -5214,7 +5214,7 @@
         </w:tc>
         <w:tc>
           <w:tcPr>
-            <w:tcW w:w="2211" w:type="dxa"/>
+            <w:tcW w:w="2212" w:type="dxa"/>
             <w:tcBorders>
               <w:left w:val="single" w:sz="2" w:space="0" w:color="000000"/>
               <w:bottom w:val="single" w:sz="2" w:space="0" w:color="000000"/>
@@ -5244,7 +5244,7 @@
         <w:trPr/>
         <w:tc>
           <w:tcPr>
-            <w:tcW w:w="1584" w:type="dxa"/>
+            <w:tcW w:w="1583" w:type="dxa"/>
             <w:tcBorders>
               <w:left w:val="single" w:sz="2" w:space="0" w:color="000000"/>
               <w:bottom w:val="single" w:sz="2" w:space="0" w:color="000000"/>
@@ -5297,7 +5297,7 @@
         </w:tc>
         <w:tc>
           <w:tcPr>
-            <w:tcW w:w="2211" w:type="dxa"/>
+            <w:tcW w:w="2212" w:type="dxa"/>
             <w:tcBorders>
               <w:left w:val="single" w:sz="2" w:space="0" w:color="000000"/>
               <w:bottom w:val="single" w:sz="2" w:space="0" w:color="000000"/>
@@ -5327,7 +5327,7 @@
         <w:trPr/>
         <w:tc>
           <w:tcPr>
-            <w:tcW w:w="1584" w:type="dxa"/>
+            <w:tcW w:w="1583" w:type="dxa"/>
             <w:tcBorders>
               <w:left w:val="single" w:sz="2" w:space="0" w:color="000000"/>
               <w:bottom w:val="single" w:sz="2" w:space="0" w:color="000000"/>
@@ -5379,7 +5379,7 @@
         </w:tc>
         <w:tc>
           <w:tcPr>
-            <w:tcW w:w="2211" w:type="dxa"/>
+            <w:tcW w:w="2212" w:type="dxa"/>
             <w:tcBorders>
               <w:left w:val="single" w:sz="2" w:space="0" w:color="000000"/>
               <w:bottom w:val="single" w:sz="2" w:space="0" w:color="000000"/>
@@ -5409,7 +5409,7 @@
         <w:trPr/>
         <w:tc>
           <w:tcPr>
-            <w:tcW w:w="1584" w:type="dxa"/>
+            <w:tcW w:w="1583" w:type="dxa"/>
             <w:tcBorders>
               <w:left w:val="single" w:sz="2" w:space="0" w:color="000000"/>
               <w:bottom w:val="single" w:sz="2" w:space="0" w:color="000000"/>
@@ -5464,7 +5464,7 @@
         </w:tc>
         <w:tc>
           <w:tcPr>
-            <w:tcW w:w="2211" w:type="dxa"/>
+            <w:tcW w:w="2212" w:type="dxa"/>
             <w:tcBorders>
               <w:left w:val="single" w:sz="2" w:space="0" w:color="000000"/>
               <w:bottom w:val="single" w:sz="2" w:space="0" w:color="000000"/>
@@ -5494,7 +5494,7 @@
         <w:trPr/>
         <w:tc>
           <w:tcPr>
-            <w:tcW w:w="1584" w:type="dxa"/>
+            <w:tcW w:w="1583" w:type="dxa"/>
             <w:tcBorders>
               <w:left w:val="single" w:sz="2" w:space="0" w:color="000000"/>
               <w:bottom w:val="single" w:sz="2" w:space="0" w:color="000000"/>
@@ -5550,7 +5550,7 @@
         </w:tc>
         <w:tc>
           <w:tcPr>
-            <w:tcW w:w="2211" w:type="dxa"/>
+            <w:tcW w:w="2212" w:type="dxa"/>
             <w:tcBorders>
               <w:left w:val="single" w:sz="2" w:space="0" w:color="000000"/>
               <w:bottom w:val="single" w:sz="2" w:space="0" w:color="000000"/>
@@ -5580,7 +5580,7 @@
         <w:trPr/>
         <w:tc>
           <w:tcPr>
-            <w:tcW w:w="1584" w:type="dxa"/>
+            <w:tcW w:w="1583" w:type="dxa"/>
             <w:tcBorders>
               <w:left w:val="single" w:sz="2" w:space="0" w:color="000000"/>
               <w:bottom w:val="single" w:sz="2" w:space="0" w:color="000000"/>
@@ -5636,7 +5636,7 @@
         </w:tc>
         <w:tc>
           <w:tcPr>
-            <w:tcW w:w="2211" w:type="dxa"/>
+            <w:tcW w:w="2212" w:type="dxa"/>
             <w:tcBorders>
               <w:left w:val="single" w:sz="2" w:space="0" w:color="000000"/>
               <w:bottom w:val="single" w:sz="2" w:space="0" w:color="000000"/>
@@ -5668,7 +5668,7 @@
         <w:trPr/>
         <w:tc>
           <w:tcPr>
-            <w:tcW w:w="1584" w:type="dxa"/>
+            <w:tcW w:w="1583" w:type="dxa"/>
             <w:tcBorders>
               <w:left w:val="single" w:sz="2" w:space="0" w:color="000000"/>
               <w:bottom w:val="single" w:sz="2" w:space="0" w:color="000000"/>
@@ -5721,7 +5721,7 @@
         </w:tc>
         <w:tc>
           <w:tcPr>
-            <w:tcW w:w="2211" w:type="dxa"/>
+            <w:tcW w:w="2212" w:type="dxa"/>
             <w:tcBorders>
               <w:left w:val="single" w:sz="2" w:space="0" w:color="000000"/>
               <w:bottom w:val="single" w:sz="2" w:space="0" w:color="000000"/>
@@ -5757,7 +5757,7 @@
         <w:trPr/>
         <w:tc>
           <w:tcPr>
-            <w:tcW w:w="1584" w:type="dxa"/>
+            <w:tcW w:w="1583" w:type="dxa"/>
             <w:tcBorders>
               <w:left w:val="single" w:sz="2" w:space="0" w:color="000000"/>
               <w:bottom w:val="single" w:sz="2" w:space="0" w:color="000000"/>
@@ -5811,7 +5811,7 @@
         </w:tc>
         <w:tc>
           <w:tcPr>
-            <w:tcW w:w="2211" w:type="dxa"/>
+            <w:tcW w:w="2212" w:type="dxa"/>
             <w:tcBorders>
               <w:left w:val="single" w:sz="2" w:space="0" w:color="000000"/>
               <w:bottom w:val="single" w:sz="2" w:space="0" w:color="000000"/>
@@ -5847,7 +5847,7 @@
         <w:trPr/>
         <w:tc>
           <w:tcPr>
-            <w:tcW w:w="1584" w:type="dxa"/>
+            <w:tcW w:w="1583" w:type="dxa"/>
             <w:tcBorders>
               <w:left w:val="single" w:sz="2" w:space="0" w:color="000000"/>
               <w:bottom w:val="single" w:sz="2" w:space="0" w:color="000000"/>
@@ -5905,7 +5905,7 @@
         </w:tc>
         <w:tc>
           <w:tcPr>
-            <w:tcW w:w="2211" w:type="dxa"/>
+            <w:tcW w:w="2212" w:type="dxa"/>
             <w:tcBorders>
               <w:left w:val="single" w:sz="2" w:space="0" w:color="000000"/>
               <w:bottom w:val="single" w:sz="2" w:space="0" w:color="000000"/>
@@ -5942,7 +5942,7 @@
         <w:trPr/>
         <w:tc>
           <w:tcPr>
-            <w:tcW w:w="1584" w:type="dxa"/>
+            <w:tcW w:w="1583" w:type="dxa"/>
             <w:tcBorders>
               <w:left w:val="single" w:sz="2" w:space="0" w:color="000000"/>
               <w:bottom w:val="single" w:sz="2" w:space="0" w:color="000000"/>
@@ -6000,7 +6000,7 @@
         </w:tc>
         <w:tc>
           <w:tcPr>
-            <w:tcW w:w="2211" w:type="dxa"/>
+            <w:tcW w:w="2212" w:type="dxa"/>
             <w:tcBorders>
               <w:left w:val="single" w:sz="2" w:space="0" w:color="000000"/>
               <w:bottom w:val="single" w:sz="2" w:space="0" w:color="000000"/>
@@ -6037,7 +6037,7 @@
         <w:trPr/>
         <w:tc>
           <w:tcPr>
-            <w:tcW w:w="1584" w:type="dxa"/>
+            <w:tcW w:w="1583" w:type="dxa"/>
             <w:tcBorders>
               <w:left w:val="single" w:sz="2" w:space="0" w:color="000000"/>
               <w:bottom w:val="single" w:sz="2" w:space="0" w:color="000000"/>
@@ -6095,7 +6095,7 @@
         </w:tc>
         <w:tc>
           <w:tcPr>
-            <w:tcW w:w="2211" w:type="dxa"/>
+            <w:tcW w:w="2212" w:type="dxa"/>
             <w:tcBorders>
               <w:left w:val="single" w:sz="2" w:space="0" w:color="000000"/>
               <w:bottom w:val="single" w:sz="2" w:space="0" w:color="000000"/>
@@ -6132,7 +6132,7 @@
         <w:trPr/>
         <w:tc>
           <w:tcPr>
-            <w:tcW w:w="1584" w:type="dxa"/>
+            <w:tcW w:w="1583" w:type="dxa"/>
             <w:tcBorders>
               <w:left w:val="single" w:sz="2" w:space="0" w:color="000000"/>
               <w:bottom w:val="single" w:sz="2" w:space="0" w:color="000000"/>
@@ -6186,7 +6186,7 @@
         </w:tc>
         <w:tc>
           <w:tcPr>
-            <w:tcW w:w="2211" w:type="dxa"/>
+            <w:tcW w:w="2212" w:type="dxa"/>
             <w:tcBorders>
               <w:left w:val="single" w:sz="2" w:space="0" w:color="000000"/>
               <w:bottom w:val="single" w:sz="2" w:space="0" w:color="000000"/>
@@ -6218,7 +6218,7 @@
         <w:trPr/>
         <w:tc>
           <w:tcPr>
-            <w:tcW w:w="1584" w:type="dxa"/>
+            <w:tcW w:w="1583" w:type="dxa"/>
             <w:tcBorders>
               <w:left w:val="single" w:sz="2" w:space="0" w:color="000000"/>
               <w:bottom w:val="single" w:sz="2" w:space="0" w:color="000000"/>
@@ -6273,7 +6273,7 @@
         </w:tc>
         <w:tc>
           <w:tcPr>
-            <w:tcW w:w="2211" w:type="dxa"/>
+            <w:tcW w:w="2212" w:type="dxa"/>
             <w:tcBorders>
               <w:left w:val="single" w:sz="2" w:space="0" w:color="000000"/>
               <w:bottom w:val="single" w:sz="2" w:space="0" w:color="000000"/>
@@ -6305,7 +6305,7 @@
         <w:trPr/>
         <w:tc>
           <w:tcPr>
-            <w:tcW w:w="1584" w:type="dxa"/>
+            <w:tcW w:w="1583" w:type="dxa"/>
             <w:tcBorders>
               <w:left w:val="single" w:sz="2" w:space="0" w:color="000000"/>
               <w:bottom w:val="single" w:sz="2" w:space="0" w:color="000000"/>
@@ -6349,7 +6349,7 @@
         </w:tc>
         <w:tc>
           <w:tcPr>
-            <w:tcW w:w="2211" w:type="dxa"/>
+            <w:tcW w:w="2212" w:type="dxa"/>
             <w:tcBorders>
               <w:left w:val="single" w:sz="2" w:space="0" w:color="000000"/>
               <w:bottom w:val="single" w:sz="2" w:space="0" w:color="000000"/>
@@ -6381,7 +6381,7 @@
         <w:trPr/>
         <w:tc>
           <w:tcPr>
-            <w:tcW w:w="1584" w:type="dxa"/>
+            <w:tcW w:w="1583" w:type="dxa"/>
             <w:tcBorders>
               <w:left w:val="single" w:sz="2" w:space="0" w:color="000000"/>
               <w:bottom w:val="single" w:sz="2" w:space="0" w:color="000000"/>
@@ -6425,7 +6425,7 @@
         </w:tc>
         <w:tc>
           <w:tcPr>
-            <w:tcW w:w="2211" w:type="dxa"/>
+            <w:tcW w:w="2212" w:type="dxa"/>
             <w:tcBorders>
               <w:left w:val="single" w:sz="2" w:space="0" w:color="000000"/>
               <w:bottom w:val="single" w:sz="2" w:space="0" w:color="000000"/>
@@ -6457,7 +6457,7 @@
         <w:trPr/>
         <w:tc>
           <w:tcPr>
-            <w:tcW w:w="1584" w:type="dxa"/>
+            <w:tcW w:w="1583" w:type="dxa"/>
             <w:tcBorders>
               <w:left w:val="single" w:sz="2" w:space="0" w:color="000000"/>
               <w:bottom w:val="single" w:sz="2" w:space="0" w:color="000000"/>
@@ -6506,7 +6506,7 @@
         </w:tc>
         <w:tc>
           <w:tcPr>
-            <w:tcW w:w="2211" w:type="dxa"/>
+            <w:tcW w:w="2212" w:type="dxa"/>
             <w:tcBorders>
               <w:left w:val="single" w:sz="2" w:space="0" w:color="000000"/>
               <w:bottom w:val="single" w:sz="2" w:space="0" w:color="000000"/>
@@ -6537,7 +6537,7 @@
         <w:trPr/>
         <w:tc>
           <w:tcPr>
-            <w:tcW w:w="1584" w:type="dxa"/>
+            <w:tcW w:w="1583" w:type="dxa"/>
             <w:tcBorders>
               <w:left w:val="single" w:sz="2" w:space="0" w:color="000000"/>
               <w:bottom w:val="single" w:sz="2" w:space="0" w:color="000000"/>
@@ -6587,7 +6587,7 @@
         </w:tc>
         <w:tc>
           <w:tcPr>
-            <w:tcW w:w="2211" w:type="dxa"/>
+            <w:tcW w:w="2212" w:type="dxa"/>
             <w:tcBorders>
               <w:left w:val="single" w:sz="2" w:space="0" w:color="000000"/>
               <w:bottom w:val="single" w:sz="2" w:space="0" w:color="000000"/>
@@ -6620,7 +6620,7 @@
         <w:trPr/>
         <w:tc>
           <w:tcPr>
-            <w:tcW w:w="1584" w:type="dxa"/>
+            <w:tcW w:w="1583" w:type="dxa"/>
             <w:tcBorders>
               <w:left w:val="single" w:sz="2" w:space="0" w:color="000000"/>
               <w:bottom w:val="single" w:sz="2" w:space="0" w:color="000000"/>
@@ -6676,7 +6676,7 @@
         </w:tc>
         <w:tc>
           <w:tcPr>
-            <w:tcW w:w="2211" w:type="dxa"/>
+            <w:tcW w:w="2212" w:type="dxa"/>
             <w:tcBorders>
               <w:left w:val="single" w:sz="2" w:space="0" w:color="000000"/>
               <w:bottom w:val="single" w:sz="2" w:space="0" w:color="000000"/>
@@ -6709,7 +6709,7 @@
         <w:trPr/>
         <w:tc>
           <w:tcPr>
-            <w:tcW w:w="1584" w:type="dxa"/>
+            <w:tcW w:w="1583" w:type="dxa"/>
             <w:tcBorders>
               <w:left w:val="single" w:sz="2" w:space="0" w:color="000000"/>
               <w:bottom w:val="single" w:sz="2" w:space="0" w:color="000000"/>
@@ -6759,7 +6759,7 @@
         </w:tc>
         <w:tc>
           <w:tcPr>
-            <w:tcW w:w="2211" w:type="dxa"/>
+            <w:tcW w:w="2212" w:type="dxa"/>
             <w:tcBorders>
               <w:left w:val="single" w:sz="2" w:space="0" w:color="000000"/>
               <w:bottom w:val="single" w:sz="2" w:space="0" w:color="000000"/>
@@ -6792,7 +6792,7 @@
         <w:trPr/>
         <w:tc>
           <w:tcPr>
-            <w:tcW w:w="1584" w:type="dxa"/>
+            <w:tcW w:w="1583" w:type="dxa"/>
             <w:tcBorders>
               <w:left w:val="single" w:sz="2" w:space="0" w:color="000000"/>
               <w:bottom w:val="single" w:sz="2" w:space="0" w:color="000000"/>
@@ -6842,7 +6842,7 @@
         </w:tc>
         <w:tc>
           <w:tcPr>
-            <w:tcW w:w="2211" w:type="dxa"/>
+            <w:tcW w:w="2212" w:type="dxa"/>
             <w:tcBorders>
               <w:left w:val="single" w:sz="2" w:space="0" w:color="000000"/>
               <w:bottom w:val="single" w:sz="2" w:space="0" w:color="000000"/>
@@ -6875,7 +6875,7 @@
         <w:trPr/>
         <w:tc>
           <w:tcPr>
-            <w:tcW w:w="1584" w:type="dxa"/>
+            <w:tcW w:w="1583" w:type="dxa"/>
             <w:tcBorders>
               <w:left w:val="single" w:sz="2" w:space="0" w:color="000000"/>
               <w:bottom w:val="single" w:sz="2" w:space="0" w:color="000000"/>
@@ -6925,7 +6925,7 @@
         </w:tc>
         <w:tc>
           <w:tcPr>
-            <w:tcW w:w="2211" w:type="dxa"/>
+            <w:tcW w:w="2212" w:type="dxa"/>
             <w:tcBorders>
               <w:left w:val="single" w:sz="2" w:space="0" w:color="000000"/>
               <w:bottom w:val="single" w:sz="2" w:space="0" w:color="000000"/>
@@ -6958,7 +6958,7 @@
         <w:trPr/>
         <w:tc>
           <w:tcPr>
-            <w:tcW w:w="1584" w:type="dxa"/>
+            <w:tcW w:w="1583" w:type="dxa"/>
             <w:tcBorders>
               <w:left w:val="single" w:sz="2" w:space="0" w:color="000000"/>
               <w:bottom w:val="single" w:sz="2" w:space="0" w:color="000000"/>
@@ -7012,7 +7012,7 @@
         </w:tc>
         <w:tc>
           <w:tcPr>
-            <w:tcW w:w="2211" w:type="dxa"/>
+            <w:tcW w:w="2212" w:type="dxa"/>
             <w:tcBorders>
               <w:left w:val="single" w:sz="2" w:space="0" w:color="000000"/>
               <w:bottom w:val="single" w:sz="2" w:space="0" w:color="000000"/>
@@ -7045,7 +7045,7 @@
         <w:trPr/>
         <w:tc>
           <w:tcPr>
-            <w:tcW w:w="1584" w:type="dxa"/>
+            <w:tcW w:w="1583" w:type="dxa"/>
             <w:tcBorders>
               <w:left w:val="single" w:sz="2" w:space="0" w:color="000000"/>
               <w:bottom w:val="single" w:sz="2" w:space="0" w:color="000000"/>
@@ -7192,7 +7192,7 @@
         </w:tc>
         <w:tc>
           <w:tcPr>
-            <w:tcW w:w="2211" w:type="dxa"/>
+            <w:tcW w:w="2212" w:type="dxa"/>
             <w:tcBorders>
               <w:left w:val="single" w:sz="2" w:space="0" w:color="000000"/>
               <w:bottom w:val="single" w:sz="2" w:space="0" w:color="000000"/>
@@ -7225,7 +7225,7 @@
         <w:trPr/>
         <w:tc>
           <w:tcPr>
-            <w:tcW w:w="1584" w:type="dxa"/>
+            <w:tcW w:w="1583" w:type="dxa"/>
             <w:tcBorders>
               <w:left w:val="single" w:sz="2" w:space="0" w:color="000000"/>
               <w:bottom w:val="single" w:sz="2" w:space="0" w:color="000000"/>
@@ -7275,7 +7275,7 @@
         </w:tc>
         <w:tc>
           <w:tcPr>
-            <w:tcW w:w="2211" w:type="dxa"/>
+            <w:tcW w:w="2212" w:type="dxa"/>
             <w:tcBorders>
               <w:left w:val="single" w:sz="2" w:space="0" w:color="000000"/>
               <w:bottom w:val="single" w:sz="2" w:space="0" w:color="000000"/>
@@ -7310,7 +7310,7 @@
         <w:trPr/>
         <w:tc>
           <w:tcPr>
-            <w:tcW w:w="1584" w:type="dxa"/>
+            <w:tcW w:w="1583" w:type="dxa"/>
             <w:tcBorders>
               <w:left w:val="single" w:sz="2" w:space="0" w:color="000000"/>
               <w:bottom w:val="single" w:sz="2" w:space="0" w:color="000000"/>
@@ -7357,7 +7357,7 @@
         </w:tc>
         <w:tc>
           <w:tcPr>
-            <w:tcW w:w="2211" w:type="dxa"/>
+            <w:tcW w:w="2212" w:type="dxa"/>
             <w:tcBorders>
               <w:left w:val="single" w:sz="2" w:space="0" w:color="000000"/>
               <w:bottom w:val="single" w:sz="2" w:space="0" w:color="000000"/>
@@ -7390,7 +7390,7 @@
         <w:trPr/>
         <w:tc>
           <w:tcPr>
-            <w:tcW w:w="1584" w:type="dxa"/>
+            <w:tcW w:w="1583" w:type="dxa"/>
             <w:tcBorders>
               <w:left w:val="single" w:sz="2" w:space="0" w:color="000000"/>
               <w:bottom w:val="single" w:sz="2" w:space="0" w:color="000000"/>
@@ -7437,7 +7437,7 @@
         </w:tc>
         <w:tc>
           <w:tcPr>
-            <w:tcW w:w="2211" w:type="dxa"/>
+            <w:tcW w:w="2212" w:type="dxa"/>
             <w:tcBorders>
               <w:left w:val="single" w:sz="2" w:space="0" w:color="000000"/>
               <w:bottom w:val="single" w:sz="2" w:space="0" w:color="000000"/>
@@ -7470,7 +7470,7 @@
         <w:trPr/>
         <w:tc>
           <w:tcPr>
-            <w:tcW w:w="1584" w:type="dxa"/>
+            <w:tcW w:w="1583" w:type="dxa"/>
             <w:tcBorders>
               <w:left w:val="single" w:sz="2" w:space="0" w:color="000000"/>
               <w:bottom w:val="single" w:sz="2" w:space="0" w:color="000000"/>
@@ -7517,7 +7517,7 @@
         </w:tc>
         <w:tc>
           <w:tcPr>
-            <w:tcW w:w="2211" w:type="dxa"/>
+            <w:tcW w:w="2212" w:type="dxa"/>
             <w:tcBorders>
               <w:left w:val="single" w:sz="2" w:space="0" w:color="000000"/>
               <w:bottom w:val="single" w:sz="2" w:space="0" w:color="000000"/>
@@ -8893,15 +8893,15 @@
         <w:tblLook w:firstRow="1" w:noVBand="1" w:lastRow="0" w:firstColumn="1" w:lastColumn="0" w:noHBand="0" w:val="04a0"/>
       </w:tblPr>
       <w:tblGrid>
-        <w:gridCol w:w="3233"/>
+        <w:gridCol w:w="3232"/>
         <w:gridCol w:w="2309"/>
-        <w:gridCol w:w="3413"/>
+        <w:gridCol w:w="3414"/>
       </w:tblGrid>
       <w:tr>
         <w:trPr/>
         <w:tc>
           <w:tcPr>
-            <w:tcW w:w="3233" w:type="dxa"/>
+            <w:tcW w:w="3232" w:type="dxa"/>
             <w:tcBorders/>
             <w:shd w:color="auto" w:fill="auto" w:val="clear"/>
           </w:tcPr>
@@ -8943,7 +8943,7 @@
         </w:tc>
         <w:tc>
           <w:tcPr>
-            <w:tcW w:w="3413" w:type="dxa"/>
+            <w:tcW w:w="3414" w:type="dxa"/>
             <w:tcBorders/>
             <w:shd w:color="auto" w:fill="auto" w:val="clear"/>
           </w:tcPr>
@@ -8967,7 +8967,7 @@
         <w:trPr/>
         <w:tc>
           <w:tcPr>
-            <w:tcW w:w="3233" w:type="dxa"/>
+            <w:tcW w:w="3232" w:type="dxa"/>
             <w:tcBorders/>
             <w:shd w:color="auto" w:fill="auto" w:val="clear"/>
           </w:tcPr>
@@ -9010,7 +9010,7 @@
         </w:tc>
         <w:tc>
           <w:tcPr>
-            <w:tcW w:w="3413" w:type="dxa"/>
+            <w:tcW w:w="3414" w:type="dxa"/>
             <w:tcBorders/>
             <w:shd w:color="auto" w:fill="auto" w:val="clear"/>
           </w:tcPr>
@@ -9059,7 +9059,7 @@
         <w:trPr/>
         <w:tc>
           <w:tcPr>
-            <w:tcW w:w="3233" w:type="dxa"/>
+            <w:tcW w:w="3232" w:type="dxa"/>
             <w:tcBorders/>
             <w:shd w:color="auto" w:fill="auto" w:val="clear"/>
           </w:tcPr>
@@ -9118,7 +9118,7 @@
         </w:tc>
         <w:tc>
           <w:tcPr>
-            <w:tcW w:w="3413" w:type="dxa"/>
+            <w:tcW w:w="3414" w:type="dxa"/>
             <w:tcBorders/>
             <w:shd w:color="auto" w:fill="auto" w:val="clear"/>
           </w:tcPr>
@@ -9144,7 +9144,7 @@
         <w:trPr/>
         <w:tc>
           <w:tcPr>
-            <w:tcW w:w="3233" w:type="dxa"/>
+            <w:tcW w:w="3232" w:type="dxa"/>
             <w:tcBorders/>
             <w:shd w:color="auto" w:fill="auto" w:val="clear"/>
           </w:tcPr>
@@ -9187,7 +9187,7 @@
         </w:tc>
         <w:tc>
           <w:tcPr>
-            <w:tcW w:w="3413" w:type="dxa"/>
+            <w:tcW w:w="3414" w:type="dxa"/>
             <w:tcBorders/>
             <w:shd w:color="auto" w:fill="auto" w:val="clear"/>
           </w:tcPr>
@@ -9213,7 +9213,7 @@
         <w:trPr/>
         <w:tc>
           <w:tcPr>
-            <w:tcW w:w="3233" w:type="dxa"/>
+            <w:tcW w:w="3232" w:type="dxa"/>
             <w:tcBorders/>
             <w:shd w:color="auto" w:fill="auto" w:val="clear"/>
           </w:tcPr>
@@ -9256,7 +9256,7 @@
         </w:tc>
         <w:tc>
           <w:tcPr>
-            <w:tcW w:w="3413" w:type="dxa"/>
+            <w:tcW w:w="3414" w:type="dxa"/>
             <w:tcBorders/>
             <w:shd w:color="auto" w:fill="auto" w:val="clear"/>
           </w:tcPr>
@@ -9282,7 +9282,7 @@
         <w:trPr/>
         <w:tc>
           <w:tcPr>
-            <w:tcW w:w="3233" w:type="dxa"/>
+            <w:tcW w:w="3232" w:type="dxa"/>
             <w:tcBorders/>
             <w:shd w:color="auto" w:fill="auto" w:val="clear"/>
           </w:tcPr>
@@ -9328,7 +9328,7 @@
         </w:tc>
         <w:tc>
           <w:tcPr>
-            <w:tcW w:w="3413" w:type="dxa"/>
+            <w:tcW w:w="3414" w:type="dxa"/>
             <w:tcBorders/>
             <w:shd w:color="auto" w:fill="auto" w:val="clear"/>
           </w:tcPr>
@@ -9465,15 +9465,15 @@
         <w:tblLook w:firstRow="1" w:noVBand="1" w:lastRow="0" w:firstColumn="1" w:lastColumn="0" w:noHBand="0" w:val="04a0"/>
       </w:tblPr>
       <w:tblGrid>
-        <w:gridCol w:w="3233"/>
+        <w:gridCol w:w="3232"/>
         <w:gridCol w:w="2339"/>
-        <w:gridCol w:w="3443"/>
+        <w:gridCol w:w="3444"/>
       </w:tblGrid>
       <w:tr>
         <w:trPr/>
         <w:tc>
           <w:tcPr>
-            <w:tcW w:w="3233" w:type="dxa"/>
+            <w:tcW w:w="3232" w:type="dxa"/>
             <w:tcBorders/>
             <w:shd w:color="auto" w:fill="auto" w:val="clear"/>
           </w:tcPr>
@@ -9519,7 +9519,7 @@
         </w:tc>
         <w:tc>
           <w:tcPr>
-            <w:tcW w:w="3443" w:type="dxa"/>
+            <w:tcW w:w="3444" w:type="dxa"/>
             <w:tcBorders/>
             <w:shd w:color="auto" w:fill="auto" w:val="clear"/>
           </w:tcPr>
@@ -9545,7 +9545,7 @@
         <w:trPr/>
         <w:tc>
           <w:tcPr>
-            <w:tcW w:w="3233" w:type="dxa"/>
+            <w:tcW w:w="3232" w:type="dxa"/>
             <w:tcBorders/>
             <w:shd w:color="auto" w:fill="auto" w:val="clear"/>
           </w:tcPr>
@@ -9591,7 +9591,7 @@
         </w:tc>
         <w:tc>
           <w:tcPr>
-            <w:tcW w:w="3443" w:type="dxa"/>
+            <w:tcW w:w="3444" w:type="dxa"/>
             <w:tcBorders/>
             <w:shd w:color="auto" w:fill="auto" w:val="clear"/>
           </w:tcPr>
@@ -10074,14 +10074,14 @@
         <w:tblLook w:firstRow="1" w:noVBand="1" w:lastRow="0" w:firstColumn="1" w:lastColumn="0" w:noHBand="0" w:val="04a0"/>
       </w:tblPr>
       <w:tblGrid>
-        <w:gridCol w:w="1794"/>
-        <w:gridCol w:w="7160"/>
+        <w:gridCol w:w="1793"/>
+        <w:gridCol w:w="7161"/>
       </w:tblGrid>
       <w:tr>
         <w:trPr/>
         <w:tc>
           <w:tcPr>
-            <w:tcW w:w="1794" w:type="dxa"/>
+            <w:tcW w:w="1793" w:type="dxa"/>
             <w:tcBorders/>
             <w:shd w:color="auto" w:fill="auto" w:val="clear"/>
           </w:tcPr>
@@ -10104,7 +10104,7 @@
         </w:tc>
         <w:tc>
           <w:tcPr>
-            <w:tcW w:w="7160" w:type="dxa"/>
+            <w:tcW w:w="7161" w:type="dxa"/>
             <w:tcBorders/>
             <w:shd w:color="auto" w:fill="auto" w:val="clear"/>
           </w:tcPr>
@@ -10130,7 +10130,7 @@
         <w:trPr/>
         <w:tc>
           <w:tcPr>
-            <w:tcW w:w="1794" w:type="dxa"/>
+            <w:tcW w:w="1793" w:type="dxa"/>
             <w:tcBorders/>
             <w:shd w:color="auto" w:fill="auto" w:val="clear"/>
           </w:tcPr>
@@ -10151,7 +10151,7 @@
         </w:tc>
         <w:tc>
           <w:tcPr>
-            <w:tcW w:w="7160" w:type="dxa"/>
+            <w:tcW w:w="7161" w:type="dxa"/>
             <w:tcBorders/>
             <w:shd w:color="auto" w:fill="auto" w:val="clear"/>
           </w:tcPr>
@@ -10173,7 +10173,7 @@
         <w:trPr/>
         <w:tc>
           <w:tcPr>
-            <w:tcW w:w="1794" w:type="dxa"/>
+            <w:tcW w:w="1793" w:type="dxa"/>
             <w:tcBorders/>
             <w:shd w:color="auto" w:fill="auto" w:val="clear"/>
           </w:tcPr>
@@ -10194,7 +10194,7 @@
         </w:tc>
         <w:tc>
           <w:tcPr>
-            <w:tcW w:w="7160" w:type="dxa"/>
+            <w:tcW w:w="7161" w:type="dxa"/>
             <w:tcBorders/>
             <w:shd w:color="auto" w:fill="auto" w:val="clear"/>
           </w:tcPr>
@@ -10218,7 +10218,7 @@
         <w:trPr/>
         <w:tc>
           <w:tcPr>
-            <w:tcW w:w="1794" w:type="dxa"/>
+            <w:tcW w:w="1793" w:type="dxa"/>
             <w:tcBorders/>
             <w:shd w:color="auto" w:fill="auto" w:val="clear"/>
           </w:tcPr>
@@ -10239,7 +10239,7 @@
         </w:tc>
         <w:tc>
           <w:tcPr>
-            <w:tcW w:w="7160" w:type="dxa"/>
+            <w:tcW w:w="7161" w:type="dxa"/>
             <w:tcBorders/>
             <w:shd w:color="auto" w:fill="auto" w:val="clear"/>
           </w:tcPr>
@@ -10265,7 +10265,7 @@
         </w:trPr>
         <w:tc>
           <w:tcPr>
-            <w:tcW w:w="1794" w:type="dxa"/>
+            <w:tcW w:w="1793" w:type="dxa"/>
             <w:tcBorders/>
             <w:shd w:color="auto" w:fill="auto" w:val="clear"/>
           </w:tcPr>
@@ -10286,7 +10286,7 @@
         </w:tc>
         <w:tc>
           <w:tcPr>
-            <w:tcW w:w="7160" w:type="dxa"/>
+            <w:tcW w:w="7161" w:type="dxa"/>
             <w:tcBorders/>
             <w:shd w:color="auto" w:fill="auto" w:val="clear"/>
           </w:tcPr>
@@ -10310,7 +10310,7 @@
         <w:trPr/>
         <w:tc>
           <w:tcPr>
-            <w:tcW w:w="1794" w:type="dxa"/>
+            <w:tcW w:w="1793" w:type="dxa"/>
             <w:tcBorders/>
             <w:shd w:color="auto" w:fill="auto" w:val="clear"/>
           </w:tcPr>
@@ -10331,7 +10331,7 @@
         </w:tc>
         <w:tc>
           <w:tcPr>
-            <w:tcW w:w="7160" w:type="dxa"/>
+            <w:tcW w:w="7161" w:type="dxa"/>
             <w:tcBorders/>
             <w:shd w:color="auto" w:fill="auto" w:val="clear"/>
           </w:tcPr>
@@ -10353,7 +10353,7 @@
         <w:trPr/>
         <w:tc>
           <w:tcPr>
-            <w:tcW w:w="1794" w:type="dxa"/>
+            <w:tcW w:w="1793" w:type="dxa"/>
             <w:tcBorders/>
             <w:shd w:color="auto" w:fill="auto" w:val="clear"/>
           </w:tcPr>
@@ -10374,7 +10374,7 @@
         </w:tc>
         <w:tc>
           <w:tcPr>
-            <w:tcW w:w="7160" w:type="dxa"/>
+            <w:tcW w:w="7161" w:type="dxa"/>
             <w:tcBorders/>
             <w:shd w:color="auto" w:fill="auto" w:val="clear"/>
           </w:tcPr>
@@ -10412,7 +10412,7 @@
         <w:trPr/>
         <w:tc>
           <w:tcPr>
-            <w:tcW w:w="1794" w:type="dxa"/>
+            <w:tcW w:w="1793" w:type="dxa"/>
             <w:tcBorders/>
             <w:shd w:color="auto" w:fill="auto" w:val="clear"/>
           </w:tcPr>
@@ -10433,7 +10433,7 @@
         </w:tc>
         <w:tc>
           <w:tcPr>
-            <w:tcW w:w="7160" w:type="dxa"/>
+            <w:tcW w:w="7161" w:type="dxa"/>
             <w:tcBorders/>
             <w:shd w:color="auto" w:fill="auto" w:val="clear"/>
           </w:tcPr>
@@ -10533,14 +10533,14 @@
         <w:tblLook w:firstRow="1" w:noVBand="1" w:lastRow="0" w:firstColumn="1" w:lastColumn="0" w:noHBand="0" w:val="04a0"/>
       </w:tblPr>
       <w:tblGrid>
-        <w:gridCol w:w="3056"/>
-        <w:gridCol w:w="6588"/>
+        <w:gridCol w:w="3055"/>
+        <w:gridCol w:w="6589"/>
       </w:tblGrid>
       <w:tr>
         <w:trPr/>
         <w:tc>
           <w:tcPr>
-            <w:tcW w:w="3056" w:type="dxa"/>
+            <w:tcW w:w="3055" w:type="dxa"/>
             <w:tcBorders/>
             <w:shd w:color="auto" w:fill="auto" w:val="clear"/>
           </w:tcPr>
@@ -10561,7 +10561,7 @@
         </w:tc>
         <w:tc>
           <w:tcPr>
-            <w:tcW w:w="6588" w:type="dxa"/>
+            <w:tcW w:w="6589" w:type="dxa"/>
             <w:tcBorders/>
             <w:shd w:color="auto" w:fill="auto" w:val="clear"/>
           </w:tcPr>
@@ -10585,7 +10585,7 @@
         <w:trPr/>
         <w:tc>
           <w:tcPr>
-            <w:tcW w:w="3056" w:type="dxa"/>
+            <w:tcW w:w="3055" w:type="dxa"/>
             <w:tcBorders/>
             <w:shd w:color="auto" w:fill="auto" w:val="clear"/>
           </w:tcPr>
@@ -10606,7 +10606,7 @@
         </w:tc>
         <w:tc>
           <w:tcPr>
-            <w:tcW w:w="6588" w:type="dxa"/>
+            <w:tcW w:w="6589" w:type="dxa"/>
             <w:tcBorders/>
             <w:shd w:color="auto" w:fill="auto" w:val="clear"/>
           </w:tcPr>
@@ -10628,7 +10628,7 @@
         <w:trPr/>
         <w:tc>
           <w:tcPr>
-            <w:tcW w:w="3056" w:type="dxa"/>
+            <w:tcW w:w="3055" w:type="dxa"/>
             <w:tcBorders/>
             <w:shd w:color="auto" w:fill="auto" w:val="clear"/>
           </w:tcPr>
@@ -10647,7 +10647,7 @@
         </w:tc>
         <w:tc>
           <w:tcPr>
-            <w:tcW w:w="6588" w:type="dxa"/>
+            <w:tcW w:w="6589" w:type="dxa"/>
             <w:tcBorders/>
             <w:shd w:color="auto" w:fill="auto" w:val="clear"/>
           </w:tcPr>
@@ -10669,7 +10669,7 @@
         <w:trPr/>
         <w:tc>
           <w:tcPr>
-            <w:tcW w:w="3056" w:type="dxa"/>
+            <w:tcW w:w="3055" w:type="dxa"/>
             <w:tcBorders/>
             <w:shd w:color="auto" w:fill="auto" w:val="clear"/>
           </w:tcPr>
@@ -10690,7 +10690,7 @@
         </w:tc>
         <w:tc>
           <w:tcPr>
-            <w:tcW w:w="6588" w:type="dxa"/>
+            <w:tcW w:w="6589" w:type="dxa"/>
             <w:tcBorders/>
             <w:shd w:color="auto" w:fill="auto" w:val="clear"/>
           </w:tcPr>
@@ -12385,25 +12385,66 @@
     <w:p>
       <w:pPr>
         <w:pStyle w:val="Normal"/>
+        <w:ind w:left="0" w:right="0" w:hanging="0"/>
+        <w:jc w:val="left"/>
+        <w:rPr>
+          <w:rFonts w:ascii="Verdana" w:hAnsi="Verdana" w:cs="Verdana"/>
+          <w:b w:val="false"/>
+          <w:i w:val="false"/>
+          <w:caps w:val="false"/>
+          <w:smallCaps w:val="false"/>
+          <w:strike w:val="false"/>
+          <w:dstrike w:val="false"/>
+          <w:color w:val="333333"/>
+          <w:spacing w:val="0"/>
+          <w:sz w:val="22"/>
+          <w:szCs w:val="22"/>
+          <w:u w:val="none"/>
+          <w:effect w:val="none"/>
+        </w:rPr>
+      </w:pPr>
+      <w:r>
         <w:rPr/>
-      </w:pPr>
-      <w:r>
-        <w:rPr>
-          <w:rFonts w:cs="Verdana" w:ascii="Verdana" w:hAnsi="Verdana"/>
-        </w:rPr>
-        <w:t>Note that there is an option for "Import Today's Transfers", namely "Import Transfers", which allows for choos</w:t>
-      </w:r>
-      <w:r>
-        <w:rPr>
-          <w:rFonts w:cs="Verdana" w:ascii="Verdana" w:hAnsi="Verdana"/>
-        </w:rPr>
-        <w:t>ing in detail</w:t>
-      </w:r>
-      <w:r>
-        <w:rPr>
-          <w:rFonts w:cs="Verdana" w:ascii="Verdana" w:hAnsi="Verdana"/>
-        </w:rPr>
-        <w:t xml:space="preserve"> which files to import.</w:t>
+      </w:r>
+    </w:p>
+    <w:p>
+      <w:pPr>
+        <w:pStyle w:val="Normal"/>
+        <w:ind w:left="0" w:right="0" w:hanging="0"/>
+        <w:jc w:val="left"/>
+        <w:rPr/>
+      </w:pPr>
+      <w:r>
+        <w:rPr>
+          <w:rFonts w:cs="Verdana" w:ascii="Verdana" w:hAnsi="Verdana"/>
+          <w:b w:val="false"/>
+          <w:i w:val="false"/>
+          <w:caps w:val="false"/>
+          <w:smallCaps w:val="false"/>
+          <w:strike w:val="false"/>
+          <w:dstrike w:val="false"/>
+          <w:color w:val="333333"/>
+          <w:spacing w:val="0"/>
+          <w:sz w:val="22"/>
+          <w:szCs w:val="22"/>
+          <w:u w:val="none"/>
+          <w:effect w:val="none"/>
+        </w:rPr>
+        <w:t>Er is een optie bij "import de downloads van vandaag", namelijk "ïmporteer downloads", waardoor in detail gekozen kan worden welke bestanden geïmporteerd worden"  </w:t>
+      </w:r>
+    </w:p>
+    <w:p>
+      <w:pPr>
+        <w:pStyle w:val="Normal"/>
+        <w:rPr>
+          <w:rFonts w:ascii="Verdana" w:hAnsi="Verdana" w:cs="Verdana"/>
+        </w:rPr>
+      </w:pPr>
+      <w:r>
+        <w:rPr>
+          <w:sz w:val="22"/>
+          <w:szCs w:val="22"/>
+        </w:rPr>
       </w:r>
     </w:p>
     <w:p>
@@ -13110,14 +13151,14 @@
         <w:tblLook w:firstRow="1" w:noVBand="1" w:lastRow="0" w:firstColumn="1" w:lastColumn="0" w:noHBand="0" w:val="04a0"/>
       </w:tblPr>
       <w:tblGrid>
-        <w:gridCol w:w="2605"/>
-        <w:gridCol w:w="6420"/>
+        <w:gridCol w:w="2604"/>
+        <w:gridCol w:w="6421"/>
       </w:tblGrid>
       <w:tr>
         <w:trPr/>
         <w:tc>
           <w:tcPr>
-            <w:tcW w:w="2605" w:type="dxa"/>
+            <w:tcW w:w="2604" w:type="dxa"/>
             <w:tcBorders>
               <w:top w:val="single" w:sz="4" w:space="0" w:color="000000"/>
               <w:left w:val="single" w:sz="4" w:space="0" w:color="000000"/>
@@ -13144,7 +13185,7 @@
         </w:tc>
         <w:tc>
           <w:tcPr>
-            <w:tcW w:w="6420" w:type="dxa"/>
+            <w:tcW w:w="6421" w:type="dxa"/>
             <w:tcBorders>
               <w:top w:val="single" w:sz="4" w:space="0" w:color="000000"/>
               <w:left w:val="single" w:sz="4" w:space="0" w:color="000000"/>
@@ -13175,7 +13216,7 @@
         <w:trPr/>
         <w:tc>
           <w:tcPr>
-            <w:tcW w:w="2605" w:type="dxa"/>
+            <w:tcW w:w="2604" w:type="dxa"/>
             <w:tcBorders>
               <w:left w:val="single" w:sz="4" w:space="0" w:color="000000"/>
               <w:bottom w:val="single" w:sz="4" w:space="0" w:color="000000"/>
@@ -13201,7 +13242,7 @@
         </w:tc>
         <w:tc>
           <w:tcPr>
-            <w:tcW w:w="6420" w:type="dxa"/>
+            <w:tcW w:w="6421" w:type="dxa"/>
             <w:tcBorders>
               <w:left w:val="single" w:sz="4" w:space="0" w:color="000000"/>
               <w:bottom w:val="single" w:sz="4" w:space="0" w:color="000000"/>
@@ -13231,7 +13272,7 @@
         <w:trPr/>
         <w:tc>
           <w:tcPr>
-            <w:tcW w:w="2605" w:type="dxa"/>
+            <w:tcW w:w="2604" w:type="dxa"/>
             <w:tcBorders>
               <w:left w:val="single" w:sz="4" w:space="0" w:color="000000"/>
               <w:bottom w:val="single" w:sz="4" w:space="0" w:color="000000"/>
@@ -13257,7 +13298,7 @@
         </w:tc>
         <w:tc>
           <w:tcPr>
-            <w:tcW w:w="6420" w:type="dxa"/>
+            <w:tcW w:w="6421" w:type="dxa"/>
             <w:tcBorders>
               <w:left w:val="single" w:sz="4" w:space="0" w:color="000000"/>
               <w:bottom w:val="single" w:sz="4" w:space="0" w:color="000000"/>
@@ -15200,14 +15241,14 @@
         <w:tblLook w:firstRow="1" w:noVBand="1" w:lastRow="0" w:firstColumn="1" w:lastColumn="0" w:noHBand="0" w:val="04a0"/>
       </w:tblPr>
       <w:tblGrid>
-        <w:gridCol w:w="3056"/>
-        <w:gridCol w:w="6588"/>
+        <w:gridCol w:w="3055"/>
+        <w:gridCol w:w="6589"/>
       </w:tblGrid>
       <w:tr>
         <w:trPr/>
         <w:tc>
           <w:tcPr>
-            <w:tcW w:w="3056" w:type="dxa"/>
+            <w:tcW w:w="3055" w:type="dxa"/>
             <w:tcBorders/>
             <w:shd w:color="auto" w:fill="auto" w:val="clear"/>
           </w:tcPr>
@@ -15232,7 +15273,7 @@
         </w:tc>
         <w:tc>
           <w:tcPr>
-            <w:tcW w:w="6588" w:type="dxa"/>
+            <w:tcW w:w="6589" w:type="dxa"/>
             <w:tcBorders/>
             <w:shd w:color="auto" w:fill="auto" w:val="clear"/>
           </w:tcPr>
@@ -15258,7 +15299,7 @@
         <w:trPr/>
         <w:tc>
           <w:tcPr>
-            <w:tcW w:w="3056" w:type="dxa"/>
+            <w:tcW w:w="3055" w:type="dxa"/>
             <w:tcBorders/>
             <w:shd w:color="auto" w:fill="auto" w:val="clear"/>
           </w:tcPr>
@@ -15281,7 +15322,7 @@
         </w:tc>
         <w:tc>
           <w:tcPr>
-            <w:tcW w:w="6588" w:type="dxa"/>
+            <w:tcW w:w="6589" w:type="dxa"/>
             <w:tcBorders/>
             <w:shd w:color="auto" w:fill="auto" w:val="clear"/>
           </w:tcPr>
@@ -15309,7 +15350,7 @@
         <w:trPr/>
         <w:tc>
           <w:tcPr>
-            <w:tcW w:w="3056" w:type="dxa"/>
+            <w:tcW w:w="3055" w:type="dxa"/>
             <w:tcBorders/>
             <w:shd w:color="auto" w:fill="auto" w:val="clear"/>
           </w:tcPr>
@@ -15333,7 +15374,7 @@
         </w:tc>
         <w:tc>
           <w:tcPr>
-            <w:tcW w:w="6588" w:type="dxa"/>
+            <w:tcW w:w="6589" w:type="dxa"/>
             <w:tcBorders/>
             <w:shd w:color="auto" w:fill="auto" w:val="clear"/>
           </w:tcPr>
@@ -15360,7 +15401,7 @@
         <w:trPr/>
         <w:tc>
           <w:tcPr>
-            <w:tcW w:w="3056" w:type="dxa"/>
+            <w:tcW w:w="3055" w:type="dxa"/>
             <w:tcBorders/>
             <w:shd w:color="auto" w:fill="auto" w:val="clear"/>
           </w:tcPr>
@@ -15384,7 +15425,7 @@
         </w:tc>
         <w:tc>
           <w:tcPr>
-            <w:tcW w:w="6588" w:type="dxa"/>
+            <w:tcW w:w="6589" w:type="dxa"/>
             <w:tcBorders/>
             <w:shd w:color="auto" w:fill="auto" w:val="clear"/>
           </w:tcPr>
@@ -15412,7 +15453,7 @@
         <w:trPr/>
         <w:tc>
           <w:tcPr>
-            <w:tcW w:w="3056" w:type="dxa"/>
+            <w:tcW w:w="3055" w:type="dxa"/>
             <w:tcBorders/>
             <w:shd w:color="auto" w:fill="auto" w:val="clear"/>
           </w:tcPr>
@@ -15437,7 +15478,7 @@
         </w:tc>
         <w:tc>
           <w:tcPr>
-            <w:tcW w:w="6588" w:type="dxa"/>
+            <w:tcW w:w="6589" w:type="dxa"/>
             <w:tcBorders/>
             <w:shd w:color="auto" w:fill="auto" w:val="clear"/>
           </w:tcPr>
@@ -15465,7 +15506,7 @@
         <w:trPr/>
         <w:tc>
           <w:tcPr>
-            <w:tcW w:w="3056" w:type="dxa"/>
+            <w:tcW w:w="3055" w:type="dxa"/>
             <w:tcBorders/>
             <w:shd w:color="auto" w:fill="auto" w:val="clear"/>
           </w:tcPr>
@@ -15486,7 +15527,7 @@
         </w:tc>
         <w:tc>
           <w:tcPr>
-            <w:tcW w:w="6588" w:type="dxa"/>
+            <w:tcW w:w="6589" w:type="dxa"/>
             <w:tcBorders/>
             <w:shd w:color="auto" w:fill="auto" w:val="clear"/>
           </w:tcPr>
@@ -15512,7 +15553,7 @@
         <w:trPr/>
         <w:tc>
           <w:tcPr>
-            <w:tcW w:w="3056" w:type="dxa"/>
+            <w:tcW w:w="3055" w:type="dxa"/>
             <w:tcBorders/>
             <w:shd w:color="auto" w:fill="auto" w:val="clear"/>
           </w:tcPr>
@@ -15537,7 +15578,7 @@
         </w:tc>
         <w:tc>
           <w:tcPr>
-            <w:tcW w:w="6588" w:type="dxa"/>
+            <w:tcW w:w="6589" w:type="dxa"/>
             <w:tcBorders/>
             <w:shd w:color="auto" w:fill="auto" w:val="clear"/>
           </w:tcPr>
@@ -15560,7 +15601,7 @@
         <w:trPr/>
         <w:tc>
           <w:tcPr>
-            <w:tcW w:w="3056" w:type="dxa"/>
+            <w:tcW w:w="3055" w:type="dxa"/>
             <w:tcBorders/>
             <w:shd w:color="auto" w:fill="auto" w:val="clear"/>
           </w:tcPr>
@@ -15583,7 +15624,7 @@
         </w:tc>
         <w:tc>
           <w:tcPr>
-            <w:tcW w:w="6588" w:type="dxa"/>
+            <w:tcW w:w="6589" w:type="dxa"/>
             <w:tcBorders/>
             <w:shd w:color="auto" w:fill="auto" w:val="clear"/>
           </w:tcPr>
@@ -15606,7 +15647,7 @@
         <w:trPr/>
         <w:tc>
           <w:tcPr>
-            <w:tcW w:w="3056" w:type="dxa"/>
+            <w:tcW w:w="3055" w:type="dxa"/>
             <w:tcBorders/>
             <w:shd w:color="auto" w:fill="auto" w:val="clear"/>
           </w:tcPr>
@@ -15626,7 +15667,7 @@
         </w:tc>
         <w:tc>
           <w:tcPr>
-            <w:tcW w:w="6588" w:type="dxa"/>
+            <w:tcW w:w="6589" w:type="dxa"/>
             <w:tcBorders/>
             <w:shd w:color="auto" w:fill="auto" w:val="clear"/>
           </w:tcPr>
@@ -15649,7 +15690,7 @@
         <w:trPr/>
         <w:tc>
           <w:tcPr>
-            <w:tcW w:w="3056" w:type="dxa"/>
+            <w:tcW w:w="3055" w:type="dxa"/>
             <w:tcBorders/>
             <w:shd w:color="auto" w:fill="auto" w:val="clear"/>
           </w:tcPr>
@@ -15672,7 +15713,7 @@
         </w:tc>
         <w:tc>
           <w:tcPr>
-            <w:tcW w:w="6588" w:type="dxa"/>
+            <w:tcW w:w="6589" w:type="dxa"/>
             <w:tcBorders/>
             <w:shd w:color="auto" w:fill="auto" w:val="clear"/>
           </w:tcPr>
@@ -15698,7 +15739,7 @@
         <w:trPr/>
         <w:tc>
           <w:tcPr>
-            <w:tcW w:w="3056" w:type="dxa"/>
+            <w:tcW w:w="3055" w:type="dxa"/>
             <w:tcBorders/>
             <w:shd w:color="auto" w:fill="auto" w:val="clear"/>
           </w:tcPr>
@@ -15721,7 +15762,7 @@
         </w:tc>
         <w:tc>
           <w:tcPr>
-            <w:tcW w:w="6588" w:type="dxa"/>
+            <w:tcW w:w="6589" w:type="dxa"/>
             <w:tcBorders/>
             <w:shd w:color="auto" w:fill="auto" w:val="clear"/>
           </w:tcPr>
@@ -15747,7 +15788,7 @@
         <w:trPr/>
         <w:tc>
           <w:tcPr>
-            <w:tcW w:w="3056" w:type="dxa"/>
+            <w:tcW w:w="3055" w:type="dxa"/>
             <w:tcBorders/>
             <w:shd w:color="auto" w:fill="auto" w:val="clear"/>
           </w:tcPr>
@@ -15770,7 +15811,7 @@
         </w:tc>
         <w:tc>
           <w:tcPr>
-            <w:tcW w:w="6588" w:type="dxa"/>
+            <w:tcW w:w="6589" w:type="dxa"/>
             <w:tcBorders/>
             <w:shd w:color="auto" w:fill="auto" w:val="clear"/>
           </w:tcPr>
@@ -15796,7 +15837,7 @@
         <w:trPr/>
         <w:tc>
           <w:tcPr>
-            <w:tcW w:w="3056" w:type="dxa"/>
+            <w:tcW w:w="3055" w:type="dxa"/>
             <w:tcBorders/>
             <w:shd w:color="auto" w:fill="auto" w:val="clear"/>
           </w:tcPr>
@@ -15819,7 +15860,7 @@
         </w:tc>
         <w:tc>
           <w:tcPr>
-            <w:tcW w:w="6588" w:type="dxa"/>
+            <w:tcW w:w="6589" w:type="dxa"/>
             <w:tcBorders/>
             <w:shd w:color="auto" w:fill="auto" w:val="clear"/>
           </w:tcPr>
@@ -15845,7 +15886,7 @@
         <w:trPr/>
         <w:tc>
           <w:tcPr>
-            <w:tcW w:w="3056" w:type="dxa"/>
+            <w:tcW w:w="3055" w:type="dxa"/>
             <w:tcBorders/>
             <w:shd w:color="auto" w:fill="auto" w:val="clear"/>
           </w:tcPr>
@@ -15868,7 +15909,7 @@
         </w:tc>
         <w:tc>
           <w:tcPr>
-            <w:tcW w:w="6588" w:type="dxa"/>
+            <w:tcW w:w="6589" w:type="dxa"/>
             <w:tcBorders/>
             <w:shd w:color="auto" w:fill="auto" w:val="clear"/>
           </w:tcPr>
@@ -15896,7 +15937,7 @@
         <w:trPr/>
         <w:tc>
           <w:tcPr>
-            <w:tcW w:w="3056" w:type="dxa"/>
+            <w:tcW w:w="3055" w:type="dxa"/>
             <w:tcBorders/>
             <w:shd w:color="auto" w:fill="auto" w:val="clear"/>
           </w:tcPr>
@@ -15919,7 +15960,7 @@
         </w:tc>
         <w:tc>
           <w:tcPr>
-            <w:tcW w:w="6588" w:type="dxa"/>
+            <w:tcW w:w="6589" w:type="dxa"/>
             <w:tcBorders/>
             <w:shd w:color="auto" w:fill="auto" w:val="clear"/>
           </w:tcPr>
@@ -15942,7 +15983,7 @@
         <w:trPr/>
         <w:tc>
           <w:tcPr>
-            <w:tcW w:w="3056" w:type="dxa"/>
+            <w:tcW w:w="3055" w:type="dxa"/>
             <w:tcBorders/>
             <w:shd w:color="auto" w:fill="auto" w:val="clear"/>
           </w:tcPr>
@@ -15965,7 +16006,7 @@
         </w:tc>
         <w:tc>
           <w:tcPr>
-            <w:tcW w:w="6588" w:type="dxa"/>
+            <w:tcW w:w="6589" w:type="dxa"/>
             <w:tcBorders/>
             <w:shd w:color="auto" w:fill="auto" w:val="clear"/>
           </w:tcPr>
@@ -15988,7 +16029,7 @@
         <w:trPr/>
         <w:tc>
           <w:tcPr>
-            <w:tcW w:w="3056" w:type="dxa"/>
+            <w:tcW w:w="3055" w:type="dxa"/>
             <w:tcBorders/>
             <w:shd w:color="auto" w:fill="auto" w:val="clear"/>
           </w:tcPr>
@@ -16013,7 +16054,7 @@
         </w:tc>
         <w:tc>
           <w:tcPr>
-            <w:tcW w:w="6588" w:type="dxa"/>
+            <w:tcW w:w="6589" w:type="dxa"/>
             <w:tcBorders/>
             <w:shd w:color="auto" w:fill="auto" w:val="clear"/>
           </w:tcPr>
@@ -16036,7 +16077,7 @@
         <w:trPr/>
         <w:tc>
           <w:tcPr>
-            <w:tcW w:w="3056" w:type="dxa"/>
+            <w:tcW w:w="3055" w:type="dxa"/>
             <w:tcBorders/>
             <w:shd w:color="auto" w:fill="auto" w:val="clear"/>
           </w:tcPr>
@@ -16059,7 +16100,7 @@
         </w:tc>
         <w:tc>
           <w:tcPr>
-            <w:tcW w:w="6588" w:type="dxa"/>
+            <w:tcW w:w="6589" w:type="dxa"/>
             <w:tcBorders/>
             <w:shd w:color="auto" w:fill="auto" w:val="clear"/>
           </w:tcPr>
@@ -16082,7 +16123,7 @@
         <w:trPr/>
         <w:tc>
           <w:tcPr>
-            <w:tcW w:w="3056" w:type="dxa"/>
+            <w:tcW w:w="3055" w:type="dxa"/>
             <w:tcBorders/>
             <w:shd w:color="auto" w:fill="auto" w:val="clear"/>
           </w:tcPr>
@@ -16105,7 +16146,7 @@
         </w:tc>
         <w:tc>
           <w:tcPr>
-            <w:tcW w:w="6588" w:type="dxa"/>
+            <w:tcW w:w="6589" w:type="dxa"/>
             <w:tcBorders/>
             <w:shd w:color="auto" w:fill="auto" w:val="clear"/>
           </w:tcPr>
@@ -16131,7 +16172,7 @@
         <w:trPr/>
         <w:tc>
           <w:tcPr>
-            <w:tcW w:w="3056" w:type="dxa"/>
+            <w:tcW w:w="3055" w:type="dxa"/>
             <w:tcBorders/>
             <w:shd w:color="auto" w:fill="auto" w:val="clear"/>
           </w:tcPr>
@@ -16154,7 +16195,7 @@
         </w:tc>
         <w:tc>
           <w:tcPr>
-            <w:tcW w:w="6588" w:type="dxa"/>
+            <w:tcW w:w="6589" w:type="dxa"/>
             <w:tcBorders/>
             <w:shd w:color="auto" w:fill="auto" w:val="clear"/>
           </w:tcPr>
@@ -16177,7 +16218,7 @@
         <w:trPr/>
         <w:tc>
           <w:tcPr>
-            <w:tcW w:w="3056" w:type="dxa"/>
+            <w:tcW w:w="3055" w:type="dxa"/>
             <w:tcBorders/>
             <w:shd w:color="auto" w:fill="auto" w:val="clear"/>
           </w:tcPr>
@@ -16200,7 +16241,7 @@
         </w:tc>
         <w:tc>
           <w:tcPr>
-            <w:tcW w:w="6588" w:type="dxa"/>
+            <w:tcW w:w="6589" w:type="dxa"/>
             <w:tcBorders/>
             <w:shd w:color="auto" w:fill="auto" w:val="clear"/>
           </w:tcPr>
@@ -16226,7 +16267,7 @@
         <w:trPr/>
         <w:tc>
           <w:tcPr>
-            <w:tcW w:w="3056" w:type="dxa"/>
+            <w:tcW w:w="3055" w:type="dxa"/>
             <w:tcBorders/>
             <w:shd w:color="auto" w:fill="auto" w:val="clear"/>
           </w:tcPr>
@@ -16251,7 +16292,7 @@
         </w:tc>
         <w:tc>
           <w:tcPr>
-            <w:tcW w:w="6588" w:type="dxa"/>
+            <w:tcW w:w="6589" w:type="dxa"/>
             <w:tcBorders/>
             <w:shd w:color="auto" w:fill="auto" w:val="clear"/>
           </w:tcPr>
@@ -16275,7 +16316,7 @@
         <w:trPr/>
         <w:tc>
           <w:tcPr>
-            <w:tcW w:w="3056" w:type="dxa"/>
+            <w:tcW w:w="3055" w:type="dxa"/>
             <w:tcBorders/>
             <w:shd w:color="auto" w:fill="auto" w:val="clear"/>
           </w:tcPr>
@@ -16300,7 +16341,7 @@
         </w:tc>
         <w:tc>
           <w:tcPr>
-            <w:tcW w:w="6588" w:type="dxa"/>
+            <w:tcW w:w="6589" w:type="dxa"/>
             <w:tcBorders/>
             <w:shd w:color="auto" w:fill="auto" w:val="clear"/>
           </w:tcPr>
@@ -16382,14 +16423,14 @@
         <w:tblLook w:firstRow="1" w:noVBand="1" w:lastRow="0" w:firstColumn="1" w:lastColumn="0" w:noHBand="0" w:val="04a0"/>
       </w:tblPr>
       <w:tblGrid>
-        <w:gridCol w:w="2154"/>
-        <w:gridCol w:w="6800"/>
+        <w:gridCol w:w="2153"/>
+        <w:gridCol w:w="6801"/>
       </w:tblGrid>
       <w:tr>
         <w:trPr/>
         <w:tc>
           <w:tcPr>
-            <w:tcW w:w="2154" w:type="dxa"/>
+            <w:tcW w:w="2153" w:type="dxa"/>
             <w:tcBorders/>
             <w:shd w:color="auto" w:fill="auto" w:val="clear"/>
           </w:tcPr>
@@ -16414,7 +16455,7 @@
         </w:tc>
         <w:tc>
           <w:tcPr>
-            <w:tcW w:w="6800" w:type="dxa"/>
+            <w:tcW w:w="6801" w:type="dxa"/>
             <w:tcBorders/>
             <w:shd w:color="auto" w:fill="auto" w:val="clear"/>
           </w:tcPr>
@@ -16440,7 +16481,7 @@
         <w:trPr/>
         <w:tc>
           <w:tcPr>
-            <w:tcW w:w="2154" w:type="dxa"/>
+            <w:tcW w:w="2153" w:type="dxa"/>
             <w:tcBorders/>
             <w:shd w:color="auto" w:fill="auto" w:val="clear"/>
           </w:tcPr>
@@ -16461,7 +16502,7 @@
         </w:tc>
         <w:tc>
           <w:tcPr>
-            <w:tcW w:w="6800" w:type="dxa"/>
+            <w:tcW w:w="6801" w:type="dxa"/>
             <w:tcBorders/>
             <w:shd w:color="auto" w:fill="auto" w:val="clear"/>
           </w:tcPr>
@@ -16485,7 +16526,7 @@
         <w:trPr/>
         <w:tc>
           <w:tcPr>
-            <w:tcW w:w="2154" w:type="dxa"/>
+            <w:tcW w:w="2153" w:type="dxa"/>
             <w:tcBorders/>
             <w:shd w:color="auto" w:fill="auto" w:val="clear"/>
           </w:tcPr>
@@ -16508,7 +16549,7 @@
         </w:tc>
         <w:tc>
           <w:tcPr>
-            <w:tcW w:w="6800" w:type="dxa"/>
+            <w:tcW w:w="6801" w:type="dxa"/>
             <w:tcBorders/>
             <w:shd w:color="auto" w:fill="auto" w:val="clear"/>
           </w:tcPr>
@@ -16532,7 +16573,7 @@
         <w:trPr/>
         <w:tc>
           <w:tcPr>
-            <w:tcW w:w="2154" w:type="dxa"/>
+            <w:tcW w:w="2153" w:type="dxa"/>
             <w:tcBorders/>
             <w:shd w:color="auto" w:fill="auto" w:val="clear"/>
           </w:tcPr>
@@ -16555,7 +16596,7 @@
         </w:tc>
         <w:tc>
           <w:tcPr>
-            <w:tcW w:w="6800" w:type="dxa"/>
+            <w:tcW w:w="6801" w:type="dxa"/>
             <w:tcBorders/>
             <w:shd w:color="auto" w:fill="auto" w:val="clear"/>
           </w:tcPr>
@@ -16580,7 +16621,7 @@
         <w:trPr/>
         <w:tc>
           <w:tcPr>
-            <w:tcW w:w="2154" w:type="dxa"/>
+            <w:tcW w:w="2153" w:type="dxa"/>
             <w:tcBorders/>
             <w:shd w:color="auto" w:fill="auto" w:val="clear"/>
           </w:tcPr>
@@ -16603,7 +16644,7 @@
         </w:tc>
         <w:tc>
           <w:tcPr>
-            <w:tcW w:w="6800" w:type="dxa"/>
+            <w:tcW w:w="6801" w:type="dxa"/>
             <w:tcBorders/>
             <w:shd w:color="auto" w:fill="auto" w:val="clear"/>
           </w:tcPr>
@@ -16627,7 +16668,7 @@
         <w:trPr/>
         <w:tc>
           <w:tcPr>
-            <w:tcW w:w="2154" w:type="dxa"/>
+            <w:tcW w:w="2153" w:type="dxa"/>
             <w:tcBorders/>
             <w:shd w:color="auto" w:fill="auto" w:val="clear"/>
           </w:tcPr>
@@ -16650,7 +16691,7 @@
         </w:tc>
         <w:tc>
           <w:tcPr>
-            <w:tcW w:w="6800" w:type="dxa"/>
+            <w:tcW w:w="6801" w:type="dxa"/>
             <w:tcBorders/>
             <w:shd w:color="auto" w:fill="auto" w:val="clear"/>
           </w:tcPr>
@@ -16672,7 +16713,7 @@
         <w:trPr/>
         <w:tc>
           <w:tcPr>
-            <w:tcW w:w="2154" w:type="dxa"/>
+            <w:tcW w:w="2153" w:type="dxa"/>
             <w:tcBorders/>
             <w:shd w:color="auto" w:fill="auto" w:val="clear"/>
           </w:tcPr>
@@ -16693,7 +16734,7 @@
         </w:tc>
         <w:tc>
           <w:tcPr>
-            <w:tcW w:w="6800" w:type="dxa"/>
+            <w:tcW w:w="6801" w:type="dxa"/>
             <w:tcBorders/>
             <w:shd w:color="auto" w:fill="auto" w:val="clear"/>
           </w:tcPr>
@@ -16719,7 +16760,7 @@
         <w:trPr/>
         <w:tc>
           <w:tcPr>
-            <w:tcW w:w="2154" w:type="dxa"/>
+            <w:tcW w:w="2153" w:type="dxa"/>
             <w:tcBorders/>
             <w:shd w:color="auto" w:fill="auto" w:val="clear"/>
           </w:tcPr>
@@ -16740,7 +16781,7 @@
         </w:tc>
         <w:tc>
           <w:tcPr>
-            <w:tcW w:w="6800" w:type="dxa"/>
+            <w:tcW w:w="6801" w:type="dxa"/>
             <w:tcBorders/>
             <w:shd w:color="auto" w:fill="auto" w:val="clear"/>
           </w:tcPr>
@@ -16782,7 +16823,7 @@
         <w:trPr/>
         <w:tc>
           <w:tcPr>
-            <w:tcW w:w="2154" w:type="dxa"/>
+            <w:tcW w:w="2153" w:type="dxa"/>
             <w:tcBorders/>
             <w:shd w:color="auto" w:fill="auto" w:val="clear"/>
           </w:tcPr>
@@ -16805,7 +16846,7 @@
         </w:tc>
         <w:tc>
           <w:tcPr>
-            <w:tcW w:w="6800" w:type="dxa"/>
+            <w:tcW w:w="6801" w:type="dxa"/>
             <w:tcBorders/>
             <w:shd w:color="auto" w:fill="auto" w:val="clear"/>
           </w:tcPr>
@@ -16829,7 +16870,7 @@
         <w:trPr/>
         <w:tc>
           <w:tcPr>
-            <w:tcW w:w="2154" w:type="dxa"/>
+            <w:tcW w:w="2153" w:type="dxa"/>
             <w:tcBorders/>
             <w:shd w:color="auto" w:fill="auto" w:val="clear"/>
           </w:tcPr>
@@ -16852,7 +16893,7 @@
         </w:tc>
         <w:tc>
           <w:tcPr>
-            <w:tcW w:w="6800" w:type="dxa"/>
+            <w:tcW w:w="6801" w:type="dxa"/>
             <w:tcBorders/>
             <w:shd w:color="auto" w:fill="auto" w:val="clear"/>
           </w:tcPr>
@@ -16874,7 +16915,7 @@
         <w:trPr/>
         <w:tc>
           <w:tcPr>
-            <w:tcW w:w="2154" w:type="dxa"/>
+            <w:tcW w:w="2153" w:type="dxa"/>
             <w:tcBorders/>
             <w:shd w:color="auto" w:fill="auto" w:val="clear"/>
           </w:tcPr>
@@ -16897,7 +16938,7 @@
         </w:tc>
         <w:tc>
           <w:tcPr>
-            <w:tcW w:w="6800" w:type="dxa"/>
+            <w:tcW w:w="6801" w:type="dxa"/>
             <w:tcBorders/>
             <w:shd w:color="auto" w:fill="auto" w:val="clear"/>
           </w:tcPr>

</xml_diff>